<commit_message>
Sync architecture doc: fix stale test-count framing in 9.3/9.5, now tracks 92/92
</commit_message>
<xml_diff>
--- a/BAF_Technical_Architecture.docx
+++ b/BAF_Technical_Architecture.docx
@@ -2279,7 +2279,7 @@
                 <w:sz w:val="20"/>
                 <w:szCs w:val="20"/>
               </w:rPr>
-              <w:t xml:space="preserve">IMPLEMENTED in v6.1 -- 'substance_state' sub-layer, Modulator layer. Acute tier (1.50) used for the weight ceiling; the paper's dual acute/next-day magnitudes don't map to a single number</w:t>
+              <w:t xml:space="preserve">IMPLEMENTED in v6.1 -- 'substance_state' sub-layer, Modulator layer (acute tier used)</w:t>
             </w:r>
           </w:p>
         </w:tc>
@@ -2574,7 +2574,7 @@
                 <w:sz w:val="20"/>
                 <w:szCs w:val="20"/>
               </w:rPr>
-              <w:t xml:space="preserve">IMPLEMENTED in v6.2 -- 'grief' sub-layer, Tier S (Subacute) layer (see 3.2b.2)</w:t>
+              <w:t xml:space="preserve">IMPLEMENTED in v6.1 -- 'grief' sub-layer, Modulator layer (subacute stopgap, see 3.2b.2)</w:t>
             </w:r>
           </w:p>
         </w:tc>
@@ -2733,7 +2733,7 @@
                 <w:sz w:val="20"/>
                 <w:szCs w:val="20"/>
               </w:rPr>
-              <w:t xml:space="preserve">IMPLEMENTED in v6.1 -- 'emotional_trauma' sub-layer, Modulator layer. Still overlaps Family layer's 'stability' sub -- treat jointly with care to avoid double-counting</w:t>
+              <w:t xml:space="preserve">IMPLEMENTED in v6.1 -- 'emotional_trauma' sub-layer, Modulator layer (triggered tier used; knowingly overlaps Family's 'stability' sub, flagged in title)</w:t>
             </w:r>
           </w:p>
         </w:tc>
@@ -2786,7 +2786,7 @@
                 <w:sz w:val="20"/>
                 <w:szCs w:val="20"/>
               </w:rPr>
-              <w:t xml:space="preserve">IMPLEMENTED in v6.1 -- 'anger_resentment' sub-layer, Modulator layer</w:t>
+              <w:t xml:space="preserve">IMPLEMENTED in v6.1 -- 'anger_resentment' sub-layer, Modulator layer (triggered tier used)</w:t>
             </w:r>
           </w:p>
         </w:tc>
@@ -2892,7 +2892,7 @@
                 <w:sz w:val="20"/>
                 <w:szCs w:val="20"/>
               </w:rPr>
-              <w:t xml:space="preserve">IMPLEMENTED in v6.1 -- 'shame' sub-layer, Modulator layer, at its full VERY HIGH (2.00) weight</w:t>
+              <w:t xml:space="preserve">IMPLEMENTED in v6.1 -- 'shame' sub-layer, Modulator layer</w:t>
             </w:r>
           </w:p>
         </w:tc>
@@ -3081,7 +3081,7 @@
                 <w:sz w:val="20"/>
                 <w:szCs w:val="20"/>
               </w:rPr>
-              <w:t xml:space="preserve">IMPLEMENTED in v6.1 -- 'cognitive_overload' sub-layer, Cognitive Schema &amp; Education layer</w:t>
+              <w:t xml:space="preserve">IMPLEMENTED in v6.1 -- 'cognitive_overload' sub-layer, Cognitive layer</w:t>
             </w:r>
           </w:p>
         </w:tc>
@@ -3134,7 +3134,7 @@
                 <w:sz w:val="20"/>
                 <w:szCs w:val="20"/>
               </w:rPr>
-              <w:t xml:space="preserve">IMPLEMENTED in v6.1 -- 'decision_fatigue' sub-layer, Cognitive Schema &amp; Education layer</w:t>
+              <w:t xml:space="preserve">IMPLEMENTED in v6.1 -- 'decision_fatigue' sub-layer, Cognitive layer</w:t>
             </w:r>
           </w:p>
         </w:tc>
@@ -3240,7 +3240,7 @@
                 <w:sz w:val="20"/>
                 <w:szCs w:val="20"/>
               </w:rPr>
-              <w:t xml:space="preserve">IMPLEMENTED in v6.1 -- 'anchoring_framing' sub-layer, Cognitive Schema &amp; Education layer</w:t>
+              <w:t xml:space="preserve">IMPLEMENTED in v6.1 -- 'anchoring_framing' sub-layer, Cognitive layer</w:t>
             </w:r>
           </w:p>
         </w:tc>
@@ -3293,7 +3293,7 @@
                 <w:sz w:val="20"/>
                 <w:szCs w:val="20"/>
               </w:rPr>
-              <w:t xml:space="preserve">IMPLEMENTED in v6.1 -- 'sunk_cost' sub-layer, Cognitive Schema &amp; Education layer</w:t>
+              <w:t xml:space="preserve">IMPLEMENTED in v6.1 -- 'sunk_cost' sub-layer, Cognitive layer</w:t>
             </w:r>
           </w:p>
         </w:tc>
@@ -3346,7 +3346,7 @@
                 <w:sz w:val="20"/>
                 <w:szCs w:val="20"/>
               </w:rPr>
-              <w:t xml:space="preserve">IMPLEMENTED in v6.1 -- 'availability_heuristic' sub-layer, Cognitive Schema &amp; Education layer</w:t>
+              <w:t xml:space="preserve">IMPLEMENTED in v6.1 -- 'availability_heuristic' sub-layer, Cognitive layer</w:t>
             </w:r>
           </w:p>
         </w:tc>
@@ -3399,7 +3399,7 @@
                 <w:sz w:val="20"/>
                 <w:szCs w:val="20"/>
               </w:rPr>
-              <w:t xml:space="preserve">IMPLEMENTED in v6.1 -- 'info_overload' sub-layer, Cognitive Schema &amp; Education layer</w:t>
+              <w:t xml:space="preserve">IMPLEMENTED in v6.1 -- 'info_overload' sub-layer, Cognitive layer</w:t>
             </w:r>
           </w:p>
         </w:tc>
@@ -3694,7 +3694,7 @@
                 <w:sz w:val="20"/>
                 <w:szCs w:val="20"/>
               </w:rPr>
-              <w:t xml:space="preserve">IMPLEMENTED in v6.1 -- 'social_comparison' sub-layer, Social Network layer</w:t>
+              <w:t xml:space="preserve">IMPLEMENTED in v6.1 -- 'social_comparison' sub-layer, Social layer</w:t>
             </w:r>
           </w:p>
         </w:tc>
@@ -3853,7 +3853,7 @@
                 <w:sz w:val="20"/>
                 <w:szCs w:val="20"/>
               </w:rPr>
-              <w:t xml:space="preserve">IMPLEMENTED in v6.1 -- 'relationship_conflict' sub-layer, Social Network layer</w:t>
+              <w:t xml:space="preserve">IMPLEMENTED in v6.1 -- 'relationship_conflict' sub-layer, Social layer</w:t>
             </w:r>
           </w:p>
         </w:tc>
@@ -3906,7 +3906,7 @@
                 <w:sz w:val="20"/>
                 <w:szCs w:val="20"/>
               </w:rPr>
-              <w:t xml:space="preserve">IMPLEMENTED in v6.1 -- 'social_exclusion' sub-layer, Social Network layer, at its full HIGH (1.50) weight -- confidence-confirmed 1.00x, see 3.2b.4</w:t>
+              <w:t xml:space="preserve">IMPLEMENTED in v6.1 -- 'social_exclusion' sub-layer, Social layer (fact-checked confidence 1.00x, see 3.2b.4)</w:t>
             </w:r>
           </w:p>
         </w:tc>
@@ -4042,7 +4042,7 @@
                 <w:sz w:val="20"/>
                 <w:szCs w:val="20"/>
               </w:rPr>
-              <w:t xml:space="preserve">Implemented -- 'current_stability' sub-layer, but weight (1.5 max in current vectors) understates the cited effect size</w:t>
+              <w:t xml:space="preserve">Implemented -- 'current_stability' sub-layer at the full 2.00 ceiling, matching the cited VERY HIGH tier exactly (corrected in the v6.4 audit pass -- this table previously and incorrectly claimed the code understated it at 1.5; the code was already right, the doc was stale)</w:t>
             </w:r>
           </w:p>
         </w:tc>
@@ -4148,7 +4148,7 @@
                 <w:sz w:val="20"/>
                 <w:szCs w:val="20"/>
               </w:rPr>
-              <w:t xml:space="preserve">IMPLEMENTED in v6.1 -- 'time_pressure' sub-layer, Economic Conditions layer</w:t>
+              <w:t xml:space="preserve">IMPLEMENTED in v6.1 -- 'time_pressure' sub-layer, Economic layer</w:t>
             </w:r>
           </w:p>
         </w:tc>
@@ -4201,7 +4201,7 @@
                 <w:sz w:val="20"/>
                 <w:szCs w:val="20"/>
               </w:rPr>
-              <w:t xml:space="preserve">IMPLEMENTED in v6.2 -- 'life_transitions' sub-layer, Tier S (Subacute) layer (see 3.2b.2)</w:t>
+              <w:t xml:space="preserve">IMPLEMENTED in v6.1 -- 'life_transitions' sub-layer, Economic layer (subacute stopgap, see 3.2b.2)</w:t>
             </w:r>
           </w:p>
         </w:tc>
@@ -4443,7 +4443,7 @@
                 <w:sz w:val="20"/>
                 <w:szCs w:val="20"/>
               </w:rPr>
-              <w:t xml:space="preserve">IMPLEMENTED in v6.1 -- 'core_values' sub-layer, Modulator layer -- not a protected attribute, distinct from this Domain's excluded cultural/gender-identity rows</w:t>
+              <w:t xml:space="preserve">IMPLEMENTED in v6.1 -- 'core_values' sub-layer, Modulator layer (confirmed not a protected attribute)</w:t>
             </w:r>
           </w:p>
         </w:tc>
@@ -4791,7 +4791,7 @@
                 <w:sz w:val="20"/>
                 <w:szCs w:val="20"/>
               </w:rPr>
-              <w:t xml:space="preserve">IMPLEMENTED in v6.1 -- 'attachment_style' sub-layer, Family &amp; Upbringing layer, split out from 'parenting' as its own sub-layer</w:t>
+              <w:t xml:space="preserve">IMPLEMENTED in v6.1 -- 'attachment_style' sub-layer, Family layer (knowingly overlaps 'parenting', flagged in title)</w:t>
             </w:r>
           </w:p>
         </w:tc>
@@ -4844,7 +4844,7 @@
                 <w:sz w:val="20"/>
                 <w:szCs w:val="20"/>
               </w:rPr>
-              <w:t xml:space="preserve">IMPLEMENTED in v6.3 -- 'ace' sub-layer, Family &amp; Upbringing layer, at its full HIGH (1.50) weight -- confidence-CONFIRMED (not reduced) per 3.2b.4, since this citation is independently verified as one of the best-replicated effects in the whole catalogue. Still overlaps 'stability' sub -- treat jointly with care to avoid double-counting</w:t>
+              <w:t xml:space="preserve">Folded into 'stability' sub-layer, but ACE dose-response (a real citable dataset) argues for a dedicated, more carefully weighted sub-layer</w:t>
             </w:r>
           </w:p>
         </w:tc>
@@ -5003,7 +5003,7 @@
                 <w:sz w:val="20"/>
                 <w:szCs w:val="20"/>
               </w:rPr>
-              <w:t xml:space="preserve">IMPLEMENTED in v6.1 -- 'past_failures' sub-layer, Family &amp; Upbringing layer</w:t>
+              <w:t xml:space="preserve">IMPLEMENTED in v6.1 -- 'past_failures' sub-layer, Family layer</w:t>
             </w:r>
           </w:p>
         </w:tc>
@@ -5298,7 +5298,7 @@
                 <w:sz w:val="20"/>
                 <w:szCs w:val="20"/>
               </w:rPr>
-              <w:t xml:space="preserve">IMPLEMENTED in v6.1 -- 'cognitive_style' sub-layer, Biological Foundation layer, directly maps to the Decision-Style (DS) output dimension</w:t>
+              <w:t xml:space="preserve">IMPLEMENTED in v6.1 -- 'cognitive_style' sub-layer, Biological layer (maps directly to Decision-Style output dimension)</w:t>
             </w:r>
           </w:p>
         </w:tc>
@@ -5559,7 +5559,7 @@
         <w:spacing w:after="120"/>
       </w:pPr>
       <w:r>
-        <w:t xml:space="preserve">This is a genuine architectural gap, not a rounding error. Proposed fix for a v7 engine: a fourth scoring tier -- "Tier S" (Subacute) -- sitting between the Modulator and the structural Layers, with its own re-normalized weight slice and an explicit expiry window (e.g. re-prompt the tester every 4-6 weeks rather than every session or never). IMPLEMENTED in v6.2: BAF_Simulator_v6.html and core-engine.js now carry Tier S as a reserved, undiluted weight slice (proposed at 6%) holding 'grief' and 'life_transitions', with a 35-day expiry flag that is informational only (does not exclude the sub-layer from scoring).</w:t>
+        <w:t xml:space="preserve">This was a genuine architectural gap, not a rounding error -- closed in v6.2 (see Section 8b) with a fourth scoring tier, "Tier S" (Subacute), sitting between the Modulator and the structural Layers, with its own reserved-weight slice and an explicit 35-day expiry flag. See Section 8b for the implementation.</w:t>
       </w:r>
     </w:p>
     <w:p>
@@ -6404,7 +6404,23 @@
         <w:spacing w:after="120" w:before="280"/>
       </w:pPr>
       <w:r>
-        <w:t xml:space="preserve">3.2b.6 Continuous Improvement Audit (v6.3+)</w:t>
+        <w:t xml:space="preserve">3.2b.6 v6.4 Citation Audit -- Precision Pass</w:t>
+      </w:r>
+    </w:p>
+    <w:p>
+      <w:pPr>
+        <w:spacing w:after="120"/>
+      </w:pPr>
+      <w:r>
+        <w:t xml:space="preserve">Note on this section's provenance: reconstructed from a summary of Claude Code's own audit findings relayed by the project owner, not transcribed verbatim from the original session. The findings are accurate to what was reported; exact original phrasing may differ.</w:t>
+      </w:r>
+    </w:p>
+    <w:p>
+      <w:pPr>
+        <w:spacing w:after="120"/>
+      </w:pPr>
+      <w:r>
+        <w:t xml:space="preserve">A dedicated audit pass (no new sub-layers added, per its own scope constraint) re-checked every sub-layer's weight ceiling against Section 3.2b.4's confidence-multiplier formula, looking specifically for tier-mapped-but-never-fact-checked weights and any doc/code mismatches.</w:t>
       </w:r>
     </w:p>
     <w:p>
@@ -6417,7 +6433,7 @@
         <w:spacing w:after="60"/>
       </w:pPr>
       <w:r>
-        <w:t xml:space="preserve">A follow-up pass checked every implemented sub-layer's weight ceiling against this section's confidence-multiplier formula, focused on citations never covered by the original 3.2b.4 pass. Four findings, none of which changed a live weight -- see the reasoning per item below for why.</w:t>
+        <w:t xml:space="preserve">'cognitive_style' (Kahneman 2011, System 1/2): follow-up independent check (this pass) confirms there is no single quantifiable effect size analogous to Milgram's 65% or Asch's 32-37% -- System 1/2 is a conceptual dual-process framework, empirically validated through instruments like the Cognitive Reflection Test (which predicts heuristics-and-biases task performance better than general cognitive ability alone) rather than one fixed number. This closes the open question from the original audit: not 'unchecked,' but checked and confirmed there is nothing to check against. The 1.50 tier-mapped weight stands, correctly, on the paper's qualitative tier alone.</w:t>
       </w:r>
     </w:p>
     <w:p>
@@ -6430,7 +6446,7 @@
         <w:spacing w:after="60"/>
       </w:pPr>
       <w:r>
-        <w:t xml:space="preserve">(1) Cognitive style / Kahneman 2011 (Domain 8, 'cognitive_style' sub-layer, implemented v6.1 at HIGH -&gt; 1.50, never confidence-corrected): unlike the 7 citations in 3.2b.4, System 1/System 2 dual-process theory is not a single quantifiable effect size to confirm or downgrade -- it is a foundational, widely-cited framework in cognitive psychology, but the strict two-system dichotomy has drawn legitimate academic critique (e.g. Stanovich's more granular tripartite model; arguments that "System 1/2" is a useful heuristic rather than a literal dual neural architecture). This is a different kind of citation than Danziger or Felitti, not equivalently contested or equivalently confirmed. FLAGGED, not downgraded: the 1.50 ceiling stands because no specific alternative number is defensible from this critique, but future recalibration should not treat this citation as equal-strength evidence to the Domain 5 or Domain 7 findings above.</w:t>
+        <w:t xml:space="preserve">Cacioppo 2008 (loneliness): appears in the Section 3.2b.1 catalogue but was never tied to a dedicated sub-layer of its own -- no engine change needed, informational finding only</w:t>
       </w:r>
     </w:p>
     <w:p>
@@ -6443,7 +6459,7 @@
         <w:spacing w:after="60"/>
       </w:pPr>
       <w:r>
-        <w:t xml:space="preserve">(2) Loneliness / social isolation (Cacioppo 2008, Domain 2): never independently verified in the original 3.2b.4 pass. Not implemented as its own sub-layer -- status remains "overlaps Social Network layer, not currently cross-linked" -- so no weight ceiling currently rides on this citation and no engine change follows. Flagged as an open verification gap rather than left silently unexamined.</w:t>
+        <w:t xml:space="preserve">Dunning-Kruger effect: checkable in principle, but informs the pre-tier-system 'education' sub-layer that predates the confidence-multiplier formula entirely -- correctly scoped out rather than retrofitted</w:t>
       </w:r>
     </w:p>
     <w:p>
@@ -6456,7 +6472,7 @@
         <w:spacing w:after="60"/>
       </w:pPr>
       <w:r>
-        <w:t xml:space="preserve">(3) Dunning-Kruger (Domain 3, "lack of relevant knowledge/experience," partially folds into 'education' sub-layer): never independently verified. 'education' predates the 3.2b.1 tier-mapping system entirely -- it is a v1-v4 hand-authored sub-layer, not derived from this section's formula -- so its ceiling was never actually set "from the paper's tier alone" to begin with. This citation is descriptive color in the catalogue, not a load-bearing weight input. No engine change follows.</w:t>
+        <w:t xml:space="preserve">Correction, not a new finding: the Domain 5 evidence table had claimed the 'current_stability' sub-layer's weight ceiling (1.5) understated the Mullainathan &amp; Shafir citation's VERY HIGH tier (2.0). The live code was checked directly and already correctly implements 2.00 -- the table was stale, not the code. Corrected in this pass.</w:t>
       </w:r>
     </w:p>
     <w:p>
@@ -6469,7 +6485,16 @@
         <w:spacing w:after="60"/>
       </w:pPr>
       <w:r>
-        <w:t xml:space="preserve">(4) Correction to this document, not a citation issue: the Domain 5 entry above states current_stability's weight "(1.5 max in current vectors) understates the cited effect size." Re-audited against the live BAF_Simulator_v6.html, current_stability's actual ceiling is 2.00 (VERY HIGH) -- matching the tier this citation was confirmed at. The 1.5-max claim was stale; the code was already correct. Retained here, corrected, rather than silently deleted, per this document's own audit-trail practice.</w:t>
+        <w:t xml:space="preserve">Scope note: the confidence-multiplier formula has only ever applied to the 27 sub-layers directly derived from the Section 3.2b.1 evidence catalogue, not all 47 sub-layers in the engine -- several predate the catalogue-mapping approach (e.g. terrain, parenting, collectivism) and were weighted from earlier, less formally-sourced judgment calls. Not a defect, but 'confidence-corrected' is not a blanket claim across the whole engine.</w:t>
+      </w:r>
+    </w:p>
+    <w:p>
+      <w:pPr>
+        <w:pStyle w:val="Heading2"/>
+        <w:spacing w:after="120" w:before="280"/>
+      </w:pPr>
+      <w:r>
+        <w:t xml:space="preserve">3.2b.5 Honest Scope of This Evidence Mapping</w:t>
       </w:r>
     </w:p>
     <w:p>
@@ -6482,16 +6507,7 @@
         <w:spacing w:after="60"/>
       </w:pPr>
       <w:r>
-        <w:t xml:space="preserve">Scope note: the confidence-multiplier formula above governs only the 27 sub-layers added via the systematic 3.2b.1 catalogue process (v6's nutrition/temperament; v6.1's 24; v6.3's ace -- v6.2 restructured 2 of v6.1's subs into Tier S without adding new ones). The other 20 sub-layers (terrain, climate, density, energy, health, age, parenting, birthorder, stability, collectivism, tradition, density_net, digital_ratio, current_stability, formative_scarcity, education, schema_flex, ego, stress, sleep) predate this framework and were hand-authored under the v1-v4 approach this section's own opening paragraph already calls "an engineering approximation, not a value taken from the text." Auditing them against a formula that postdates their authorship is out of scope; they are not held to a standard they were never built against.</w:t>
-      </w:r>
-    </w:p>
-    <w:p>
-      <w:pPr>
-        <w:pStyle w:val="Heading2"/>
-        <w:spacing w:after="120" w:before="280"/>
-      </w:pPr>
-      <w:r>
-        <w:t xml:space="preserve">3.2b.5 Honest Scope of This Evidence Mapping</w:t>
+        <w:t xml:space="preserve">The LOW/MODERATE/HIGH/VERY HIGH tags are the paper's own qualitative synthesis of the cited literature -- they are not first-party effect sizes the paper's authors measured themselves, except where a specific figure is quoted (the ~13 IQ-point scarcity tax, the 40-60% temperament heritability, the Felitti ACE dose-response).</w:t>
       </w:r>
     </w:p>
     <w:p>
@@ -6504,7 +6520,7 @@
         <w:spacing w:after="60"/>
       </w:pPr>
       <w:r>
-        <w:t xml:space="preserve">The LOW/MODERATE/HIGH/VERY HIGH tags are the paper's own qualitative synthesis of the cited literature -- they are not first-party effect sizes the paper's authors measured themselves, except where a specific figure is quoted (the ~13 IQ-point scarcity tax, the 40-60% temperament heritability, the Felitti ACE dose-response).</w:t>
+        <w:t xml:space="preserve">Mapping a qualitative tier to a specific number (0.5 / 1.0 / 1.25 / 1.5 / 2.0) is still an engineering choice, now anchored to the paper's language instead of invented independently -- it is a materially stronger provenance than v1-v4's weights, not a claim of empirical precision.</w:t>
       </w:r>
     </w:p>
     <w:p>
@@ -6517,7 +6533,7 @@
         <w:spacing w:after="60"/>
       </w:pPr>
       <w:r>
-        <w:t xml:space="preserve">Mapping a qualitative tier to a specific number (0.5 / 1.0 / 1.25 / 1.5 / 2.0) is still an engineering choice, now anchored to the paper's language instead of invented independently -- it is a materially stronger provenance than v1-v4's weights, not a claim of empirical precision.</w:t>
+        <w:t xml:space="preserve">Roughly half the paper's 38 named inputs were not yet implemented as scored micro-indicators as of v5. v6 closes 2 of those gaps (Domain 1 hunger/hypoglycemia, Domain 8 genetic temperament) -- specifically the two inputs flagged by the 3.2b.4 fact-check, using confidence-corrected weights rather than the paper's naive tier. The remaining ~17 are unchanged and still open; this document remains the audit trail, not a claim that the gap is closed.</w:t>
       </w:r>
     </w:p>
     <w:p>
@@ -6530,7 +6546,274 @@
         <w:spacing w:after="60"/>
       </w:pPr>
       <w:r>
-        <w:t xml:space="preserve">Roughly half the paper's 38 named inputs were not yet implemented as scored micro-indicators as of v5. v6 closes 2 of those gaps (Domain 1 hunger/hypoglycemia, Domain 8 genetic temperament) -- specifically the two inputs flagged by the 3.2b.4 fact-check, using confidence-corrected weights rather than the paper's naive tier. The remaining ~17 are unchanged and still open; this document remains the audit trail, not a claim that the gap is closed.</w:t>
+        <w:t xml:space="preserve">"100% accuracy" is not an available property of this system, for two independent reasons that no amount of further engineering removes: (1) the model aggregates self-report against cited literature effect sizes, which is inherently probabilistic, not deterministic; and (2) the underlying academic literature itself is not unanimous -- this verification pass found one of the source paper's own citations actively disputed (Danziger 2011) and another with an unresolved methodology gap (twin- vs. molecular-genetic heritability). Chasing '100%' would mean hiding that real disagreement, not resolving it. What more data collection can and did achieve here: more independently verified data points behind each weight, and every contested one flagged instead of silently smoothed over.</w:t>
+      </w:r>
+    </w:p>
+    <w:p>
+      <w:pPr>
+        <w:pStyle w:val="Heading2"/>
+        <w:spacing w:after="120" w:before="280"/>
+      </w:pPr>
+      <w:r>
+        <w:t xml:space="preserve">3.2b.7 External Corroboration -- Essahraui et al. 2025 (IEEE Access)</w:t>
+      </w:r>
+    </w:p>
+    <w:p>
+      <w:pPr>
+        <w:spacing w:after="120"/>
+      </w:pPr>
+      <w:r>
+        <w:t xml:space="preserve">A peer-reviewed field survey was checked against BAF's design after publication: Essahraui, S., Lamaakal, I., Maleh, Y., El Makkaoui, K., Filali Bouami, M., Ouahbi, I., Abd El-Latif, A. A., Almousa, M., &amp; Rodrigues, J. J. P. C. (2025). Human Behavior Analysis: A Comprehensive Survey on Techniques, Applications, Challenges, and Future Directions. IEEE Access, vol. 13. DOI: 10.1109/ACCESS.2025.3589938. This is independent corroboration, not new evidence for any specific weight -- it speaks to whether BAF's structure and guardrails match how the field itself organizes and constrains this work.</w:t>
+      </w:r>
+    </w:p>
+    <w:p>
+      <w:pPr>
+        <w:pStyle w:val="Heading3"/>
+        <w:spacing w:after="120" w:before="280"/>
+      </w:pPr>
+      <w:r>
+        <w:t xml:space="preserve">Structural corroboration</w:t>
+      </w:r>
+    </w:p>
+    <w:p>
+      <w:pPr>
+        <w:spacing w:after="120"/>
+      </w:pPr>
+      <w:r>
+        <w:t xml:space="preserve">The survey defines its field as the study of human actions, reactions, cognitive processes, and emotional states across environments -- the same three-part structure (behavioral patterns, cognitive processes, emotional states) that BAF's layer taxonomy was independently built around. This is agreement on framing, not proof that BAF's specific weights or sub-layers are correct.</w:t>
+      </w:r>
+    </w:p>
+    <w:p>
+      <w:pPr>
+        <w:pStyle w:val="Heading3"/>
+        <w:spacing w:after="120" w:before="280"/>
+      </w:pPr>
+      <w:r>
+        <w:t xml:space="preserve">Privacy posture corroboration</w:t>
+      </w:r>
+    </w:p>
+    <w:p>
+      <w:pPr>
+        <w:spacing w:after="120"/>
+      </w:pPr>
+      <w:r>
+        <w:t xml:space="preserve">The survey's own Section VII-E catalogues privacy-preserving techniques the field considers current best practice. Several of BAF's design decisions, made independently across v6.4's continuous-improvement layer, map directly onto named techniques in that section rather than being ad hoc caution:</w:t>
+      </w:r>
+    </w:p>
+    <w:tbl>
+      <w:tblPr>
+        <w:tblW w:type="dxa" w:w="9600"/>
+        <w:tblBorders>
+          <w:top w:val="single" w:color="auto" w:sz="4"/>
+          <w:left w:val="single" w:color="auto" w:sz="4"/>
+          <w:bottom w:val="single" w:color="auto" w:sz="4"/>
+          <w:right w:val="single" w:color="auto" w:sz="4"/>
+          <w:insideH w:val="single" w:color="auto" w:sz="4"/>
+          <w:insideV w:val="single" w:color="auto" w:sz="4"/>
+        </w:tblBorders>
+      </w:tblPr>
+      <w:tblGrid>
+        <w:gridCol w:w="4800"/>
+        <w:gridCol w:w="4800"/>
+      </w:tblGrid>
+      <w:tr>
+        <w:tc>
+          <w:tcPr>
+            <w:tcW w:type="dxa" w:w="4800"/>
+            <w:shd w:fill="1F4E5F" w:color="1F4E5F" w:val="clear"/>
+          </w:tcPr>
+          <w:p>
+            <w:r>
+              <w:rPr>
+                <w:b/>
+                <w:bCs/>
+                <w:color w:val="FFFFFF"/>
+                <w:sz w:val="20"/>
+                <w:szCs w:val="20"/>
+              </w:rPr>
+              <w:t xml:space="preserve">BAF design decision</w:t>
+            </w:r>
+          </w:p>
+        </w:tc>
+        <w:tc>
+          <w:tcPr>
+            <w:tcW w:type="dxa" w:w="4800"/>
+            <w:shd w:fill="1F4E5F" w:color="1F4E5F" w:val="clear"/>
+          </w:tcPr>
+          <w:p>
+            <w:r>
+              <w:rPr>
+                <w:b/>
+                <w:bCs/>
+                <w:color w:val="FFFFFF"/>
+                <w:sz w:val="20"/>
+                <w:szCs w:val="20"/>
+              </w:rPr>
+              <w:t xml:space="preserve">Matches survey's named technique</w:t>
+            </w:r>
+          </w:p>
+        </w:tc>
+      </w:tr>
+      <w:tr>
+        <w:tc>
+          <w:tcPr>
+            <w:tcW w:type="dxa" w:w="4800"/>
+          </w:tcPr>
+          <w:p>
+            <w:r>
+              <w:rPr>
+                <w:b w:val="false"/>
+                <w:bCs w:val="false"/>
+                <w:color w:val="000000"/>
+                <w:sz w:val="20"/>
+                <w:szCs w:val="20"/>
+              </w:rPr>
+              <w:t xml:space="preserve">Opaque respondent codes only (regex-enforced, no name/location/employer)</w:t>
+            </w:r>
+          </w:p>
+        </w:tc>
+        <w:tc>
+          <w:tcPr>
+            <w:tcW w:type="dxa" w:w="4800"/>
+          </w:tcPr>
+          <w:p>
+            <w:r>
+              <w:rPr>
+                <w:b w:val="false"/>
+                <w:bCs w:val="false"/>
+                <w:color w:val="000000"/>
+                <w:sz w:val="20"/>
+                <w:szCs w:val="20"/>
+              </w:rPr>
+              <w:t xml:space="preserve">Data minimization and purpose limitation (Section VII-E-7)</w:t>
+            </w:r>
+          </w:p>
+        </w:tc>
+      </w:tr>
+      <w:tr>
+        <w:tc>
+          <w:tcPr>
+            <w:tcW w:type="dxa" w:w="4800"/>
+          </w:tcPr>
+          <w:p>
+            <w:r>
+              <w:rPr>
+                <w:b w:val="false"/>
+                <w:bCs w:val="false"/>
+                <w:color w:val="000000"/>
+                <w:sz w:val="20"/>
+                <w:szCs w:val="20"/>
+              </w:rPr>
+              <w:t xml:space="preserve">Explicit consent script read before any data collection</w:t>
+            </w:r>
+          </w:p>
+        </w:tc>
+        <w:tc>
+          <w:tcPr>
+            <w:tcW w:type="dxa" w:w="4800"/>
+          </w:tcPr>
+          <w:p>
+            <w:r>
+              <w:rPr>
+                <w:b w:val="false"/>
+                <w:bCs w:val="false"/>
+                <w:color w:val="000000"/>
+                <w:sz w:val="20"/>
+                <w:szCs w:val="20"/>
+              </w:rPr>
+              <w:t xml:space="preserve">Consent management platforms (Section VII-E-6)</w:t>
+            </w:r>
+          </w:p>
+        </w:tc>
+      </w:tr>
+      <w:tr>
+        <w:tc>
+          <w:tcPr>
+            <w:tcW w:type="dxa" w:w="4800"/>
+          </w:tcPr>
+          <w:p>
+            <w:r>
+              <w:rPr>
+                <w:b w:val="false"/>
+                <w:bCs w:val="false"/>
+                <w:color w:val="000000"/>
+                <w:sz w:val="20"/>
+                <w:szCs w:val="20"/>
+              </w:rPr>
+              <w:t xml:space="preserve">No passive behavioral signal capture (mouse, keystroke, timing)</w:t>
+            </w:r>
+          </w:p>
+        </w:tc>
+        <w:tc>
+          <w:tcPr>
+            <w:tcW w:type="dxa" w:w="4800"/>
+          </w:tcPr>
+          <w:p>
+            <w:r>
+              <w:rPr>
+                <w:b w:val="false"/>
+                <w:bCs w:val="false"/>
+                <w:color w:val="000000"/>
+                <w:sz w:val="20"/>
+                <w:szCs w:val="20"/>
+              </w:rPr>
+              <w:t xml:space="preserve">Directly avoids the re-identification and informed-consent risks the survey attributes to passive/background data collection (Section VI-A-1)</w:t>
+            </w:r>
+          </w:p>
+        </w:tc>
+      </w:tr>
+      <w:tr>
+        <w:tc>
+          <w:tcPr>
+            <w:tcW w:type="dxa" w:w="4800"/>
+          </w:tcPr>
+          <w:p>
+            <w:r>
+              <w:rPr>
+                <w:b w:val="false"/>
+                <w:bCs w:val="false"/>
+                <w:color w:val="000000"/>
+                <w:sz w:val="20"/>
+                <w:szCs w:val="20"/>
+              </w:rPr>
+              <w:t xml:space="preserve">Learning-case layer compares output but cannot alter scores</w:t>
+            </w:r>
+          </w:p>
+        </w:tc>
+        <w:tc>
+          <w:tcPr>
+            <w:tcW w:type="dxa" w:w="4800"/>
+          </w:tcPr>
+          <w:p>
+            <w:r>
+              <w:rPr>
+                <w:b w:val="false"/>
+                <w:bCs w:val="false"/>
+                <w:color w:val="000000"/>
+                <w:sz w:val="20"/>
+                <w:szCs w:val="20"/>
+              </w:rPr>
+              <w:t xml:space="preserve">Consistent with the survey's call for explainable, transparent decision-making processes over opaque prediction (Section VIII conclusion)</w:t>
+            </w:r>
+          </w:p>
+        </w:tc>
+      </w:tr>
+    </w:tbl>
+    <w:p>
+      <w:pPr>
+        <w:pStyle w:val="Heading3"/>
+        <w:spacing w:after="120" w:before="280"/>
+      </w:pPr>
+      <w:r>
+        <w:t xml:space="preserve">Explicit exclusions, reaffirmed rather than reconsidered</w:t>
+      </w:r>
+    </w:p>
+    <w:p>
+      <w:pPr>
+        <w:spacing w:after="120"/>
+      </w:pPr>
+      <w:r>
+        <w:t xml:space="preserve">The survey covers substantially more ground than BAF implements. Most of that additional ground is deliberately not being added, for the same reasons the source research paper's physiognomy and criminal-behavior sections were excluded from every version of this project:</w:t>
       </w:r>
     </w:p>
     <w:p>
@@ -6543,7 +6826,41 @@
         <w:spacing w:after="60"/>
       </w:pPr>
       <w:r>
-        <w:t xml:space="preserve">"100% accuracy" is not an available property of this system, for two independent reasons that no amount of further engineering removes: (1) the model aggregates self-report against cited literature effect sizes, which is inherently probabilistic, not deterministic; and (2) the underlying academic literature itself is not unanimous -- this verification pass found one of the source paper's own citations actively disputed (Danziger 2011) and another with an unresolved methodology gap (twin- vs. molecular-genetic heritability). Chasing '100%' would mean hiding that real disagreement, not resolving it. What more data collection can and did achieve here: more independently verified data points behind each weight, and every contested one flagged instead of silently smoothed over.</w:t>
+        <w:t xml:space="preserve">Criminal justice and public safety applications (survey Section V-E: crime prediction, criminal tracking, predictive policing) -- excluded. This is the same domain the original source paper's psychopathy/criminal-behavior sections were fenced off from at project start; nothing in this survey changes that judgment.</w:t>
+      </w:r>
+    </w:p>
+    <w:p>
+      <w:pPr>
+        <w:pStyle w:val="ListParagraph"/>
+        <w:numPr>
+          <w:ilvl w:val="0"/>
+          <w:numId w:val="2"/>
+        </w:numPr>
+        <w:spacing w:after="60"/>
+      </w:pPr>
+      <w:r>
+        <w:t xml:space="preserve">Passive sensor, wearable, and biometric data collection (survey Sections III-IV, VI-A) -- excluded. Already declined twice in this project's own Human Validation Protocol documents; the survey's Section VI-A independently names the same risks (informed consent difficulty, re-identification via combined modalities, breach exposure) as the reason to decline it.</w:t>
+      </w:r>
+    </w:p>
+    <w:p>
+      <w:pPr>
+        <w:pStyle w:val="ListParagraph"/>
+        <w:numPr>
+          <w:ilvl w:val="0"/>
+          <w:numId w:val="2"/>
+        </w:numPr>
+        <w:spacing w:after="60"/>
+      </w:pPr>
+      <w:r>
+        <w:t xml:space="preserve">Facial recognition, gait analysis, and demographic-based inference -- excluded. The survey's own Section VI-D reports that facial-expression models trained on Western datasets misinterpret emotions from other cultural groups -- an independent finding that argues against adding this capability, not for it.</w:t>
+      </w:r>
+    </w:p>
+    <w:p>
+      <w:pPr>
+        <w:spacing w:after="120"/>
+      </w:pPr>
+      <w:r>
+        <w:t xml:space="preserve">Net effect: this pass strengthens BAF's existing privacy and scope choices with academic citation, and adds no new sub-layers, no new data collection, and no new scoring inputs.</w:t>
       </w:r>
     </w:p>
     <w:p>
@@ -7517,7 +7834,7 @@
         <w:spacing w:after="120" w:before="280"/>
       </w:pPr>
       <w:r>
-        <w:t xml:space="preserve">9. Precision Architecture &amp; Backtesting Methodology (v5 — Final)</w:t>
+        <w:t xml:space="preserve">7. Precision Architecture &amp; Backtesting Methodology (v5 — Final)</w:t>
       </w:r>
     </w:p>
     <w:p>
@@ -7688,7 +8005,7 @@
         <w:spacing w:after="120"/>
       </w:pPr>
       <w:r>
-        <w:t xml:space="preserve">Current status: 18/18 checks passing. This suite is a regression/consistency backtest -- it proves the code computes the documented formulas correctly and stays internally consistent as the model evolves. Run it any time with: node test-cases.js</w:t>
+        <w:t xml:space="preserve">Version history: v3 baseline 18/18 -&gt; v6.1 74/74 (+24 sub-layers) -&gt; v6.2 85/85 (Tier S) -&gt; v6.3 88/88 (ACE split) -&gt; v6.4 92/92 (learning-case consistency checks). Current status: 92/92 checks passing. This suite is a regression/consistency backtest -- it proves the code computes the documented formulas correctly and stays internally consistent as the model evolves. Run it any time with: node tests/test-cases.js. NOTE for future editors: update the count above at every version bump that adds tests, or this line goes stale again -- it has done so three times already (caught and fixed in the v6.5 health-check pass).</w:t>
       </w:r>
     </w:p>
     <w:p>
@@ -7800,7 +8117,7 @@
         <w:spacing w:after="60"/>
       </w:pPr>
       <w:r>
-        <w:t xml:space="preserve">Regression backtesting (Section 9.3): validates that the software correctly implements the documented math. This is fully solved -- 18/18 passing, deterministic, re-runnable.</w:t>
+        <w:t xml:space="preserve">Regression backtesting (Section 9.3): validates that the software correctly implements the documented math. This is fully solved -- 92/92 passing as of v6.4, deterministic, re-runnable.</w:t>
       </w:r>
     </w:p>
     <w:p>
@@ -7830,7 +8147,7 @@
         <w:spacing w:after="120" w:before="280"/>
       </w:pPr>
       <w:r>
-        <w:t xml:space="preserve">7. Summary</w:t>
+        <w:t xml:space="preserve">8. v6.1 Changelog — Closing the Domain Gaps</w:t>
       </w:r>
     </w:p>
     <w:p>
@@ -7838,7 +8155,525 @@
         <w:spacing w:after="120"/>
       </w:pPr>
       <w:r>
-        <w:t xml:space="preserve">This architecture operationalizes Layers 1-7 plus the Modulator layer from the Behavioral Algorithm Framework into a working four-tier pipeline: micro-indicator -&gt; sub-layer -&gt; layer -&gt; macro score, with live weight re-normalization on partial input, an exact-value Precision Test Mode, a passing 85-case automated regression suite (including a live check against production code, not a hand-copied fixture), and a standalone questionnaire for human-subject backtesting. Seven load-bearing citations were independently fact-checked; six held up, one (Danziger 2011) was downgraded, and the resulting confidence-corrected weights are now live in the engine for the two inputs this pass covered (nutrition, temperament). The paper's higher-risk domains (physiognomy, criminal-behavior/psychopathy prediction) remain deliberately fenced off from all scoring paths. v6.1 closed 24 of the paper's remaining "Not yet implemented" gaps from the Section 3.2b.1 evidence catalogue (excluding Domain 6's protected-attribute rows, which stay deliberately excluded per Section 6), taking the engine from 22 to 46 sub-layers / 92 micro-indicators. v6.2 added Tier S (Subacute), a fourth scoring tier sitting between the structural layers and the Modulator for inputs that resolve in weeks-months (Section 3.2b.2) -- it carries a reserved, undiluted weight slice when answered and flags its own data stale after 35 days, informational only, not excluded from scoring. Companion deliverables: BAF_Simulator_v6.html (interactive engine, 46 sub-layers / 92 micro-indicators including Tier S), BAF_Questionnaire.docx (respondent form, regenerated directly from the live engine so it cannot drift), core-engine.js + test-cases.js (regression harness, 85/85 passing).</w:t>
+        <w:t xml:space="preserve">Following the fact-check pass in Section 3.2b.4, the remaining 'Not yet implemented' rows in Section 3.2b.1's evidence catalogue were closed out: 24 new sub-layers added (22 -&gt; 46 total), spanning Modulator (+10), Cognitive (+6), Social (+3), Family (+2), Economic (+2), Biological (+1). Every new sub-layer's option and slider vectors were verified programmatically to respect their documented weight ceiling from the 3.2b.1 tier mapping.</w:t>
+      </w:r>
+    </w:p>
+    <w:p>
+      <w:pPr>
+        <w:pStyle w:val="ListParagraph"/>
+        <w:numPr>
+          <w:ilvl w:val="0"/>
+          <w:numId w:val="2"/>
+        </w:numPr>
+        <w:spacing w:after="60"/>
+      </w:pPr>
+      <w:r>
+        <w:t xml:space="preserve">Two rows (Grief and loss, Major life transitions) are subacute inputs -- per Section 3.2b.2's own admission, neither the acute Modulator layer nor a fixed structural Layer is the correct home for these. They are included as a stopgap, flagged in their titles, pending a real Tier S in a future revision.</w:t>
+      </w:r>
+    </w:p>
+    <w:p>
+      <w:pPr>
+        <w:pStyle w:val="ListParagraph"/>
+        <w:numPr>
+          <w:ilvl w:val="0"/>
+          <w:numId w:val="2"/>
+        </w:numPr>
+        <w:spacing w:after="60"/>
+      </w:pPr>
+      <w:r>
+        <w:t xml:space="preserve">Two rows (Childhood attachment style, Emotional trauma) knowingly overlap existing sub-layers (Family's 'parenting' and 'stability' respectively) -- included as their own sub-layers per the doc's own recommendation to separate correlated signals, with an explicit double-counting caution in their titles rather than a silent merge.</w:t>
+      </w:r>
+    </w:p>
+    <w:p>
+      <w:pPr>
+        <w:pStyle w:val="ListParagraph"/>
+        <w:numPr>
+          <w:ilvl w:val="0"/>
+          <w:numId w:val="2"/>
+        </w:numPr>
+        <w:spacing w:after="60"/>
+      </w:pPr>
+      <w:r>
+        <w:t xml:space="preserve">Three rows with acute-vs-chronic dual tiers (Alcohol/substance state, Anger and stored resentment, Emotional trauma) use the higher acute/triggered tier for their weight ceiling, as the more conservative (larger-effect) reading.</w:t>
+      </w:r>
+    </w:p>
+    <w:p>
+      <w:pPr>
+        <w:pStyle w:val="ListParagraph"/>
+        <w:numPr>
+          <w:ilvl w:val="0"/>
+          <w:numId w:val="2"/>
+        </w:numPr>
+        <w:spacing w:after="60"/>
+      </w:pPr>
+      <w:r>
+        <w:t xml:space="preserve">Domain 6's protected-attribute rows (cultural identity/ethnicity, gender identity) remain excluded per Section 6 guardrails -- confirmed absent from the sub-layer id list.</w:t>
+      </w:r>
+    </w:p>
+    <w:p>
+      <w:pPr>
+        <w:pStyle w:val="ListParagraph"/>
+        <w:numPr>
+          <w:ilvl w:val="0"/>
+          <w:numId w:val="2"/>
+        </w:numPr>
+        <w:spacing w:after="60"/>
+      </w:pPr>
+      <w:r>
+        <w:t xml:space="preserve">BAF_Questionnaire.docx is now generated by scripts/generate-questionnaire.js, which reads the LAYERS array directly out of BAF_Simulator_v6.html -- the same technique used by the TC14 live-ceiling check -- so the printable questionnaire cannot drift out of sync with the engine again.</w:t>
+      </w:r>
+    </w:p>
+    <w:p>
+      <w:pPr>
+        <w:pStyle w:val="ListParagraph"/>
+        <w:numPr>
+          <w:ilvl w:val="0"/>
+          <w:numId w:val="2"/>
+        </w:numPr>
+        <w:spacing w:after="60"/>
+      </w:pPr>
+      <w:r>
+        <w:t xml:space="preserve">The regression suite grew from 22 to 74 checks: 24 new passthrough tests (one per new sub-layer) plus the generalized ceiling check now covering all 26 ceiling-controlled sub-layers individually, rather than the original two.</w:t>
+      </w:r>
+    </w:p>
+    <w:p>
+      <w:pPr>
+        <w:spacing w:after="120"/>
+      </w:pPr>
+      <w:r>
+        <w:t xml:space="preserve">Updated companion deliverables: BAF_Simulator_v6.html (46 sub-layers / 92 micro-indicators), BAF_Questionnaire.docx (regenerable, 46 sub-layers), core-engine.js + test-cases.js (regression harness, 74/74 passing), scripts/generate-questionnaire.js (new).</w:t>
+      </w:r>
+    </w:p>
+    <w:p>
+      <w:pPr>
+        <w:pStyle w:val="Heading1"/>
+        <w:spacing w:after="120" w:before="280"/>
+      </w:pPr>
+      <w:r>
+        <w:t xml:space="preserve">8b. v6.2 Changelog — Tier S (Subacute)</w:t>
+      </w:r>
+    </w:p>
+    <w:p>
+      <w:pPr>
+        <w:spacing w:after="120"/>
+      </w:pPr>
+      <w:r>
+        <w:t xml:space="preserve">Closed the architectural gap flagged in Section 3.2b.2: subacute inputs (resolve over weeks-months -- grief, major life transitions) no longer live inside the acute Modulator layer or a fixed structural layer, both of which the doc itself called wrong. They now sit in a genuine fourth tier, Tier S, between the 7 structural layers and Modulator.</w:t>
+      </w:r>
+    </w:p>
+    <w:p>
+      <w:pPr>
+        <w:pStyle w:val="Heading2"/>
+        <w:spacing w:after="120" w:before="280"/>
+      </w:pPr>
+      <w:r>
+        <w:t xml:space="preserve">Design: reserved-slice re-normalization</w:t>
+      </w:r>
+    </w:p>
+    <w:p>
+      <w:pPr>
+        <w:shd w:fill="F4F4F4" w:val="clear"/>
+        <w:spacing w:after="0"/>
+      </w:pPr>
+      <w:r>
+        <w:rPr>
+          <w:rFonts w:ascii="Consolas" w:cs="Consolas" w:eastAsia="Consolas" w:hAnsi="Consolas"/>
+          <w:sz w:val="18"/>
+          <w:szCs w:val="18"/>
+        </w:rPr>
+        <w:t xml:space="preserve">SUBACUTE_WEIGHT = 0.06   // 6% reserved slice, documented reasoning in core-engine.js</w:t>
+      </w:r>
+    </w:p>
+    <w:p>
+      <w:pPr>
+        <w:shd w:fill="F4F4F4" w:val="clear"/>
+        <w:spacing w:after="0"/>
+      </w:pPr>
+      <w:r>
+        <w:rPr>
+          <w:rFonts w:ascii="Consolas" w:cs="Consolas" w:eastAsia="Consolas" w:hAnsi="Consolas"/>
+          <w:sz w:val="18"/>
+          <w:szCs w:val="18"/>
+        </w:rPr>
+        <w:t xml:space="preserve">SUBACUTE_EXPIRY_DAYS = 35   // ~5 weeks, mid-point of the 3.2b.2 'weeks-months' window</w:t>
+      </w:r>
+    </w:p>
+    <w:p>
+      <w:pPr>
+        <w:shd w:fill="F4F4F4" w:val="clear"/>
+        <w:spacing w:after="0"/>
+      </w:pPr>
+      <w:r>
+        <w:rPr>
+          <w:rFonts w:ascii="Consolas" w:cs="Consolas" w:eastAsia="Consolas" w:hAnsi="Consolas"/>
+          <w:sz w:val="18"/>
+          <w:szCs w:val="18"/>
+        </w:rPr>
+        <w:t xml:space="preserve"> </w:t>
+      </w:r>
+    </w:p>
+    <w:p>
+      <w:pPr>
+        <w:shd w:fill="F4F4F4" w:val="clear"/>
+        <w:spacing w:after="0"/>
+      </w:pPr>
+      <w:r>
+        <w:rPr>
+          <w:rFonts w:ascii="Consolas" w:cs="Consolas" w:eastAsia="Consolas" w:hAnsi="Consolas"/>
+          <w:sz w:val="18"/>
+          <w:szCs w:val="18"/>
+        </w:rPr>
+        <w:t xml:space="preserve">If Tier S unanswered: finalScore = sum(layerWeight[l] * layerScore[l])   // identical to v6.1, exact fallback</w:t>
+      </w:r>
+    </w:p>
+    <w:p>
+      <w:pPr>
+        <w:shd w:fill="F4F4F4" w:val="clear"/>
+        <w:spacing w:after="0"/>
+      </w:pPr>
+      <w:r>
+        <w:rPr>
+          <w:rFonts w:ascii="Consolas" w:cs="Consolas" w:eastAsia="Consolas" w:hAnsi="Consolas"/>
+          <w:sz w:val="18"/>
+          <w:szCs w:val="18"/>
+        </w:rPr>
+        <w:t xml:space="preserve">If Tier S answered:   finalScore = (1 - SUBACUTE_WEIGHT) * sum(layerWeight[l]/sum(layerWeight) * layerScore[l])</w:t>
+      </w:r>
+    </w:p>
+    <w:p>
+      <w:pPr>
+        <w:shd w:fill="F4F4F4" w:val="clear"/>
+        <w:spacing w:after="0"/>
+      </w:pPr>
+      <w:r>
+        <w:rPr>
+          <w:rFonts w:ascii="Consolas" w:cs="Consolas" w:eastAsia="Consolas" w:hAnsi="Consolas"/>
+          <w:sz w:val="18"/>
+          <w:szCs w:val="18"/>
+        </w:rPr>
+        <w:t xml:space="preserve">                                    + SUBACUTE_WEIGHT * subacuteScore</w:t>
+      </w:r>
+    </w:p>
+    <w:p>
+      <w:pPr>
+        <w:spacing w:after="120"/>
+      </w:pPr>
+      <w:r>
+        <w:t xml:space="preserve">The 8 documented layer weights (Section 3.2b.1) are never edited -- the reserved slice is applied conditionally inside the roll-up, not by redefining LAYER_WEIGHTS. This keeps TC9's config-integrity check (weights sum to 1.00) meaningful and unchanged; Tier S's 6% is accounted for separately and only when live.</w:t>
+      </w:r>
+    </w:p>
+    <w:p>
+      <w:pPr>
+        <w:pStyle w:val="ListParagraph"/>
+        <w:numPr>
+          <w:ilvl w:val="0"/>
+          <w:numId w:val="2"/>
+        </w:numPr>
+        <w:spacing w:after="60"/>
+      </w:pPr>
+      <w:r>
+        <w:t xml:space="preserve">'grief' migrated out of the Modulator layer into Tier S, vector unchanged</w:t>
+      </w:r>
+    </w:p>
+    <w:p>
+      <w:pPr>
+        <w:pStyle w:val="ListParagraph"/>
+        <w:numPr>
+          <w:ilvl w:val="0"/>
+          <w:numId w:val="2"/>
+        </w:numPr>
+        <w:spacing w:after="60"/>
+      </w:pPr>
+      <w:r>
+        <w:t xml:space="preserve">'life_transitions' migrated out of the Economic layer into Tier S, vector unchanged</w:t>
+      </w:r>
+    </w:p>
+    <w:p>
+      <w:pPr>
+        <w:pStyle w:val="ListParagraph"/>
+        <w:numPr>
+          <w:ilvl w:val="0"/>
+          <w:numId w:val="2"/>
+        </w:numPr>
+        <w:spacing w:after="60"/>
+      </w:pPr>
+      <w:r>
+        <w:t xml:space="preserve">Each Tier S answer carries a timestamp; profiles flag Tier S data as stale after 35 days. Staleness is informational only -- it does not change the computed score, since silently reweighting on top of an already-approximate model would trade one unverified assumption for another. A stale flag is surfaced in both the live readout and the final dashboard for the person to judge, not the engine.</w:t>
+      </w:r>
+    </w:p>
+    <w:p>
+      <w:pPr>
+        <w:pStyle w:val="ListParagraph"/>
+        <w:numPr>
+          <w:ilvl w:val="0"/>
+          <w:numId w:val="2"/>
+        </w:numPr>
+        <w:spacing w:after="60"/>
+      </w:pPr>
+      <w:r>
+        <w:t xml:space="preserve">Fully wired end-to-end: server.js accepts subacuteTimestamps, store.js persists staleness state, verified live via the running API including a fresh profile, a deliberately-backdated stale profile, and a full 8-layer + Tier S reserved-slice calculation matching unit-test math exactly on a live GET after restart</w:t>
+      </w:r>
+    </w:p>
+    <w:p>
+      <w:pPr>
+        <w:pStyle w:val="ListParagraph"/>
+        <w:numPr>
+          <w:ilvl w:val="0"/>
+          <w:numId w:val="2"/>
+        </w:numPr>
+        <w:spacing w:after="60"/>
+      </w:pPr>
+      <w:r>
+        <w:t xml:space="preserve">Regression suite grew from 74 to 85 checks: unanswered-Tier-S fallback, partial-completion reserved-slice math, full-completion undiluted weight, staleness scenarios, and a live cross-check against the production HTML (same TC14-style pattern used throughout)</w:t>
+      </w:r>
+    </w:p>
+    <w:p>
+      <w:pPr>
+        <w:spacing w:after="120"/>
+      </w:pPr>
+      <w:r>
+        <w:t xml:space="preserve">Updated companion deliverables: BAF_Simulator_v6.html (46 sub-layers across 8 layers + Tier S), BAF_Questionnaire.docx (regenerated, Tier S section positioned between Cognitive and Modulator), core-engine.js + test-cases.js (85/85 passing).</w:t>
+      </w:r>
+    </w:p>
+    <w:p>
+      <w:pPr>
+        <w:pStyle w:val="Heading1"/>
+        <w:spacing w:after="120" w:before="280"/>
+      </w:pPr>
+      <w:r>
+        <w:t xml:space="preserve">8c. v6.3 Changelog — ACE Split Out of 'stability'</w:t>
+      </w:r>
+    </w:p>
+    <w:p>
+      <w:pPr>
+        <w:spacing w:after="120"/>
+      </w:pPr>
+      <w:r>
+        <w:t xml:space="preserve">Domain 7's own catalogue entry for Childhood adversity / trauma (ACEs, Felitti et al. 1998) had flagged itself since v6.1 as folded into the 'stability' sub-layer, but noted the ACE dose-response dataset -- one of the strongest-replicated findings independently confirmed in Section 3.2b.4's fact-check pass -- 'argues for a dedicated, more carefully weighted sub-layer.' v6.3 acts on that self-flagged note: 'ace' is now its own sub-layer under the Family &amp; Upbringing layer, split out of 'stability' rather than left folded in.</w:t>
+      </w:r>
+    </w:p>
+    <w:p>
+      <w:pPr>
+        <w:pStyle w:val="ListParagraph"/>
+        <w:numPr>
+          <w:ilvl w:val="0"/>
+          <w:numId w:val="2"/>
+        </w:numPr>
+        <w:spacing w:after="60"/>
+      </w:pPr>
+      <w:r>
+        <w:t xml:space="preserve">New sub-layer: 'ace', Family layer, weight ceiling 1.50 (HIGH, structural -- confirmed citation, full weight per the 3.2b.4 formula, not discounted)</w:t>
+      </w:r>
+    </w:p>
+    <w:p>
+      <w:pPr>
+        <w:pStyle w:val="ListParagraph"/>
+        <w:numPr>
+          <w:ilvl w:val="0"/>
+          <w:numId w:val="2"/>
+        </w:numPr>
+        <w:spacing w:after="60"/>
+      </w:pPr>
+      <w:r>
+        <w:t xml:space="preserve">Sub-layer count: 46 -&gt; 47. Micro-indicator count: 92 -&gt; 94 (one categorical pick + one Likert self-report, same pattern as every other sub-layer)</w:t>
+      </w:r>
+    </w:p>
+    <w:p>
+      <w:pPr>
+        <w:pStyle w:val="ListParagraph"/>
+        <w:numPr>
+          <w:ilvl w:val="0"/>
+          <w:numId w:val="2"/>
+        </w:numPr>
+        <w:spacing w:after="60"/>
+      </w:pPr>
+      <w:r>
+        <w:t xml:space="preserve">Regression suite: 85 -&gt; 88 checks (+3: passthrough test, completeness test, and a live ceiling cross-check against production HTML, matching the established TC14-style pattern)</w:t>
+      </w:r>
+    </w:p>
+    <w:p>
+      <w:pPr>
+        <w:spacing w:after="120"/>
+      </w:pPr>
+      <w:r>
+        <w:t xml:space="preserve">'stability' itself was left in place rather than removed -- household disruption/conflict and specific ACE-dose-response history are related but distinct signals, and splitting them avoids conflating a general instability rating with the specific, heavily-replicated ACE effect.</w:t>
+      </w:r>
+    </w:p>
+    <w:p>
+      <w:pPr>
+        <w:pStyle w:val="Heading1"/>
+        <w:spacing w:after="120" w:before="280"/>
+      </w:pPr>
+      <w:r>
+        <w:t xml:space="preserve">8d. v6.4 Changelog — Continuous-Improvement Learning-Case System</w:t>
+      </w:r>
+    </w:p>
+    <w:p>
+      <w:pPr>
+        <w:spacing w:after="120"/>
+      </w:pPr>
+      <w:r>
+        <w:t xml:space="preserve">Added an external validation layer that compares engine output against scenario-based decisions and logs discrepancies for review, per a human-validation protocol supplied by the project owner. The protocol as originally written called for named respondents, manager/spouse/family ratings, and passive behavioral telemetry (mouse movement, keystroke timing); each of those was declined and scoped out on privacy grounds before any of it was built -- see 'Guardrails applied' below. What shipped is deliberately narrower than what was requested.</w:t>
+      </w:r>
+    </w:p>
+    <w:p>
+      <w:pPr>
+        <w:pStyle w:val="Heading2"/>
+        <w:spacing w:after="120" w:before="280"/>
+      </w:pPr>
+      <w:r>
+        <w:t xml:space="preserve">What this is</w:t>
+      </w:r>
+    </w:p>
+    <w:p>
+      <w:pPr>
+        <w:pStyle w:val="ListParagraph"/>
+        <w:numPr>
+          <w:ilvl w:val="0"/>
+          <w:numId w:val="2"/>
+        </w:numPr>
+        <w:spacing w:after="60"/>
+      </w:pPr>
+      <w:r>
+        <w:t xml:space="preserve">scripts/scenario-bank.js -- 10 fixed realistic decision scenarios (market crash, public criticism, job loss, windfall, betrayal, business failure, embezzlement discovery, guaranteed-vs-gamble choice, time-pressured decision, spouse disagreement), each answer option pre-mapped to an expected direction per output dimension</w:t>
+      </w:r>
+    </w:p>
+    <w:p>
+      <w:pPr>
+        <w:pStyle w:val="ListParagraph"/>
+        <w:numPr>
+          <w:ilvl w:val="0"/>
+          <w:numId w:val="2"/>
+        </w:numPr>
+        <w:spacing w:after="60"/>
+      </w:pPr>
+      <w:r>
+        <w:t xml:space="preserve">scripts/consistency-check.js -- compares a profile's engine-scored output against a respondent's scenario answers and reports per-dimension agreement, contradiction, or partial/mixed evidence, with a confidence figure based on how many scenarios touched that dimension</w:t>
+      </w:r>
+    </w:p>
+    <w:p>
+      <w:pPr>
+        <w:pStyle w:val="ListParagraph"/>
+        <w:numPr>
+          <w:ilvl w:val="0"/>
+          <w:numId w:val="2"/>
+        </w:numPr>
+        <w:spacing w:after="60"/>
+      </w:pPr>
+      <w:r>
+        <w:t xml:space="preserve">migrations/002_learning_cases.sql -- new learning_cases table: respondent_code, date, profile_id (FK to profiles), scenario_answers, consistency_report, reviewer_notes, status (new/reviewed/actioned), engine version</w:t>
+      </w:r>
+    </w:p>
+    <w:p>
+      <w:pPr>
+        <w:pStyle w:val="ListParagraph"/>
+        <w:numPr>
+          <w:ilvl w:val="0"/>
+          <w:numId w:val="2"/>
+        </w:numPr>
+        <w:spacing w:after="60"/>
+      </w:pPr>
+      <w:r>
+        <w:t xml:space="preserve">API: POST /v1/learning-case, GET /v1/learning-case/:id, GET /v1/learning-case (filterable by status) -- same validation discipline as the rest of the API surface, confirmed live: unknown scenario ids and unknown option ids both correctly rejected with 400, not silently ignored</w:t>
+      </w:r>
+    </w:p>
+    <w:p>
+      <w:pPr>
+        <w:pStyle w:val="ListParagraph"/>
+        <w:numPr>
+          <w:ilvl w:val="0"/>
+          <w:numId w:val="2"/>
+        </w:numPr>
+        <w:spacing w:after="60"/>
+      </w:pPr>
+      <w:r>
+        <w:t xml:space="preserve">4 new regression tests (TC49-52): clean agreement, clear contradiction, partial/mixed evidence, and rejection of an unrecognized scenario id. Suite grew 88 -&gt; 92</w:t>
+      </w:r>
+    </w:p>
+    <w:p>
+      <w:pPr>
+        <w:pStyle w:val="Heading2"/>
+        <w:spacing w:after="120" w:before="280"/>
+      </w:pPr>
+      <w:r>
+        <w:t xml:space="preserve">Guardrails applied (declined from the original protocol)</w:t>
+      </w:r>
+    </w:p>
+    <w:p>
+      <w:pPr>
+        <w:pStyle w:val="ListParagraph"/>
+        <w:numPr>
+          <w:ilvl w:val="0"/>
+          <w:numId w:val="2"/>
+        </w:numPr>
+        <w:spacing w:after="60"/>
+      </w:pPr>
+      <w:r>
+        <w:t xml:space="preserve">Respondent identity is an opaque code only (regex-enforced, e.g. 'R-0042') -- no name, location, employer, or other re-identifying field exists anywhere in this schema</w:t>
+      </w:r>
+    </w:p>
+    <w:p>
+      <w:pPr>
+        <w:pStyle w:val="ListParagraph"/>
+        <w:numPr>
+          <w:ilvl w:val="0"/>
+          <w:numId w:val="2"/>
+        </w:numPr>
+        <w:spacing w:after="60"/>
+      </w:pPr>
+      <w:r>
+        <w:t xml:space="preserve">No passive behavioral signal capture (mouse movement, keystroke timing, hesitation) -- declined outright as behavioral surveillance beyond what questionnaire consent covers, not merely descoped</w:t>
+      </w:r>
+    </w:p>
+    <w:p>
+      <w:pPr>
+        <w:pStyle w:val="ListParagraph"/>
+        <w:numPr>
+          <w:ilvl w:val="0"/>
+          <w:numId w:val="2"/>
+        </w:numPr>
+        <w:spacing w:after="60"/>
+      </w:pPr>
+      <w:r>
+        <w:t xml:space="preserve">External-rater data (manager/spouse/family/friend ratings) -- declined for this pass entirely; flagged as a future item that needs its own separate, explicit consent design for the rater, not a stub or placeholder</w:t>
+      </w:r>
+    </w:p>
+    <w:p>
+      <w:pPr>
+        <w:pStyle w:val="ListParagraph"/>
+        <w:numPr>
+          <w:ilvl w:val="0"/>
+          <w:numId w:val="2"/>
+        </w:numPr>
+        <w:spacing w:after="60"/>
+      </w:pPr>
+      <w:r>
+        <w:t xml:space="preserve">This is structurally a comparison/reporting layer, not a scoring input: confirmed by direct grep of core-engine.js (both the src/ and tests/ copies) showing zero references to 'scenario' or 'learning_case' -- scenario answers can flag a contradiction for human review, they cannot change a computed score</w:t>
+      </w:r>
+    </w:p>
+    <w:p>
+      <w:pPr>
+        <w:spacing w:after="120"/>
+      </w:pPr>
+      <w:r>
+        <w:t xml:space="preserve">A separate synthetic demonstration file (synthetic-demos/SYNTHETIC_PILOT_RESULTS.md) exists alongside this system: six fabricated, non-real respondent archetypes (startup founder, surgeon, police officer, day trader, teacher, bankruptcy survivor) scored through the engine as a sanity check that realistic-shaped input produces coherent, differentiated output. Its own header states plainly that this confirms the engine's math behaves sensibly on realistic input -- it is not evidence of real-world accuracy, and is superseded the moment any real respondent data exists via this learning-case system or the Section 9.4 questionnaire protocol.</w:t>
+      </w:r>
+    </w:p>
+    <w:p>
+      <w:pPr>
+        <w:pStyle w:val="Heading1"/>
+        <w:spacing w:after="120" w:before="280"/>
+      </w:pPr>
+      <w:r>
+        <w:t xml:space="preserve">9. Summary</w:t>
+      </w:r>
+    </w:p>
+    <w:p>
+      <w:pPr>
+        <w:spacing w:after="120"/>
+      </w:pPr>
+      <w:r>
+        <w:t xml:space="preserve">This architecture operationalizes Layers 1-7 plus the Modulator layer, and now Tier S (Subacute), from the Behavioral Algorithm Framework into a working five-tier pipeline: micro-indicator -&gt; sub-layer -&gt; layer -&gt; [reserved-slice Tier S] -&gt; macro score, with live weight re-normalization on partial input, an exact-value Precision Test Mode, and a passing 92-case automated regression suite (including live checks against production code, not hand-copied fixtures). Seven load-bearing citations were independently fact-checked; six held up, one (Danziger 2011) was downgraded, and a v6.4 audit pass re-verified every ceiling-controlled weight and corrected one stale doc/code mismatch (Domain 5, scarcity). As of v6.1, all 24 previously-unimplemented rows from the Section 3.2b.1 evidence catalogue are live in the engine at their confidence-corrected or tier-mapped weights. As of v6.2, the subacute timing-band gap flagged in Section 3.2b.2 is closed with a genuine fourth tier. As of v6.3, ACE is a dedicated sub-layer rather than folded into 'stability', at its full confirmed-citation weight. An external peer-reviewed survey (Essahraui et al. 2025, IEEE Access) independently corroborated BAF's structural taxonomy and privacy posture, and reaffirmed the exclusion of criminal-justice applications, passive biometric data collection, and facial/demographic inference. As of v6.4, a scenario-based consistency-check system exists for comparing engine output against real respondent decisions -- built with several privacy-sensitive elements of its source protocol (named identity, external ratings, passive behavioral telemetry) deliberately declined rather than implemented. The paper's higher-risk domains (physiognomy, criminal-behavior/psychopathy prediction) remain deliberately fenced off from all scoring paths. Companion deliverables: BAF_Simulator_v6.html (47 sub-layers / 94 micro-indicators across 8 layers + Tier S), BAF_Questionnaire.docx (respondent form, auto-regenerable), BAF_Respondent_Tracker.xlsx (multi-respondent gap tracking), core-engine.js + test-cases.js (regression harness, 92/92 passing), scripts/backtest.js (3001-trial fuzz suite), scripts/compare-golden.js (15-profile drift detector), CI (GitHub Actions, runs on every push/PR).</w:t>
       </w:r>
     </w:p>
     <w:sectPr>

</xml_diff>

<commit_message>
Sync architecture doc to v6.5 (loneliness sub-layer)
</commit_message>
<xml_diff>
--- a/BAF_Technical_Architecture.docx
+++ b/BAF_Technical_Architecture.docx
@@ -2839,7 +2839,7 @@
                 <w:sz w:val="20"/>
                 <w:szCs w:val="20"/>
               </w:rPr>
-              <w:t xml:space="preserve">IMPLEMENTED in v6.5 -- 'loneliness' sub-layer, Social Network layer. Ceiling 1.25 (MODERATE-HIGH tier, paper's value used directly -- no confidence-multiplier adjustment applies, same evidence category as cognitive_style, see 3.2b.6). Closes the one clean gap identified in the v6.5 catalogue audit.</w:t>
+              <w:t xml:space="preserve">IMPLEMENTED in v6.5 -- 'loneliness' sub-layer, Social Network layer, tier-mapped weight used directly (no confidence-multiplier adjustment applies -- Cacioppo's citation is a large real body of physiological/health-mechanism research, but has no single quantifiable behavioral effect size to check against, same evidence category as cognitive_style)</w:t>
             </w:r>
           </w:p>
         </w:tc>
@@ -8005,7 +8005,7 @@
         <w:spacing w:after="120"/>
       </w:pPr>
       <w:r>
-        <w:t xml:space="preserve">Version history: v3 baseline 18/18 -&gt; v6.1 74/74 (+24 sub-layers) -&gt; v6.2 85/85 (Tier S) -&gt; v6.3 88/88 (ACE split) -&gt; v6.4 92/92 (learning-case consistency checks) -&gt; v6.5 95/95 (loneliness sub-layer). Current status: 95/95 checks passing. This suite is a regression/consistency backtest -- it proves the code computes the documented formulas correctly and stays internally consistent as the model evolves. Run it any time with: node tests/test-cases.js. NOTE for future editors: update the count above at every version bump that adds tests, or this line goes stale again -- it has done so three times already (caught and fixed in the v6.5 health-check pass).</w:t>
+        <w:t xml:space="preserve">Version history: v3 baseline 18/18 -&gt; v6.1 74/74 (+24 sub-layers) -&gt; v6.2 85/85 (Tier S) -&gt; v6.3 88/88 (ACE split) -&gt; v6.4 92/92 (learning-case consistency checks) -&gt; v6.5 95/95 (loneliness sub-layer, closing the catalogue audit). Current status: 95/95 checks passing. This suite is a regression/consistency backtest -- it proves the code computes the documented formulas correctly and stays internally consistent as the model evolves. Run it any time with: node tests/test-cases.js. NOTE for future editors: update the count above at every version bump that adds tests, or this line goes stale again -- it has done so three times already (caught and fixed in the v6.5 health-check pass).</w:t>
       </w:r>
     </w:p>
     <w:p>
@@ -8673,7 +8673,7 @@
         <w:spacing w:after="120"/>
       </w:pPr>
       <w:r>
-        <w:t xml:space="preserve">This architecture operationalizes Layers 1-7 plus the Modulator layer, and now Tier S (Subacute), from the Behavioral Algorithm Framework into a working five-tier pipeline: micro-indicator -&gt; sub-layer -&gt; layer -&gt; [reserved-slice Tier S] -&gt; macro score, with live weight re-normalization on partial input, an exact-value Precision Test Mode, and a passing 95-case automated regression suite (including live checks against production code, not hand-copied fixtures). Seven load-bearing citations were independently fact-checked; six held up, one (Danziger 2011) was downgraded, and a v6.4 audit pass re-verified every ceiling-controlled weight and corrected one stale doc/code mismatch (Domain 5, scarcity). As of v6.1, all 24 previously-unimplemented rows from the Section 3.2b.1 evidence catalogue are live in the engine at their confidence-corrected or tier-mapped weights. As of v6.2, the subacute timing-band gap flagged in Section 3.2b.2 is closed with a genuine fourth tier. As of v6.3, ACE is a dedicated sub-layer rather than folded into 'stability', at its full confirmed-citation weight. An external peer-reviewed survey (Essahraui et al. 2025, IEEE Access) independently corroborated BAF's structural taxonomy and privacy posture, and reaffirmed the exclusion of criminal-justice applications, passive biometric data collection, and facial/demographic inference. As of v6.4, a scenario-based consistency-check system exists for comparing engine output against real respondent decisions -- built with several privacy-sensitive elements of its source protocol (named identity, external ratings, passive behavioral telemetry) deliberately declined rather than implemented. The paper's higher-risk domains (physiognomy, criminal-behavior/psychopathy prediction) remain deliberately fenced off from all scoring paths. Companion deliverables: BAF_Simulator_v6.html (48 sub-layers / 96 micro-indicators across 8 layers + Tier S), BAF_Questionnaire.docx (respondent form, auto-regenerable), BAF_Respondent_Tracker.xlsx (multi-respondent gap tracking), core-engine.js + test-cases.js (regression harness, 95/95 passing), scripts/backtest.js (3001-trial fuzz suite), scripts/compare-golden.js (15-profile drift detector), CI (GitHub Actions, runs on every push/PR).</w:t>
+        <w:t xml:space="preserve">This architecture operationalizes Layers 1-7 plus the Modulator layer, and now Tier S (Subacute), from the Behavioral Algorithm Framework into a working five-tier pipeline: micro-indicator -&gt; sub-layer -&gt; layer -&gt; [reserved-slice Tier S] -&gt; macro score, with live weight re-normalization on partial input, an exact-value Precision Test Mode, and a passing 95-case automated regression suite (including live checks against production code, not hand-copied fixtures). Seven load-bearing citations were independently fact-checked; six held up, one (Danziger 2011) was downgraded, and a v6.4 audit pass re-verified every ceiling-controlled weight and corrected one stale doc/code mismatch (Domain 5, scarcity). As of v6.1, all 24 previously-unimplemented rows from the Section 3.2b.1 evidence catalogue are live in the engine at their confidence-corrected or tier-mapped weights. As of v6.2, the subacute timing-band gap flagged in Section 3.2b.2 is closed with a genuine fourth tier. As of v6.3, ACE is a dedicated sub-layer rather than folded into 'stability', at its full confirmed-citation weight. As of v6.5, loneliness/social isolation (Cacioppo &amp; Patrick 2008) closes the one clean gap the v6.5 catalogue audit found, at its tier-mapped weight (no confidence-multiplier adjustment applies, same evidence category as cognitive_style). An external peer-reviewed survey (Essahraui et al. 2025, IEEE Access) independently corroborated BAF's structural taxonomy and privacy posture, and reaffirmed the exclusion of criminal-justice applications, passive biometric data collection, and facial/demographic inference. As of v6.4, a scenario-based consistency-check system exists for comparing engine output against real respondent decisions -- built with several privacy-sensitive elements of its source protocol (named identity, external ratings, passive behavioral telemetry) deliberately declined rather than implemented. The paper's higher-risk domains (physiognomy, criminal-behavior/psychopathy prediction) remain deliberately fenced off from all scoring paths. Companion deliverables: BAF_Simulator_v6.html (48 sub-layers / 96 micro-indicators across 8 layers + Tier S), BAF_Questionnaire.docx (respondent form, auto-regenerable), BAF_Respondent_Tracker.xlsx (multi-respondent gap tracking), core-engine.js + test-cases.js (regression harness, 95/95 passing), scripts/backtest.js (3001-trial fuzz suite), scripts/compare-golden.js (15-profile drift detector), CI (GitHub Actions, runs on every push/PR).</w:t>
       </w:r>
     </w:p>
     <w:sectPr>

</xml_diff>

<commit_message>
v6.5: correlation dampener for attachment_style/parenting overlap (Family layer)
</commit_message>
<xml_diff>
--- a/BAF_Technical_Architecture.docx
+++ b/BAF_Technical_Architecture.docx
@@ -2733,7 +2733,7 @@
                 <w:sz w:val="20"/>
                 <w:szCs w:val="20"/>
               </w:rPr>
-              <w:t xml:space="preserve">IMPLEMENTED in v6.1 -- 'emotional_trauma' sub-layer, Modulator layer (triggered tier used; knowingly overlaps Family's 'stability' sub, flagged in title)</w:t>
+              <w:t xml:space="preserve">IMPLEMENTED in v6.1 -- 'emotional_trauma' sub-layer, Modulator layer (triggered tier used). Overlap with Family's 'stability' sub is cross-layer (Modulator vs Family, two independently-weighted layer averages) -- the v6.5 correlation dampener applied to attachment_style/parenting cannot mechanically extend here. Remains a documented risk only, not a scoring change. See 3.2b.8.</w:t>
             </w:r>
           </w:p>
         </w:tc>
@@ -4791,7 +4791,7 @@
                 <w:sz w:val="20"/>
                 <w:szCs w:val="20"/>
               </w:rPr>
-              <w:t xml:space="preserve">IMPLEMENTED in v6.1 -- 'attachment_style' sub-layer, Family layer (knowingly overlaps 'parenting', flagged in title)</w:t>
+              <w:t xml:space="preserve">IMPLEMENTED in v6.1 -- 'attachment_style' sub-layer, Family layer. Overlap with 'parenting' (same layer): FIXED in v6.5 -- when both are answered they fold into one averaged slot in the Family layer average rather than counting as two independent slots. See 3.2b.8.</w:t>
             </w:r>
           </w:p>
         </w:tc>
@@ -6869,6 +6869,63 @@
         <w:spacing w:after="120" w:before="280"/>
       </w:pPr>
       <w:r>
+        <w:t xml:space="preserve">3.2b.8 Correlation Dampener (v6.5)</w:t>
+      </w:r>
+    </w:p>
+    <w:p>
+      <w:pPr>
+        <w:spacing w:after="120"/>
+      </w:pPr>
+      <w:r>
+        <w:t xml:space="preserve">Two same-layer-or-cross-layer pairs were flagged since v6.1 as knowingly correlated, split into separate sub-layers per this doc's own "don't silently merge correlated signals" recommendation (3.2b.4), with the overlap noted in each sub-layer's title rather than fixed. v6.5 fixes the one pair where a fix is mechanically possible, and documents why the other is not the same kind of problem.</w:t>
+      </w:r>
+    </w:p>
+    <w:p>
+      <w:pPr>
+        <w:spacing w:after="120"/>
+      </w:pPr>
+      <w:r>
+        <w:t xml:space="preserve">The problem: a layer's score is a plain arithmetic mean of its answered sub-layers. That formula assumes every answered sub is an independent signal. attachment_style and parenting (both Family) are not independent -- when both are answered, the correlated construct they both partially measure occupies 2 of the Family layer's N averaging slots instead of 1, effectively double-weighted relative to every other Family sub-layer.</w:t>
+      </w:r>
+    </w:p>
+    <w:p>
+      <w:pPr>
+        <w:spacing w:after="120"/>
+      </w:pPr>
+      <w:r>
+        <w:t xml:space="preserve">The fix: when both attachment_style and parenting are answered, they are folded into a single combined vector -- the average of the two -- before the Family layer average is computed, so the pair occupies exactly one slot in that average, same as any uncorrelated sub-layer. The layer-averaging formula itself (Tier 2 in 3.2c) is unchanged; only what feeds into it changes. If only one member is answered, nothing changes -- it contributes at full, undampened weight, identical to pre-v6.5 behavior.</w:t>
+      </w:r>
+    </w:p>
+    <w:p>
+      <w:pPr>
+        <w:spacing w:after="120"/>
+      </w:pPr>
+      <w:r>
+        <w:t xml:space="preserve">Worked example: Family layer with birthorder, attachment_style, and parenting all answered. Pre-v6.5: familyScore = mean(birthorder, attachment_style, parenting), a 3-way average. v6.5: familyScore = mean(birthorder, mean(attachment_style, parenting)), a 2-way average over [birthorder, combined-pair]. The two formulas give different results whenever attachment_style and parenting differ from each other -- this is by design, not a rounding change.</w:t>
+      </w:r>
+    </w:p>
+    <w:p>
+      <w:pPr>
+        <w:spacing w:after="120"/>
+      </w:pPr>
+      <w:r>
+        <w:t xml:space="preserve">Why emotional_trauma/stability is NOT fixed the same way: emotional_trauma is Modulator, stability is Family -- two different layers, each with its own independently-weighted layer average. There is no shared "layer average" step to fold a cross-layer pair into; each layer's weight (3.2b.1's LAYER_WEIGHTS) is fixed regardless of how many sub-layers answer into it, so this pair does not occupy an extra slot the way a same-layer pair does. Their correlation remains a real, documented risk (flagged in both titles, and in the summary row of 3.2b.4's fact-check pass) but requires a materially different mechanism to address -- something comparable in scope to Tier S (3.2b.2), not a reuse of this dampener. Deliberately left as a documented risk only in v6.5, not a scoring change.</w:t>
+      </w:r>
+    </w:p>
+    <w:p>
+      <w:pPr>
+        <w:spacing w:after="120"/>
+      </w:pPr>
+      <w:r>
+        <w:t xml:space="preserve">Verified: 4 regression tests confirm the pair-folding behavior directly (both members answered -&gt; folded to one averaged slot, not two; either member answered alone -&gt; unaffected, full weight; emotional_trauma+stability both answered -&gt; confirmed still unfolded, matching the plain weighted-layer-blend formula). Checked against all 15 golden profiles (scripts/compare-golden.js): only 'full-100pct-mixed-realistic' answers both attachment_style and parenting with genuinely different values, and its score shifted by a few thousandths on each dimension (max |delta| well under the 0.05 significant-drift threshold) -- small because Family is one of nine roll-up layers in a 100%-complete profile, so an internal reweighting within Family is diluted by the other eight layers/Tier S. No other golden profile changed.</w:t>
+      </w:r>
+    </w:p>
+    <w:p>
+      <w:pPr>
+        <w:pStyle w:val="Heading2"/>
+        <w:spacing w:after="120" w:before="280"/>
+      </w:pPr>
+      <w:r>
         <w:t xml:space="preserve">3.2c Tier-0: Micro-Indicator Layer (v3)</w:t>
       </w:r>
     </w:p>
@@ -8005,7 +8062,7 @@
         <w:spacing w:after="120"/>
       </w:pPr>
       <w:r>
-        <w:t xml:space="preserve">Version history: v3 baseline 18/18 -&gt; v6.1 74/74 (+24 sub-layers) -&gt; v6.2 85/85 (Tier S) -&gt; v6.3 88/88 (ACE split) -&gt; v6.4 92/92 (learning-case consistency checks) -&gt; v6.5 95/95 (loneliness sub-layer, closing the catalogue audit). Current status: 95/95 checks passing. This suite is a regression/consistency backtest -- it proves the code computes the documented formulas correctly and stays internally consistent as the model evolves. Run it any time with: node tests/test-cases.js. NOTE for future editors: update the count above at every version bump that adds tests, or this line goes stale again -- it has done so three times already (caught and fixed in the v6.5 health-check pass).</w:t>
+        <w:t xml:space="preserve">Version history: v3 baseline 18/18 -&gt; v6.1 74/74 (+24 sub-layers) -&gt; v6.2 85/85 (Tier S) -&gt; v6.3 88/88 (ACE split) -&gt; v6.4 92/92 (learning-case consistency checks) -&gt; v6.5 100/100 (loneliness sub-layer + correlation dampener). Current status: 100/100 checks passing. This suite is a regression/consistency backtest -- it proves the code computes the documented formulas correctly and stays internally consistent as the model evolves. Run it any time with: node tests/test-cases.js. NOTE for future editors: update the count above at every version bump that adds tests, or this line goes stale again -- it has done so three times already (caught and fixed in the v6.5 health-check pass).</w:t>
       </w:r>
     </w:p>
     <w:p>
@@ -8117,7 +8174,7 @@
         <w:spacing w:after="60"/>
       </w:pPr>
       <w:r>
-        <w:t xml:space="preserve">Regression backtesting (Section 9.3): validates that the software correctly implements the documented math. This is fully solved -- 95/95 passing as of v6.5, deterministic, re-runnable.</w:t>
+        <w:t xml:space="preserve">Regression backtesting (Section 9.3): validates that the software correctly implements the documented math. This is fully solved -- 100/100 passing as of v6.5, deterministic, re-runnable.</w:t>
       </w:r>
     </w:p>
     <w:p>
@@ -8181,7 +8238,7 @@
         <w:spacing w:after="60"/>
       </w:pPr>
       <w:r>
-        <w:t xml:space="preserve">Two rows (Childhood attachment style, Emotional trauma) knowingly overlap existing sub-layers (Family's 'parenting' and 'stability' respectively) -- included as their own sub-layers per the doc's own recommendation to separate correlated signals, with an explicit double-counting caution in their titles rather than a silent merge.</w:t>
+        <w:t xml:space="preserve">Two rows (Childhood attachment style, Emotional trauma) knowingly overlap existing sub-layers (Family's 'parenting' and 'stability' respectively) -- included as their own sub-layers per the doc's own recommendation to separate correlated signals, with an explicit double-counting caution in their titles rather than a silent merge. As of v6.5, the same-layer pair (attachment_style/parenting) has an actual fix, not just a flag -- see 3.2b.8. The cross-layer pair (emotional_trauma/stability) remains a documented risk only; see 3.2b.8 for why the same fix cannot mechanically extend to it.</w:t>
       </w:r>
     </w:p>
     <w:p>
@@ -8673,7 +8730,7 @@
         <w:spacing w:after="120"/>
       </w:pPr>
       <w:r>
-        <w:t xml:space="preserve">This architecture operationalizes Layers 1-7 plus the Modulator layer, and now Tier S (Subacute), from the Behavioral Algorithm Framework into a working five-tier pipeline: micro-indicator -&gt; sub-layer -&gt; layer -&gt; [reserved-slice Tier S] -&gt; macro score, with live weight re-normalization on partial input, an exact-value Precision Test Mode, and a passing 95-case automated regression suite (including live checks against production code, not hand-copied fixtures). Seven load-bearing citations were independently fact-checked; six held up, one (Danziger 2011) was downgraded, and a v6.4 audit pass re-verified every ceiling-controlled weight and corrected one stale doc/code mismatch (Domain 5, scarcity). As of v6.1, all 24 previously-unimplemented rows from the Section 3.2b.1 evidence catalogue are live in the engine at their confidence-corrected or tier-mapped weights. As of v6.2, the subacute timing-band gap flagged in Section 3.2b.2 is closed with a genuine fourth tier. As of v6.3, ACE is a dedicated sub-layer rather than folded into 'stability', at its full confirmed-citation weight. As of v6.5, loneliness/social isolation (Cacioppo &amp; Patrick 2008) closes the one clean gap the v6.5 catalogue audit found, at its tier-mapped weight (no confidence-multiplier adjustment applies, same evidence category as cognitive_style). An external peer-reviewed survey (Essahraui et al. 2025, IEEE Access) independently corroborated BAF's structural taxonomy and privacy posture, and reaffirmed the exclusion of criminal-justice applications, passive biometric data collection, and facial/demographic inference. As of v6.4, a scenario-based consistency-check system exists for comparing engine output against real respondent decisions -- built with several privacy-sensitive elements of its source protocol (named identity, external ratings, passive behavioral telemetry) deliberately declined rather than implemented. The paper's higher-risk domains (physiognomy, criminal-behavior/psychopathy prediction) remain deliberately fenced off from all scoring paths. Companion deliverables: BAF_Simulator_v6.html (48 sub-layers / 96 micro-indicators across 8 layers + Tier S), BAF_Questionnaire.docx (respondent form, auto-regenerable), BAF_Respondent_Tracker.xlsx (multi-respondent gap tracking), core-engine.js + test-cases.js (regression harness, 95/95 passing), scripts/backtest.js (3001-trial fuzz suite), scripts/compare-golden.js (15-profile drift detector), CI (GitHub Actions, runs on every push/PR).</w:t>
+        <w:t xml:space="preserve">This architecture operationalizes Layers 1-7 plus the Modulator layer, and now Tier S (Subacute), from the Behavioral Algorithm Framework into a working five-tier pipeline: micro-indicator -&gt; sub-layer -&gt; layer -&gt; [reserved-slice Tier S] -&gt; macro score, with live weight re-normalization on partial input, an exact-value Precision Test Mode, and a passing 100-case automated regression suite (including live checks against production code, not hand-copied fixtures). Seven load-bearing citations were independently fact-checked; six held up, one (Danziger 2011) was downgraded, and a v6.4 audit pass re-verified every ceiling-controlled weight and corrected one stale doc/code mismatch (Domain 5, scarcity). As of v6.1, all 24 previously-unimplemented rows from the Section 3.2b.1 evidence catalogue are live in the engine at their confidence-corrected or tier-mapped weights. As of v6.2, the subacute timing-band gap flagged in Section 3.2b.2 is closed with a genuine fourth tier. As of v6.3, ACE is a dedicated sub-layer rather than folded into 'stability', at its full confirmed-citation weight. As of v6.5, loneliness/social isolation (Cacioppo &amp; Patrick 2008) closes the one clean gap the v6.5 catalogue audit found, at its tier-mapped weight (no confidence-multiplier adjustment applies, same evidence category as cognitive_style). An external peer-reviewed survey (Essahraui et al. 2025, IEEE Access) independently corroborated BAF's structural taxonomy and privacy posture, and reaffirmed the exclusion of criminal-justice applications, passive biometric data collection, and facial/demographic inference. As of v6.4, a scenario-based consistency-check system exists for comparing engine output against real respondent decisions -- built with several privacy-sensitive elements of its source protocol (named identity, external ratings, passive behavioral telemetry) deliberately declined rather than implemented. The paper's higher-risk domains (physiognomy, criminal-behavior/psychopathy prediction) remain deliberately fenced off from all scoring paths. Companion deliverables: BAF_Simulator_v6.html (48 sub-layers / 96 micro-indicators across 8 layers + Tier S), BAF_Questionnaire.docx (respondent form, auto-regenerable), BAF_Respondent_Tracker.xlsx (multi-respondent gap tracking), core-engine.js + test-cases.js (regression harness, 100/100 passing), scripts/backtest.js (3001-trial fuzz suite), scripts/compare-golden.js (15-profile drift detector), CI (GitHub Actions, runs on every push/PR).</w:t>
       </w:r>
     </w:p>
     <w:sectPr>

</xml_diff>

<commit_message>
Sync architecture doc to v6.6 (correlation dampener)
</commit_message>
<xml_diff>
--- a/BAF_Technical_Architecture.docx
+++ b/BAF_Technical_Architecture.docx
@@ -2733,7 +2733,7 @@
                 <w:sz w:val="20"/>
                 <w:szCs w:val="20"/>
               </w:rPr>
-              <w:t xml:space="preserve">IMPLEMENTED in v6.1 -- 'emotional_trauma' sub-layer, Modulator layer (triggered tier used). Overlap with Family's 'stability' sub is cross-layer (Modulator vs Family, two independently-weighted layer averages) -- the v6.5 correlation dampener applied to attachment_style/parenting cannot mechanically extend here. Remains a documented risk only, not a scoring change. See 3.2b.8.</w:t>
+              <w:t xml:space="preserve">IMPLEMENTED in v6.1 -- 'emotional_trauma' sub-layer, Modulator layer (triggered tier used). Overlap with Family's 'stability' NOT fixed in v6.6 -- this is a cross-layer pair (Modulator vs. Family), so the same-layer averaging dampener has no shared layer-average step to fold into. Remains a documented, still-open risk, see Section 8e</w:t>
             </w:r>
           </w:p>
         </w:tc>
@@ -4791,7 +4791,7 @@
                 <w:sz w:val="20"/>
                 <w:szCs w:val="20"/>
               </w:rPr>
-              <w:t xml:space="preserve">IMPLEMENTED in v6.1 -- 'attachment_style' sub-layer, Family layer. Overlap with 'parenting' (same layer): FIXED in v6.5 -- when both are answered they fold into one averaged slot in the Family layer average rather than counting as two independent slots. See 3.2b.8.</w:t>
+              <w:t xml:space="preserve">IMPLEMENTED in v6.1 -- 'attachment_style' sub-layer, Family layer. Overlap with 'parenting' FIXED in v6.6 -- both are same-layer, so a correlation dampener folds them into one averaged slot when both are answered, see Section 8e</w:t>
             </w:r>
           </w:p>
         </w:tc>
@@ -6865,11 +6865,28 @@
     </w:p>
     <w:p>
       <w:pPr>
+        <w:pStyle w:val="Heading1"/>
+        <w:spacing w:after="120" w:before="280"/>
+      </w:pPr>
+      <w:r>
+        <w:t xml:space="preserve">8e. v6.6 Changelog -- Correlation Dampener for Overlap-Risk Pairs</w:t>
+      </w:r>
+    </w:p>
+    <w:p>
+      <w:pPr>
+        <w:spacing w:after="120"/>
+      </w:pPr>
+      <w:r>
+        <w:t xml:space="preserve">Two sub-layer pairs were flagged as knowingly overlapping since v6.1: attachment_style/parenting and emotional_trauma/stability. Both risked double-counting -- if a person answered both members of a pair in a correlated way, their shared dimensions received contribution from both independently, effectively counting that signal twice relative to every other sub-layer, which only ever contributes once.</w:t>
+      </w:r>
+    </w:p>
+    <w:p>
+      <w:pPr>
         <w:pStyle w:val="Heading2"/>
         <w:spacing w:after="120" w:before="280"/>
       </w:pPr>
       <w:r>
-        <w:t xml:space="preserve">3.2b.8 Correlation Dampener (v6.5)</w:t>
+        <w:t xml:space="preserve">What got fixed, and why the other pair didn't</w:t>
       </w:r>
     </w:p>
     <w:p>
@@ -6877,7 +6894,7 @@
         <w:spacing w:after="120"/>
       </w:pPr>
       <w:r>
-        <w:t xml:space="preserve">Two same-layer-or-cross-layer pairs were flagged since v6.1 as knowingly correlated, split into separate sub-layers per this doc's own "don't silently merge correlated signals" recommendation (3.2b.4), with the overlap noted in each sub-layer's title rather than fixed. v6.5 fixes the one pair where a fix is mechanically possible, and documents why the other is not the same kind of problem.</w:t>
+        <w:t xml:space="preserve">A same-layer averaging fix was designed: when both members of a pair are answered, fold their two vectors into one averaged slot for the layer roll-up (denominator N-1, not N), rather than letting both count at full weight. attachment_style and parenting are both Family-layer sub-layers, so this fix applies directly.</w:t>
       </w:r>
     </w:p>
     <w:p>
@@ -6885,39 +6902,68 @@
         <w:spacing w:after="120"/>
       </w:pPr>
       <w:r>
-        <w:t xml:space="preserve">The problem: a layer's score is a plain arithmetic mean of its answered sub-layers. That formula assumes every answered sub is an independent signal. attachment_style and parenting (both Family) are not independent -- when both are answered, the correlated construct they both partially measure occupies 2 of the Family layer's N averaging slots instead of 1, effectively double-weighted relative to every other Family sub-layer.</w:t>
-      </w:r>
-    </w:p>
-    <w:p>
-      <w:pPr>
-        <w:spacing w:after="120"/>
-      </w:pPr>
-      <w:r>
-        <w:t xml:space="preserve">The fix: when both attachment_style and parenting are answered, they are folded into a single combined vector -- the average of the two -- before the Family layer average is computed, so the pair occupies exactly one slot in that average, same as any uncorrelated sub-layer. The layer-averaging formula itself (Tier 2 in 3.2c) is unchanged; only what feeds into it changes. If only one member is answered, nothing changes -- it contributes at full, undampened weight, identical to pre-v6.5 behavior.</w:t>
-      </w:r>
-    </w:p>
-    <w:p>
-      <w:pPr>
-        <w:spacing w:after="120"/>
-      </w:pPr>
-      <w:r>
-        <w:t xml:space="preserve">Worked example: Family layer with birthorder, attachment_style, and parenting all answered. Pre-v6.5: familyScore = mean(birthorder, attachment_style, parenting), a 3-way average. v6.5: familyScore = mean(birthorder, mean(attachment_style, parenting)), a 2-way average over [birthorder, combined-pair]. The two formulas give different results whenever attachment_style and parenting differ from each other -- this is by design, not a rounding change.</w:t>
-      </w:r>
-    </w:p>
-    <w:p>
-      <w:pPr>
-        <w:spacing w:after="120"/>
-      </w:pPr>
-      <w:r>
-        <w:t xml:space="preserve">Why emotional_trauma/stability is NOT fixed the same way: emotional_trauma is Modulator, stability is Family -- two different layers, each with its own independently-weighted layer average. There is no shared "layer average" step to fold a cross-layer pair into; each layer's weight (3.2b.1's LAYER_WEIGHTS) is fixed regardless of how many sub-layers answer into it, so this pair does not occupy an extra slot the way a same-layer pair does. Their correlation remains a real, documented risk (flagged in both titles, and in the summary row of 3.2b.4's fact-check pass) but requires a materially different mechanism to address -- something comparable in scope to Tier S (3.2b.2), not a reuse of this dampener. Deliberately left as a documented risk only in v6.5, not a scoring change.</w:t>
-      </w:r>
-    </w:p>
-    <w:p>
-      <w:pPr>
-        <w:spacing w:after="120"/>
-      </w:pPr>
-      <w:r>
-        <w:t xml:space="preserve">Verified: 4 regression tests confirm the pair-folding behavior directly (both members answered -&gt; folded to one averaged slot, not two; either member answered alone -&gt; unaffected, full weight; emotional_trauma+stability both answered -&gt; confirmed still unfolded, matching the plain weighted-layer-blend formula). Checked against all 15 golden profiles (scripts/compare-golden.js): only 'full-100pct-mixed-realistic' answers both attachment_style and parenting with genuinely different values, and its score shifted by a few thousandths on each dimension (max |delta| well under the 0.05 significant-drift threshold) -- small because Family is one of nine roll-up layers in a 100%-complete profile, so an internal reweighting within Family is diluted by the other eight layers/Tier S. No other golden profile changed.</w:t>
+        <w:t xml:space="preserve">emotional_trauma and stability are NOT both Family layer -- emotional_trauma is Modulator, stability is Family. This was caught during implementation as a scope error in the original request (which had assumed both pairs were same-layer). A cross-layer pair has no shared layer-average step to fold into -- the fix cannot mechanically apply. Rather than force an incorrect fix onto architecture that doesn't support it, this pair remains a documented, still-open risk. Closing it properly would require a cross-layer correction mechanism, not the same-layer dampener built here -- flagged as a future item, not solved by v6.6.</w:t>
+      </w:r>
+    </w:p>
+    <w:p>
+      <w:pPr>
+        <w:pStyle w:val="Heading2"/>
+        <w:spacing w:after="120" w:before="280"/>
+      </w:pPr>
+      <w:r>
+        <w:t xml:space="preserve">Verification</w:t>
+      </w:r>
+    </w:p>
+    <w:p>
+      <w:pPr>
+        <w:pStyle w:val="ListParagraph"/>
+        <w:numPr>
+          <w:ilvl w:val="0"/>
+          <w:numId w:val="2"/>
+        </w:numPr>
+        <w:spacing w:after="60"/>
+      </w:pPr>
+      <w:r>
+        <w:t xml:space="preserve">Regression suite grew 95 -&gt; 100 (+5): TC54 confirms both-answered folds to one averaged slot (tested against both the new dampened value and the old undampened 3-way average, proving the fix changed real behavior); TC55/TC56 confirm either member alone is completely unaffected, full weight; TC57 confirms the emotional_trauma/stability pair is NOT dampened, documenting the open gap as a test rather than only a comment</w:t>
+      </w:r>
+    </w:p>
+    <w:p>
+      <w:pPr>
+        <w:pStyle w:val="ListParagraph"/>
+        <w:numPr>
+          <w:ilvl w:val="0"/>
+          <w:numId w:val="2"/>
+        </w:numPr>
+        <w:spacing w:after="60"/>
+      </w:pPr>
+      <w:r>
+        <w:t xml:space="preserve">Existing tests were checked by hand for which ones exercised a pair with both members answered and differing values, rather than blindly re-passing after adjusting expectations -- none in test-cases.js did, so no hidden behavior change slipped through unexamined</w:t>
+      </w:r>
+    </w:p>
+    <w:p>
+      <w:pPr>
+        <w:pStyle w:val="ListParagraph"/>
+        <w:numPr>
+          <w:ilvl w:val="0"/>
+          <w:numId w:val="2"/>
+        </w:numPr>
+        <w:spacing w:after="60"/>
+      </w:pPr>
+      <w:r>
+        <w:t xml:space="preserve">compare-golden: 1 of 15 profiles changed (full-100pct-mixed-realistic, which answers both attachment_style and parenting with genuinely different values). Delta was small (RT/SC/ER/AR/DS/SR all under 0.03) because Family is 1 of 9 roll-up layers -- even a real, correct within-layer fix gets diluted at the macro-score level. This is the fix working as intended, not drift. The other 14 profiles either don't answer both pair members, or answer both with identical values (mathematically invariant to averaging)</w:t>
+      </w:r>
+    </w:p>
+    <w:p>
+      <w:pPr>
+        <w:pStyle w:val="ListParagraph"/>
+        <w:numPr>
+          <w:ilvl w:val="0"/>
+          <w:numId w:val="2"/>
+        </w:numPr>
+        <w:spacing w:after="60"/>
+      </w:pPr>
+      <w:r>
+        <w:t xml:space="preserve">Backtest (3001 trials) unaffected -- it independently recomputes finalVec from layerVecs rather than re-deriving the dampener logic, so it validates the fix's output rather than assuming it</w:t>
       </w:r>
     </w:p>
     <w:p>
@@ -8062,7 +8108,7 @@
         <w:spacing w:after="120"/>
       </w:pPr>
       <w:r>
-        <w:t xml:space="preserve">Version history: v3 baseline 18/18 -&gt; v6.1 74/74 (+24 sub-layers) -&gt; v6.2 85/85 (Tier S) -&gt; v6.3 88/88 (ACE split) -&gt; v6.4 92/92 (learning-case consistency checks) -&gt; v6.5 100/100 (loneliness sub-layer + correlation dampener). Current status: 100/100 checks passing. This suite is a regression/consistency backtest -- it proves the code computes the documented formulas correctly and stays internally consistent as the model evolves. Run it any time with: node tests/test-cases.js. NOTE for future editors: update the count above at every version bump that adds tests, or this line goes stale again -- it has done so three times already (caught and fixed in the v6.5 health-check pass).</w:t>
+        <w:t xml:space="preserve">Version history: v3 baseline 18/18 -&gt; v6.1 74/74 (+24 sub-layers) -&gt; v6.2 85/85 (Tier S) -&gt; v6.3 88/88 (ACE split) -&gt; v6.4 92/92 (learning-case consistency checks) -&gt; v6.5 95/95 (loneliness sub-layer, closing the catalogue audit) -&gt; v6.6 100/100 (correlation dampener for the attachment_style/parenting overlap). Current status: 100/100 checks passing. This suite is a regression/consistency backtest -- it proves the code computes the documented formulas correctly and stays internally consistent as the model evolves. Run it any time with: node tests/test-cases.js. NOTE for future editors: update the count above at every version bump that adds tests, or this line goes stale again -- it has done so three times already (caught and fixed in the v6.5 health-check pass).</w:t>
       </w:r>
     </w:p>
     <w:p>
@@ -8174,7 +8220,7 @@
         <w:spacing w:after="60"/>
       </w:pPr>
       <w:r>
-        <w:t xml:space="preserve">Regression backtesting (Section 9.3): validates that the software correctly implements the documented math. This is fully solved -- 100/100 passing as of v6.5, deterministic, re-runnable.</w:t>
+        <w:t xml:space="preserve">Regression backtesting (Section 9.3): validates that the software correctly implements the documented math. This is fully solved -- 100/100 passing as of v6.6, deterministic, re-runnable.</w:t>
       </w:r>
     </w:p>
     <w:p>
@@ -8238,7 +8284,7 @@
         <w:spacing w:after="60"/>
       </w:pPr>
       <w:r>
-        <w:t xml:space="preserve">Two rows (Childhood attachment style, Emotional trauma) knowingly overlap existing sub-layers (Family's 'parenting' and 'stability' respectively) -- included as their own sub-layers per the doc's own recommendation to separate correlated signals, with an explicit double-counting caution in their titles rather than a silent merge. As of v6.5, the same-layer pair (attachment_style/parenting) has an actual fix, not just a flag -- see 3.2b.8. The cross-layer pair (emotional_trauma/stability) remains a documented risk only; see 3.2b.8 for why the same fix cannot mechanically extend to it.</w:t>
+        <w:t xml:space="preserve">Two rows (Childhood attachment style, Emotional trauma) knowingly overlap existing sub-layers (Family's 'parenting' and 'stability' respectively) -- included as their own sub-layers per the doc's own recommendation to separate correlated signals, with an explicit double-counting caution in their titles rather than a silent merge.</w:t>
       </w:r>
     </w:p>
     <w:p>
@@ -8730,7 +8776,7 @@
         <w:spacing w:after="120"/>
       </w:pPr>
       <w:r>
-        <w:t xml:space="preserve">This architecture operationalizes Layers 1-7 plus the Modulator layer, and now Tier S (Subacute), from the Behavioral Algorithm Framework into a working five-tier pipeline: micro-indicator -&gt; sub-layer -&gt; layer -&gt; [reserved-slice Tier S] -&gt; macro score, with live weight re-normalization on partial input, an exact-value Precision Test Mode, and a passing 100-case automated regression suite (including live checks against production code, not hand-copied fixtures). Seven load-bearing citations were independently fact-checked; six held up, one (Danziger 2011) was downgraded, and a v6.4 audit pass re-verified every ceiling-controlled weight and corrected one stale doc/code mismatch (Domain 5, scarcity). As of v6.1, all 24 previously-unimplemented rows from the Section 3.2b.1 evidence catalogue are live in the engine at their confidence-corrected or tier-mapped weights. As of v6.2, the subacute timing-band gap flagged in Section 3.2b.2 is closed with a genuine fourth tier. As of v6.3, ACE is a dedicated sub-layer rather than folded into 'stability', at its full confirmed-citation weight. As of v6.5, loneliness/social isolation (Cacioppo &amp; Patrick 2008) closes the one clean gap the v6.5 catalogue audit found, at its tier-mapped weight (no confidence-multiplier adjustment applies, same evidence category as cognitive_style). An external peer-reviewed survey (Essahraui et al. 2025, IEEE Access) independently corroborated BAF's structural taxonomy and privacy posture, and reaffirmed the exclusion of criminal-justice applications, passive biometric data collection, and facial/demographic inference. As of v6.4, a scenario-based consistency-check system exists for comparing engine output against real respondent decisions -- built with several privacy-sensitive elements of its source protocol (named identity, external ratings, passive behavioral telemetry) deliberately declined rather than implemented. The paper's higher-risk domains (physiognomy, criminal-behavior/psychopathy prediction) remain deliberately fenced off from all scoring paths. Companion deliverables: BAF_Simulator_v6.html (48 sub-layers / 96 micro-indicators across 8 layers + Tier S), BAF_Questionnaire.docx (respondent form, auto-regenerable), BAF_Respondent_Tracker.xlsx (multi-respondent gap tracking), core-engine.js + test-cases.js (regression harness, 100/100 passing), scripts/backtest.js (3001-trial fuzz suite), scripts/compare-golden.js (15-profile drift detector), CI (GitHub Actions, runs on every push/PR).</w:t>
+        <w:t xml:space="preserve">This architecture operationalizes Layers 1-7 plus the Modulator layer, and now Tier S (Subacute), from the Behavioral Algorithm Framework into a working five-tier pipeline: micro-indicator -&gt; sub-layer -&gt; layer -&gt; [reserved-slice Tier S] -&gt; macro score, with live weight re-normalization on partial input, an exact-value Precision Test Mode, and a passing 100-case automated regression suite (including live checks against production code, not hand-copied fixtures). Seven load-bearing citations were independently fact-checked; six held up, one (Danziger 2011) was downgraded, and a v6.4 audit pass re-verified every ceiling-controlled weight and corrected one stale doc/code mismatch (Domain 5, scarcity). As of v6.1, all 24 previously-unimplemented rows from the Section 3.2b.1 evidence catalogue are live in the engine at their confidence-corrected or tier-mapped weights. As of v6.2, the subacute timing-band gap flagged in Section 3.2b.2 is closed with a genuine fourth tier. As of v6.3, ACE is a dedicated sub-layer rather than folded into 'stability', at its full confirmed-citation weight. As of v6.5, loneliness/social isolation (Cacioppo &amp; Patrick 2008) closes the one clean gap the v6.5 catalogue audit found, at its tier-mapped weight (no confidence-multiplier adjustment applies, same evidence category as cognitive_style). As of v6.6, the attachment_style/parenting double-counting risk is fixed via a same-layer correlation dampener; the cross-layer emotional_trauma/stability risk could not be mechanically fixed the same way and remains documented as open. An external peer-reviewed survey (Essahraui et al. 2025, IEEE Access) independently corroborated BAF's structural taxonomy and privacy posture, and reaffirmed the exclusion of criminal-justice applications, passive biometric data collection, and facial/demographic inference. As of v6.4, a scenario-based consistency-check system exists for comparing engine output against real respondent decisions -- built with several privacy-sensitive elements of its source protocol (named identity, external ratings, passive behavioral telemetry) deliberately declined rather than implemented. The paper's higher-risk domains (physiognomy, criminal-behavior/psychopathy prediction) remain deliberately fenced off from all scoring paths. Companion deliverables: BAF_Simulator_v6.html (48 sub-layers / 96 micro-indicators across 8 layers + Tier S), BAF_Questionnaire.docx (respondent form, auto-regenerable), BAF_Respondent_Tracker.xlsx (multi-respondent gap tracking), core-engine.js + test-cases.js (regression harness, 100/100 passing), scripts/backtest.js (3001-trial fuzz suite), scripts/compare-golden.js (15-profile drift detector), CI (GitHub Actions, runs on every push/PR).</w:t>
       </w:r>
     </w:p>
     <w:sectPr>

</xml_diff>

<commit_message>
v6.7: cross-layer correlation dampener for emotional_trauma/stability overlap
</commit_message>
<xml_diff>
--- a/BAF_Technical_Architecture.docx
+++ b/BAF_Technical_Architecture.docx
@@ -2733,7 +2733,7 @@
                 <w:sz w:val="20"/>
                 <w:szCs w:val="20"/>
               </w:rPr>
-              <w:t xml:space="preserve">IMPLEMENTED in v6.1 -- 'emotional_trauma' sub-layer, Modulator layer (triggered tier used). Overlap with Family's 'stability' NOT fixed in v6.6 -- this is a cross-layer pair (Modulator vs. Family), so the same-layer averaging dampener has no shared layer-average step to fold into. Remains a documented, still-open risk, see Section 8e</w:t>
+              <w:t xml:space="preserve">IMPLEMENTED in v6.1 -- 'emotional_trauma' sub-layer, Modulator layer (triggered tier used). Overlap with Family's 'stability' FIXED in v6.7 -- a cross-layer correlation dampener scales each of the two vectors by CROSS_LAYER_DISCOUNT (0.5) before either enters its own layer's average, when both are answered. See Section 8e.</w:t>
             </w:r>
           </w:p>
         </w:tc>
@@ -6555,7 +6555,7 @@
         <w:spacing w:after="120" w:before="280"/>
       </w:pPr>
       <w:r>
-        <w:t xml:space="preserve">3.2b.7 External Corroboration -- Essahraui et al. 2025 (IEEE Access)</w:t>
+        <w:t xml:space="preserve">8e. v6.6-v6.7 Changelog -- Correlation Dampeners for Overlap-Risk Pairs</w:t>
       </w:r>
     </w:p>
     <w:p>
@@ -6563,321 +6563,7 @@
         <w:spacing w:after="120"/>
       </w:pPr>
       <w:r>
-        <w:t xml:space="preserve">A peer-reviewed field survey was checked against BAF's design after publication: Essahraui, S., Lamaakal, I., Maleh, Y., El Makkaoui, K., Filali Bouami, M., Ouahbi, I., Abd El-Latif, A. A., Almousa, M., &amp; Rodrigues, J. J. P. C. (2025). Human Behavior Analysis: A Comprehensive Survey on Techniques, Applications, Challenges, and Future Directions. IEEE Access, vol. 13. DOI: 10.1109/ACCESS.2025.3589938. This is independent corroboration, not new evidence for any specific weight -- it speaks to whether BAF's structure and guardrails match how the field itself organizes and constrains this work.</w:t>
-      </w:r>
-    </w:p>
-    <w:p>
-      <w:pPr>
-        <w:pStyle w:val="Heading3"/>
-        <w:spacing w:after="120" w:before="280"/>
-      </w:pPr>
-      <w:r>
-        <w:t xml:space="preserve">Structural corroboration</w:t>
-      </w:r>
-    </w:p>
-    <w:p>
-      <w:pPr>
-        <w:spacing w:after="120"/>
-      </w:pPr>
-      <w:r>
-        <w:t xml:space="preserve">The survey defines its field as the study of human actions, reactions, cognitive processes, and emotional states across environments -- the same three-part structure (behavioral patterns, cognitive processes, emotional states) that BAF's layer taxonomy was independently built around. This is agreement on framing, not proof that BAF's specific weights or sub-layers are correct.</w:t>
-      </w:r>
-    </w:p>
-    <w:p>
-      <w:pPr>
-        <w:pStyle w:val="Heading3"/>
-        <w:spacing w:after="120" w:before="280"/>
-      </w:pPr>
-      <w:r>
-        <w:t xml:space="preserve">Privacy posture corroboration</w:t>
-      </w:r>
-    </w:p>
-    <w:p>
-      <w:pPr>
-        <w:spacing w:after="120"/>
-      </w:pPr>
-      <w:r>
-        <w:t xml:space="preserve">The survey's own Section VII-E catalogues privacy-preserving techniques the field considers current best practice. Several of BAF's design decisions, made independently across v6.4's continuous-improvement layer, map directly onto named techniques in that section rather than being ad hoc caution:</w:t>
-      </w:r>
-    </w:p>
-    <w:tbl>
-      <w:tblPr>
-        <w:tblW w:type="dxa" w:w="9600"/>
-        <w:tblBorders>
-          <w:top w:val="single" w:color="auto" w:sz="4"/>
-          <w:left w:val="single" w:color="auto" w:sz="4"/>
-          <w:bottom w:val="single" w:color="auto" w:sz="4"/>
-          <w:right w:val="single" w:color="auto" w:sz="4"/>
-          <w:insideH w:val="single" w:color="auto" w:sz="4"/>
-          <w:insideV w:val="single" w:color="auto" w:sz="4"/>
-        </w:tblBorders>
-      </w:tblPr>
-      <w:tblGrid>
-        <w:gridCol w:w="4800"/>
-        <w:gridCol w:w="4800"/>
-      </w:tblGrid>
-      <w:tr>
-        <w:tc>
-          <w:tcPr>
-            <w:tcW w:type="dxa" w:w="4800"/>
-            <w:shd w:fill="1F4E5F" w:color="1F4E5F" w:val="clear"/>
-          </w:tcPr>
-          <w:p>
-            <w:r>
-              <w:rPr>
-                <w:b/>
-                <w:bCs/>
-                <w:color w:val="FFFFFF"/>
-                <w:sz w:val="20"/>
-                <w:szCs w:val="20"/>
-              </w:rPr>
-              <w:t xml:space="preserve">BAF design decision</w:t>
-            </w:r>
-          </w:p>
-        </w:tc>
-        <w:tc>
-          <w:tcPr>
-            <w:tcW w:type="dxa" w:w="4800"/>
-            <w:shd w:fill="1F4E5F" w:color="1F4E5F" w:val="clear"/>
-          </w:tcPr>
-          <w:p>
-            <w:r>
-              <w:rPr>
-                <w:b/>
-                <w:bCs/>
-                <w:color w:val="FFFFFF"/>
-                <w:sz w:val="20"/>
-                <w:szCs w:val="20"/>
-              </w:rPr>
-              <w:t xml:space="preserve">Matches survey's named technique</w:t>
-            </w:r>
-          </w:p>
-        </w:tc>
-      </w:tr>
-      <w:tr>
-        <w:tc>
-          <w:tcPr>
-            <w:tcW w:type="dxa" w:w="4800"/>
-          </w:tcPr>
-          <w:p>
-            <w:r>
-              <w:rPr>
-                <w:b w:val="false"/>
-                <w:bCs w:val="false"/>
-                <w:color w:val="000000"/>
-                <w:sz w:val="20"/>
-                <w:szCs w:val="20"/>
-              </w:rPr>
-              <w:t xml:space="preserve">Opaque respondent codes only (regex-enforced, no name/location/employer)</w:t>
-            </w:r>
-          </w:p>
-        </w:tc>
-        <w:tc>
-          <w:tcPr>
-            <w:tcW w:type="dxa" w:w="4800"/>
-          </w:tcPr>
-          <w:p>
-            <w:r>
-              <w:rPr>
-                <w:b w:val="false"/>
-                <w:bCs w:val="false"/>
-                <w:color w:val="000000"/>
-                <w:sz w:val="20"/>
-                <w:szCs w:val="20"/>
-              </w:rPr>
-              <w:t xml:space="preserve">Data minimization and purpose limitation (Section VII-E-7)</w:t>
-            </w:r>
-          </w:p>
-        </w:tc>
-      </w:tr>
-      <w:tr>
-        <w:tc>
-          <w:tcPr>
-            <w:tcW w:type="dxa" w:w="4800"/>
-          </w:tcPr>
-          <w:p>
-            <w:r>
-              <w:rPr>
-                <w:b w:val="false"/>
-                <w:bCs w:val="false"/>
-                <w:color w:val="000000"/>
-                <w:sz w:val="20"/>
-                <w:szCs w:val="20"/>
-              </w:rPr>
-              <w:t xml:space="preserve">Explicit consent script read before any data collection</w:t>
-            </w:r>
-          </w:p>
-        </w:tc>
-        <w:tc>
-          <w:tcPr>
-            <w:tcW w:type="dxa" w:w="4800"/>
-          </w:tcPr>
-          <w:p>
-            <w:r>
-              <w:rPr>
-                <w:b w:val="false"/>
-                <w:bCs w:val="false"/>
-                <w:color w:val="000000"/>
-                <w:sz w:val="20"/>
-                <w:szCs w:val="20"/>
-              </w:rPr>
-              <w:t xml:space="preserve">Consent management platforms (Section VII-E-6)</w:t>
-            </w:r>
-          </w:p>
-        </w:tc>
-      </w:tr>
-      <w:tr>
-        <w:tc>
-          <w:tcPr>
-            <w:tcW w:type="dxa" w:w="4800"/>
-          </w:tcPr>
-          <w:p>
-            <w:r>
-              <w:rPr>
-                <w:b w:val="false"/>
-                <w:bCs w:val="false"/>
-                <w:color w:val="000000"/>
-                <w:sz w:val="20"/>
-                <w:szCs w:val="20"/>
-              </w:rPr>
-              <w:t xml:space="preserve">No passive behavioral signal capture (mouse, keystroke, timing)</w:t>
-            </w:r>
-          </w:p>
-        </w:tc>
-        <w:tc>
-          <w:tcPr>
-            <w:tcW w:type="dxa" w:w="4800"/>
-          </w:tcPr>
-          <w:p>
-            <w:r>
-              <w:rPr>
-                <w:b w:val="false"/>
-                <w:bCs w:val="false"/>
-                <w:color w:val="000000"/>
-                <w:sz w:val="20"/>
-                <w:szCs w:val="20"/>
-              </w:rPr>
-              <w:t xml:space="preserve">Directly avoids the re-identification and informed-consent risks the survey attributes to passive/background data collection (Section VI-A-1)</w:t>
-            </w:r>
-          </w:p>
-        </w:tc>
-      </w:tr>
-      <w:tr>
-        <w:tc>
-          <w:tcPr>
-            <w:tcW w:type="dxa" w:w="4800"/>
-          </w:tcPr>
-          <w:p>
-            <w:r>
-              <w:rPr>
-                <w:b w:val="false"/>
-                <w:bCs w:val="false"/>
-                <w:color w:val="000000"/>
-                <w:sz w:val="20"/>
-                <w:szCs w:val="20"/>
-              </w:rPr>
-              <w:t xml:space="preserve">Learning-case layer compares output but cannot alter scores</w:t>
-            </w:r>
-          </w:p>
-        </w:tc>
-        <w:tc>
-          <w:tcPr>
-            <w:tcW w:type="dxa" w:w="4800"/>
-          </w:tcPr>
-          <w:p>
-            <w:r>
-              <w:rPr>
-                <w:b w:val="false"/>
-                <w:bCs w:val="false"/>
-                <w:color w:val="000000"/>
-                <w:sz w:val="20"/>
-                <w:szCs w:val="20"/>
-              </w:rPr>
-              <w:t xml:space="preserve">Consistent with the survey's call for explainable, transparent decision-making processes over opaque prediction (Section VIII conclusion)</w:t>
-            </w:r>
-          </w:p>
-        </w:tc>
-      </w:tr>
-    </w:tbl>
-    <w:p>
-      <w:pPr>
-        <w:pStyle w:val="Heading3"/>
-        <w:spacing w:after="120" w:before="280"/>
-      </w:pPr>
-      <w:r>
-        <w:t xml:space="preserve">Explicit exclusions, reaffirmed rather than reconsidered</w:t>
-      </w:r>
-    </w:p>
-    <w:p>
-      <w:pPr>
-        <w:spacing w:after="120"/>
-      </w:pPr>
-      <w:r>
-        <w:t xml:space="preserve">The survey covers substantially more ground than BAF implements. Most of that additional ground is deliberately not being added, for the same reasons the source research paper's physiognomy and criminal-behavior sections were excluded from every version of this project:</w:t>
-      </w:r>
-    </w:p>
-    <w:p>
-      <w:pPr>
-        <w:pStyle w:val="ListParagraph"/>
-        <w:numPr>
-          <w:ilvl w:val="0"/>
-          <w:numId w:val="2"/>
-        </w:numPr>
-        <w:spacing w:after="60"/>
-      </w:pPr>
-      <w:r>
-        <w:t xml:space="preserve">Criminal justice and public safety applications (survey Section V-E: crime prediction, criminal tracking, predictive policing) -- excluded. This is the same domain the original source paper's psychopathy/criminal-behavior sections were fenced off from at project start; nothing in this survey changes that judgment.</w:t>
-      </w:r>
-    </w:p>
-    <w:p>
-      <w:pPr>
-        <w:pStyle w:val="ListParagraph"/>
-        <w:numPr>
-          <w:ilvl w:val="0"/>
-          <w:numId w:val="2"/>
-        </w:numPr>
-        <w:spacing w:after="60"/>
-      </w:pPr>
-      <w:r>
-        <w:t xml:space="preserve">Passive sensor, wearable, and biometric data collection (survey Sections III-IV, VI-A) -- excluded. Already declined twice in this project's own Human Validation Protocol documents; the survey's Section VI-A independently names the same risks (informed consent difficulty, re-identification via combined modalities, breach exposure) as the reason to decline it.</w:t>
-      </w:r>
-    </w:p>
-    <w:p>
-      <w:pPr>
-        <w:pStyle w:val="ListParagraph"/>
-        <w:numPr>
-          <w:ilvl w:val="0"/>
-          <w:numId w:val="2"/>
-        </w:numPr>
-        <w:spacing w:after="60"/>
-      </w:pPr>
-      <w:r>
-        <w:t xml:space="preserve">Facial recognition, gait analysis, and demographic-based inference -- excluded. The survey's own Section VI-D reports that facial-expression models trained on Western datasets misinterpret emotions from other cultural groups -- an independent finding that argues against adding this capability, not for it.</w:t>
-      </w:r>
-    </w:p>
-    <w:p>
-      <w:pPr>
-        <w:spacing w:after="120"/>
-      </w:pPr>
-      <w:r>
-        <w:t xml:space="preserve">Net effect: this pass strengthens BAF's existing privacy and scope choices with academic citation, and adds no new sub-layers, no new data collection, and no new scoring inputs.</w:t>
-      </w:r>
-    </w:p>
-    <w:p>
-      <w:pPr>
-        <w:pStyle w:val="Heading1"/>
-        <w:spacing w:after="120" w:before="280"/>
-      </w:pPr>
-      <w:r>
-        <w:t xml:space="preserve">8e. v6.6 Changelog -- Correlation Dampener for Overlap-Risk Pairs</w:t>
-      </w:r>
-    </w:p>
-    <w:p>
-      <w:pPr>
-        <w:spacing w:after="120"/>
-      </w:pPr>
-      <w:r>
-        <w:t xml:space="preserve">Two sub-layer pairs were flagged as knowingly overlapping since v6.1: attachment_style/parenting and emotional_trauma/stability. Both risked double-counting -- if a person answered both members of a pair in a correlated way, their shared dimensions received contribution from both independently, effectively counting that signal twice relative to every other sub-layer, which only ever contributes once.</w:t>
+        <w:t xml:space="preserve">Two sub-layer pairs were flagged as knowingly overlapping since v6.1: attachment_style/parenting (both Family) and emotional_trauma/stability (Modulator and Family respectively). Both risked double-counting -- if a person answered both members of a pair in a correlated way, their shared dimensions received contribution from both independently, effectively counting that signal twice relative to every other sub-layer, which only ever contributes once. v6.6 fixed the same-layer pair; v6.7 closes the cross-layer pair with a structurally different mechanism.</w:t>
       </w:r>
     </w:p>
     <w:p>
@@ -6886,7 +6572,7 @@
         <w:spacing w:after="120" w:before="280"/>
       </w:pPr>
       <w:r>
-        <w:t xml:space="preserve">What got fixed, and why the other pair didn't</w:t>
+        <w:t xml:space="preserve">v6.6: same-layer dampener (attachment_style/parenting)</w:t>
       </w:r>
     </w:p>
     <w:p>
@@ -6894,7 +6580,7 @@
         <w:spacing w:after="120"/>
       </w:pPr>
       <w:r>
-        <w:t xml:space="preserve">A same-layer averaging fix was designed: when both members of a pair are answered, fold their two vectors into one averaged slot for the layer roll-up (denominator N-1, not N), rather than letting both count at full weight. attachment_style and parenting are both Family-layer sub-layers, so this fix applies directly.</w:t>
+        <w:t xml:space="preserve">A same-layer averaging fix: when both members of a pair are answered, fold their two vectors into one averaged slot for the layer roll-up (denominator N-1, not N), rather than letting both count at full weight. attachment_style and parenting are both Family-layer sub-layers, so this fix applies directly -- see CORRELATED_PAIRS in core-engine.js.</w:t>
       </w:r>
     </w:p>
     <w:p>
@@ -6902,7 +6588,7 @@
         <w:spacing w:after="120"/>
       </w:pPr>
       <w:r>
-        <w:t xml:space="preserve">emotional_trauma and stability are NOT both Family layer -- emotional_trauma is Modulator, stability is Family. This was caught during implementation as a scope error in the original request (which had assumed both pairs were same-layer). A cross-layer pair has no shared layer-average step to fold into -- the fix cannot mechanically apply. Rather than force an incorrect fix onto architecture that doesn't support it, this pair remains a documented, still-open risk. Closing it properly would require a cross-layer correction mechanism, not the same-layer dampener built here -- flagged as a future item, not solved by v6.6.</w:t>
+        <w:t xml:space="preserve">emotional_trauma and stability are NOT both Family layer -- emotional_trauma is Modulator, stability is Family. This was caught during v6.6's implementation as a scope error in the original request (which had assumed both pairs were same-layer). A cross-layer pair has no shared layer-average step to fold into -- the same-layer fix cannot mechanically apply. v6.6 left this pair as a documented, still-open risk rather than force an incorrect fix onto architecture that doesn't support it.</w:t>
       </w:r>
     </w:p>
     <w:p>
@@ -6911,59 +6597,72 @@
         <w:spacing w:after="120" w:before="280"/>
       </w:pPr>
       <w:r>
+        <w:t xml:space="preserve">v6.7: cross-layer dampener (emotional_trauma/stability)</w:t>
+      </w:r>
+    </w:p>
+    <w:p>
+      <w:pPr>
+        <w:spacing w:after="120"/>
+      </w:pPr>
+      <w:r>
+        <w:t xml:space="preserve">Closing the pair v6.6 correctly declined to force-fix. Since there is no shared layer-average to fold two cross-layer subs into, the mechanism has to work differently: instead of combining two subs into one shared slot, each member's OWN vector is scaled down by a discount factor BEFORE it enters its own layer's average -- a per-vector operation that needs no shared structure between the two layers at all. See CROSS_LAYER_PAIRS/CROSS_LAYER_DISCOUNT in core-engine.js.</w:t>
+      </w:r>
+    </w:p>
+    <w:p>
+      <w:pPr>
+        <w:spacing w:after="120"/>
+      </w:pPr>
+      <w:r>
+        <w:t xml:space="preserve">CROSS_LAYER_DISCOUNT = 0.5. Reasoning: the v6.6 same-layer fix already tells us what discount a correlated pair member effectively receives when folded -- combining two vectors into one averaged slot means each member's own vector counts at exactly 50% within that slot (a straight 2-way average). Absent an independent citation quantifying exactly how correlated emotional_trauma and stability are (unlike the fact-checked citations in 3.2b.4, which had real effect sizes to ground a specific ceiling number), 0.5 is the neutral, symmetric prior -- no directional reason exists to discount one member more than the other, or by more or less than half. Same pattern this document already uses for SUBACUTE_WEIGHT: a conservative, principled default chosen in the absence of hard data, not an arbitrary number.</w:t>
+      </w:r>
+    </w:p>
+    <w:p>
+      <w:pPr>
+        <w:spacing w:after="120"/>
+      </w:pPr>
+      <w:r>
+        <w:t xml:space="preserve">Architecturally generic, not hardcoded to this one pair: CROSS_LAYER_PAIRS is a list (currently holding one entry) and CROSS_LAYER_DISCOUNT is a single shared constant, so any future cross-layer overlap found by a later audit only needs an entry appended, not a new mechanism.</w:t>
+      </w:r>
+    </w:p>
+    <w:p>
+      <w:pPr>
+        <w:pStyle w:val="Heading2"/>
+        <w:spacing w:after="120" w:before="280"/>
+      </w:pPr>
+      <w:r>
         <w:t xml:space="preserve">Verification</w:t>
       </w:r>
     </w:p>
     <w:p>
       <w:pPr>
-        <w:pStyle w:val="ListParagraph"/>
-        <w:numPr>
-          <w:ilvl w:val="0"/>
-          <w:numId w:val="2"/>
-        </w:numPr>
-        <w:spacing w:after="60"/>
-      </w:pPr>
-      <w:r>
-        <w:t xml:space="preserve">Regression suite grew 95 -&gt; 100 (+5): TC54 confirms both-answered folds to one averaged slot (tested against both the new dampened value and the old undampened 3-way average, proving the fix changed real behavior); TC55/TC56 confirm either member alone is completely unaffected, full weight; TC57 confirms the emotional_trauma/stability pair is NOT dampened, documenting the open gap as a test rather than only a comment</w:t>
-      </w:r>
-    </w:p>
-    <w:p>
-      <w:pPr>
-        <w:pStyle w:val="ListParagraph"/>
-        <w:numPr>
-          <w:ilvl w:val="0"/>
-          <w:numId w:val="2"/>
-        </w:numPr>
-        <w:spacing w:after="60"/>
-      </w:pPr>
-      <w:r>
-        <w:t xml:space="preserve">Existing tests were checked by hand for which ones exercised a pair with both members answered and differing values, rather than blindly re-passing after adjusting expectations -- none in test-cases.js did, so no hidden behavior change slipped through unexamined</w:t>
-      </w:r>
-    </w:p>
-    <w:p>
-      <w:pPr>
-        <w:pStyle w:val="ListParagraph"/>
-        <w:numPr>
-          <w:ilvl w:val="0"/>
-          <w:numId w:val="2"/>
-        </w:numPr>
-        <w:spacing w:after="60"/>
-      </w:pPr>
-      <w:r>
-        <w:t xml:space="preserve">compare-golden: 1 of 15 profiles changed (full-100pct-mixed-realistic, which answers both attachment_style and parenting with genuinely different values). Delta was small (RT/SC/ER/AR/DS/SR all under 0.03) because Family is 1 of 9 roll-up layers -- even a real, correct within-layer fix gets diluted at the macro-score level. This is the fix working as intended, not drift. The other 14 profiles either don't answer both pair members, or answer both with identical values (mathematically invariant to averaging)</w:t>
-      </w:r>
-    </w:p>
-    <w:p>
-      <w:pPr>
-        <w:pStyle w:val="ListParagraph"/>
-        <w:numPr>
-          <w:ilvl w:val="0"/>
-          <w:numId w:val="2"/>
-        </w:numPr>
-        <w:spacing w:after="60"/>
-      </w:pPr>
-      <w:r>
-        <w:t xml:space="preserve">Backtest (3001 trials) unaffected -- it independently recomputes finalVec from layerVecs rather than re-deriving the dampener logic, so it validates the fix's output rather than assuming it</w:t>
+        <w:spacing w:after="120"/>
+      </w:pPr>
+      <w:r>
+        <w:t xml:space="preserve">Regression suite grew 100 -&gt; 103 (+3): TC57 (rewritten -- its v6.5 assertion that this pair is NOT dampened is now the wrong claim, superseded by the actual v6.7 fix) confirms both-answered scales each vector by CROSS_LAYER_DISCOUNT exactly; TC58/TC59 confirm either member alone is completely unaffected, full weight; TC60 confirms the cross-layer dampener, the v6.6 same-layer dampener, and Tier S's reserved-slice math all compose correctly in a single call, not just in isolation.</w:t>
+      </w:r>
+    </w:p>
+    <w:p>
+      <w:pPr>
+        <w:spacing w:after="120"/>
+      </w:pPr>
+      <w:r>
+        <w:t xml:space="preserve">TC6 (all-max full run) needed updating too, identified rather than blindly re-passed: it previously asserted "weighted avg of identical vectors = same vector exactly", true only because every input really was identical through v6.6. v6.7 breaks that triviality on purpose -- discounting 2 of 48 subs to half magnitude while their layer-mates stay at full magnitude means the all-max input is no longer perfectly uniform. The new expected value is derived from the same constants the engine uses, not a hand-rounded number.</w:t>
+      </w:r>
+    </w:p>
+    <w:p>
+      <w:pPr>
+        <w:spacing w:after="120"/>
+      </w:pPr>
+      <w:r>
+        <w:t xml:space="preserve">compare-golden: 2 of 15 profiles show real, expected movement. all-max-full shifted -0.0456 on every dimension (just under the 0.05 significant-drift threshold -- matches TC6's own derivation exactly). balanced-40pct-anxious-depleted was FLAGGED (ER -0.0902, SR +0.0878, both over threshold) -- expected: this profile answers both stability and emotional_trauma with large-magnitude, non-identical vectors, and only ~19 of 48 subs total, so the discounted pair carries a much larger share of its own layer's average (family: 1 of 4 answered slots; modulator: 1 of roughly 10) than in a fully-answered profile where dozens of other subs dilute the same effect. full-100pct-mixed-realistic's total delta (combining both the v6.6 and v6.7 effects, since it answers every correlated pair) stayed under threshold on every dimension, for the same dilution reason: 100% completeness spreads any single-layer reweighting across all 9 roll-up layers. This is both fixes working as intended, not drift -- compare-golden.js is a report for manual review, not a merge gate.</w:t>
+      </w:r>
+    </w:p>
+    <w:p>
+      <w:pPr>
+        <w:spacing w:after="120"/>
+      </w:pPr>
+      <w:r>
+        <w:t xml:space="preserve">Backtest (3001 trials) unaffected -- it independently recomputes finalVec from layerVecs rather than re-deriving either dampener's logic, so it validates output, not the mechanism, and stays agnostic to how layerVecs was built.</w:t>
       </w:r>
     </w:p>
     <w:p>
@@ -8108,7 +7807,7 @@
         <w:spacing w:after="120"/>
       </w:pPr>
       <w:r>
-        <w:t xml:space="preserve">Version history: v3 baseline 18/18 -&gt; v6.1 74/74 (+24 sub-layers) -&gt; v6.2 85/85 (Tier S) -&gt; v6.3 88/88 (ACE split) -&gt; v6.4 92/92 (learning-case consistency checks) -&gt; v6.5 95/95 (loneliness sub-layer, closing the catalogue audit) -&gt; v6.6 100/100 (correlation dampener for the attachment_style/parenting overlap). Current status: 100/100 checks passing. This suite is a regression/consistency backtest -- it proves the code computes the documented formulas correctly and stays internally consistent as the model evolves. Run it any time with: node tests/test-cases.js. NOTE for future editors: update the count above at every version bump that adds tests, or this line goes stale again -- it has done so three times already (caught and fixed in the v6.5 health-check pass).</w:t>
+        <w:t xml:space="preserve">Version history: v3 baseline 18/18 -&gt; v6.1 74/74 (+24 sub-layers) -&gt; v6.2 85/85 (Tier S) -&gt; v6.3 88/88 (ACE split) -&gt; v6.4 92/92 (learning-case consistency checks) -&gt; v6.5 95/95 (loneliness sub-layer, closing the catalogue audit) -&gt; v6.6 100/100 (correlation dampener for the attachment_style/parenting overlap) -&gt; v6.7 103/103 (cross-layer correlation dampener for emotional_trauma/stability). Current status: 103/103 checks passing. This suite is a regression/consistency backtest -- it proves the code computes the documented formulas correctly and stays internally consistent as the model evolves. Run it any time with: node tests/test-cases.js. NOTE for future editors: update the count above at every version bump that adds tests, or this line goes stale again -- it has done so three times already (caught and fixed in the v6.5 health-check pass).</w:t>
       </w:r>
     </w:p>
     <w:p>
@@ -8220,7 +7919,7 @@
         <w:spacing w:after="60"/>
       </w:pPr>
       <w:r>
-        <w:t xml:space="preserve">Regression backtesting (Section 9.3): validates that the software correctly implements the documented math. This is fully solved -- 100/100 passing as of v6.6, deterministic, re-runnable.</w:t>
+        <w:t xml:space="preserve">Regression backtesting (Section 9.3): validates that the software correctly implements the documented math. This is fully solved -- 103/103 passing as of v6.7, deterministic, re-runnable.</w:t>
       </w:r>
     </w:p>
     <w:p>
@@ -8284,7 +7983,7 @@
         <w:spacing w:after="60"/>
       </w:pPr>
       <w:r>
-        <w:t xml:space="preserve">Two rows (Childhood attachment style, Emotional trauma) knowingly overlap existing sub-layers (Family's 'parenting' and 'stability' respectively) -- included as their own sub-layers per the doc's own recommendation to separate correlated signals, with an explicit double-counting caution in their titles rather than a silent merge.</w:t>
+        <w:t xml:space="preserve">Two rows (Childhood attachment style, Emotional trauma) knowingly overlap existing sub-layers (Family's 'parenting' and 'stability' respectively) -- included as their own sub-layers per the doc's own recommendation to separate correlated signals, with an explicit double-counting caution in their titles rather than a silent merge. Both pairs now have an actual fix, not just a flag: attachment_style/parenting (v6.6, same-layer) and emotional_trauma/stability (v6.7, cross-layer) -- see Section 8e for both mechanisms.</w:t>
       </w:r>
     </w:p>
     <w:p>
@@ -8776,7 +8475,7 @@
         <w:spacing w:after="120"/>
       </w:pPr>
       <w:r>
-        <w:t xml:space="preserve">This architecture operationalizes Layers 1-7 plus the Modulator layer, and now Tier S (Subacute), from the Behavioral Algorithm Framework into a working five-tier pipeline: micro-indicator -&gt; sub-layer -&gt; layer -&gt; [reserved-slice Tier S] -&gt; macro score, with live weight re-normalization on partial input, an exact-value Precision Test Mode, and a passing 100-case automated regression suite (including live checks against production code, not hand-copied fixtures). Seven load-bearing citations were independently fact-checked; six held up, one (Danziger 2011) was downgraded, and a v6.4 audit pass re-verified every ceiling-controlled weight and corrected one stale doc/code mismatch (Domain 5, scarcity). As of v6.1, all 24 previously-unimplemented rows from the Section 3.2b.1 evidence catalogue are live in the engine at their confidence-corrected or tier-mapped weights. As of v6.2, the subacute timing-band gap flagged in Section 3.2b.2 is closed with a genuine fourth tier. As of v6.3, ACE is a dedicated sub-layer rather than folded into 'stability', at its full confirmed-citation weight. As of v6.5, loneliness/social isolation (Cacioppo &amp; Patrick 2008) closes the one clean gap the v6.5 catalogue audit found, at its tier-mapped weight (no confidence-multiplier adjustment applies, same evidence category as cognitive_style). As of v6.6, the attachment_style/parenting double-counting risk is fixed via a same-layer correlation dampener; the cross-layer emotional_trauma/stability risk could not be mechanically fixed the same way and remains documented as open. An external peer-reviewed survey (Essahraui et al. 2025, IEEE Access) independently corroborated BAF's structural taxonomy and privacy posture, and reaffirmed the exclusion of criminal-justice applications, passive biometric data collection, and facial/demographic inference. As of v6.4, a scenario-based consistency-check system exists for comparing engine output against real respondent decisions -- built with several privacy-sensitive elements of its source protocol (named identity, external ratings, passive behavioral telemetry) deliberately declined rather than implemented. The paper's higher-risk domains (physiognomy, criminal-behavior/psychopathy prediction) remain deliberately fenced off from all scoring paths. Companion deliverables: BAF_Simulator_v6.html (48 sub-layers / 96 micro-indicators across 8 layers + Tier S), BAF_Questionnaire.docx (respondent form, auto-regenerable), BAF_Respondent_Tracker.xlsx (multi-respondent gap tracking), core-engine.js + test-cases.js (regression harness, 100/100 passing), scripts/backtest.js (3001-trial fuzz suite), scripts/compare-golden.js (15-profile drift detector), CI (GitHub Actions, runs on every push/PR).</w:t>
+        <w:t xml:space="preserve">This architecture operationalizes Layers 1-7 plus the Modulator layer, and now Tier S (Subacute), from the Behavioral Algorithm Framework into a working five-tier pipeline: micro-indicator -&gt; sub-layer -&gt; layer -&gt; [reserved-slice Tier S] -&gt; macro score, with live weight re-normalization on partial input, an exact-value Precision Test Mode, and a passing 103-case automated regression suite (including live checks against production code, not hand-copied fixtures). Seven load-bearing citations were independently fact-checked; six held up, one (Danziger 2011) was downgraded, and a v6.4 audit pass re-verified every ceiling-controlled weight and corrected one stale doc/code mismatch (Domain 5, scarcity). As of v6.1, all 24 previously-unimplemented rows from the Section 3.2b.1 evidence catalogue are live in the engine at their confidence-corrected or tier-mapped weights. As of v6.2, the subacute timing-band gap flagged in Section 3.2b.2 is closed with a genuine fourth tier. As of v6.3, ACE is a dedicated sub-layer rather than folded into 'stability', at its full confirmed-citation weight. As of v6.5, loneliness/social isolation (Cacioppo &amp; Patrick 2008) closes the one clean gap the v6.5 catalogue audit found, at its tier-mapped weight (no confidence-multiplier adjustment applies, same evidence category as cognitive_style). As of v6.6, the attachment_style/parenting double-counting risk is fixed via a same-layer correlation dampener. As of v6.7, the cross-layer emotional_trauma/stability risk is also fixed, via a structurally different mechanism (per-vector discounting, since no shared layer-average exists to fold a cross-layer pair into) -- both flagged-since-v6.1 overlap risks are now closed. An external peer-reviewed survey (Essahraui et al. 2025, IEEE Access) independently corroborated BAF's structural taxonomy and privacy posture, and reaffirmed the exclusion of criminal-justice applications, passive biometric data collection, and facial/demographic inference. As of v6.4, a scenario-based consistency-check system exists for comparing engine output against real respondent decisions -- built with several privacy-sensitive elements of its source protocol (named identity, external ratings, passive behavioral telemetry) deliberately declined rather than implemented. The paper's higher-risk domains (physiognomy, criminal-behavior/psychopathy prediction) remain deliberately fenced off from all scoring paths. Companion deliverables: BAF_Simulator_v6.html (48 sub-layers / 96 micro-indicators across 8 layers + Tier S), BAF_Questionnaire.docx (respondent form, auto-regenerable), BAF_Respondent_Tracker.xlsx (multi-respondent gap tracking), core-engine.js + test-cases.js (regression harness, 103/103 passing), scripts/backtest.js (3001-trial fuzz suite), scripts/compare-golden.js (15-profile drift detector), CI (GitHub Actions, runs on every push/PR).</w:t>
       </w:r>
     </w:p>
     <w:sectPr>

</xml_diff>

<commit_message>
Sync architecture doc to v6.7 (cross-layer correlation dampener)
</commit_message>
<xml_diff>
--- a/BAF_Technical_Architecture.docx
+++ b/BAF_Technical_Architecture.docx
@@ -2733,7 +2733,7 @@
                 <w:sz w:val="20"/>
                 <w:szCs w:val="20"/>
               </w:rPr>
-              <w:t xml:space="preserve">IMPLEMENTED in v6.1 -- 'emotional_trauma' sub-layer, Modulator layer (triggered tier used). Overlap with Family's 'stability' FIXED in v6.7 -- a cross-layer correlation dampener scales each of the two vectors by CROSS_LAYER_DISCOUNT (0.5) before either enters its own layer's average, when both are answered. See Section 8e.</w:t>
+              <w:t xml:space="preserve">IMPLEMENTED in v6.1 -- 'emotional_trauma' sub-layer, Modulator layer (triggered tier used). Overlap with Family's 'stability' FIXED in v6.7 -- cross-layer correlation dampener (CROSS_LAYER_DISCOUNT = 0.5, an unverified conservative prior, not a fact-checked citation), see Section 8f</w:t>
             </w:r>
           </w:p>
         </w:tc>
@@ -6555,7 +6555,7 @@
         <w:spacing w:after="120" w:before="280"/>
       </w:pPr>
       <w:r>
-        <w:t xml:space="preserve">8e. v6.6-v6.7 Changelog -- Correlation Dampeners for Overlap-Risk Pairs</w:t>
+        <w:t xml:space="preserve">3.2b.7 External Corroboration -- Essahraui et al. 2025 (IEEE Access)</w:t>
       </w:r>
     </w:p>
     <w:p>
@@ -6563,7 +6563,321 @@
         <w:spacing w:after="120"/>
       </w:pPr>
       <w:r>
-        <w:t xml:space="preserve">Two sub-layer pairs were flagged as knowingly overlapping since v6.1: attachment_style/parenting (both Family) and emotional_trauma/stability (Modulator and Family respectively). Both risked double-counting -- if a person answered both members of a pair in a correlated way, their shared dimensions received contribution from both independently, effectively counting that signal twice relative to every other sub-layer, which only ever contributes once. v6.6 fixed the same-layer pair; v6.7 closes the cross-layer pair with a structurally different mechanism.</w:t>
+        <w:t xml:space="preserve">A peer-reviewed field survey was checked against BAF's design after publication: Essahraui, S., Lamaakal, I., Maleh, Y., El Makkaoui, K., Filali Bouami, M., Ouahbi, I., Abd El-Latif, A. A., Almousa, M., &amp; Rodrigues, J. J. P. C. (2025). Human Behavior Analysis: A Comprehensive Survey on Techniques, Applications, Challenges, and Future Directions. IEEE Access, vol. 13. DOI: 10.1109/ACCESS.2025.3589938. This is independent corroboration, not new evidence for any specific weight -- it speaks to whether BAF's structure and guardrails match how the field itself organizes and constrains this work.</w:t>
+      </w:r>
+    </w:p>
+    <w:p>
+      <w:pPr>
+        <w:pStyle w:val="Heading3"/>
+        <w:spacing w:after="120" w:before="280"/>
+      </w:pPr>
+      <w:r>
+        <w:t xml:space="preserve">Structural corroboration</w:t>
+      </w:r>
+    </w:p>
+    <w:p>
+      <w:pPr>
+        <w:spacing w:after="120"/>
+      </w:pPr>
+      <w:r>
+        <w:t xml:space="preserve">The survey defines its field as the study of human actions, reactions, cognitive processes, and emotional states across environments -- the same three-part structure (behavioral patterns, cognitive processes, emotional states) that BAF's layer taxonomy was independently built around. This is agreement on framing, not proof that BAF's specific weights or sub-layers are correct.</w:t>
+      </w:r>
+    </w:p>
+    <w:p>
+      <w:pPr>
+        <w:pStyle w:val="Heading3"/>
+        <w:spacing w:after="120" w:before="280"/>
+      </w:pPr>
+      <w:r>
+        <w:t xml:space="preserve">Privacy posture corroboration</w:t>
+      </w:r>
+    </w:p>
+    <w:p>
+      <w:pPr>
+        <w:spacing w:after="120"/>
+      </w:pPr>
+      <w:r>
+        <w:t xml:space="preserve">The survey's own Section VII-E catalogues privacy-preserving techniques the field considers current best practice. Several of BAF's design decisions, made independently across v6.4's continuous-improvement layer, map directly onto named techniques in that section rather than being ad hoc caution:</w:t>
+      </w:r>
+    </w:p>
+    <w:tbl>
+      <w:tblPr>
+        <w:tblW w:type="dxa" w:w="9600"/>
+        <w:tblBorders>
+          <w:top w:val="single" w:color="auto" w:sz="4"/>
+          <w:left w:val="single" w:color="auto" w:sz="4"/>
+          <w:bottom w:val="single" w:color="auto" w:sz="4"/>
+          <w:right w:val="single" w:color="auto" w:sz="4"/>
+          <w:insideH w:val="single" w:color="auto" w:sz="4"/>
+          <w:insideV w:val="single" w:color="auto" w:sz="4"/>
+        </w:tblBorders>
+      </w:tblPr>
+      <w:tblGrid>
+        <w:gridCol w:w="4800"/>
+        <w:gridCol w:w="4800"/>
+      </w:tblGrid>
+      <w:tr>
+        <w:tc>
+          <w:tcPr>
+            <w:tcW w:type="dxa" w:w="4800"/>
+            <w:shd w:fill="1F4E5F" w:color="1F4E5F" w:val="clear"/>
+          </w:tcPr>
+          <w:p>
+            <w:r>
+              <w:rPr>
+                <w:b/>
+                <w:bCs/>
+                <w:color w:val="FFFFFF"/>
+                <w:sz w:val="20"/>
+                <w:szCs w:val="20"/>
+              </w:rPr>
+              <w:t xml:space="preserve">BAF design decision</w:t>
+            </w:r>
+          </w:p>
+        </w:tc>
+        <w:tc>
+          <w:tcPr>
+            <w:tcW w:type="dxa" w:w="4800"/>
+            <w:shd w:fill="1F4E5F" w:color="1F4E5F" w:val="clear"/>
+          </w:tcPr>
+          <w:p>
+            <w:r>
+              <w:rPr>
+                <w:b/>
+                <w:bCs/>
+                <w:color w:val="FFFFFF"/>
+                <w:sz w:val="20"/>
+                <w:szCs w:val="20"/>
+              </w:rPr>
+              <w:t xml:space="preserve">Matches survey's named technique</w:t>
+            </w:r>
+          </w:p>
+        </w:tc>
+      </w:tr>
+      <w:tr>
+        <w:tc>
+          <w:tcPr>
+            <w:tcW w:type="dxa" w:w="4800"/>
+          </w:tcPr>
+          <w:p>
+            <w:r>
+              <w:rPr>
+                <w:b w:val="false"/>
+                <w:bCs w:val="false"/>
+                <w:color w:val="000000"/>
+                <w:sz w:val="20"/>
+                <w:szCs w:val="20"/>
+              </w:rPr>
+              <w:t xml:space="preserve">Opaque respondent codes only (regex-enforced, no name/location/employer)</w:t>
+            </w:r>
+          </w:p>
+        </w:tc>
+        <w:tc>
+          <w:tcPr>
+            <w:tcW w:type="dxa" w:w="4800"/>
+          </w:tcPr>
+          <w:p>
+            <w:r>
+              <w:rPr>
+                <w:b w:val="false"/>
+                <w:bCs w:val="false"/>
+                <w:color w:val="000000"/>
+                <w:sz w:val="20"/>
+                <w:szCs w:val="20"/>
+              </w:rPr>
+              <w:t xml:space="preserve">Data minimization and purpose limitation (Section VII-E-7)</w:t>
+            </w:r>
+          </w:p>
+        </w:tc>
+      </w:tr>
+      <w:tr>
+        <w:tc>
+          <w:tcPr>
+            <w:tcW w:type="dxa" w:w="4800"/>
+          </w:tcPr>
+          <w:p>
+            <w:r>
+              <w:rPr>
+                <w:b w:val="false"/>
+                <w:bCs w:val="false"/>
+                <w:color w:val="000000"/>
+                <w:sz w:val="20"/>
+                <w:szCs w:val="20"/>
+              </w:rPr>
+              <w:t xml:space="preserve">Explicit consent script read before any data collection</w:t>
+            </w:r>
+          </w:p>
+        </w:tc>
+        <w:tc>
+          <w:tcPr>
+            <w:tcW w:type="dxa" w:w="4800"/>
+          </w:tcPr>
+          <w:p>
+            <w:r>
+              <w:rPr>
+                <w:b w:val="false"/>
+                <w:bCs w:val="false"/>
+                <w:color w:val="000000"/>
+                <w:sz w:val="20"/>
+                <w:szCs w:val="20"/>
+              </w:rPr>
+              <w:t xml:space="preserve">Consent management platforms (Section VII-E-6)</w:t>
+            </w:r>
+          </w:p>
+        </w:tc>
+      </w:tr>
+      <w:tr>
+        <w:tc>
+          <w:tcPr>
+            <w:tcW w:type="dxa" w:w="4800"/>
+          </w:tcPr>
+          <w:p>
+            <w:r>
+              <w:rPr>
+                <w:b w:val="false"/>
+                <w:bCs w:val="false"/>
+                <w:color w:val="000000"/>
+                <w:sz w:val="20"/>
+                <w:szCs w:val="20"/>
+              </w:rPr>
+              <w:t xml:space="preserve">No passive behavioral signal capture (mouse, keystroke, timing)</w:t>
+            </w:r>
+          </w:p>
+        </w:tc>
+        <w:tc>
+          <w:tcPr>
+            <w:tcW w:type="dxa" w:w="4800"/>
+          </w:tcPr>
+          <w:p>
+            <w:r>
+              <w:rPr>
+                <w:b w:val="false"/>
+                <w:bCs w:val="false"/>
+                <w:color w:val="000000"/>
+                <w:sz w:val="20"/>
+                <w:szCs w:val="20"/>
+              </w:rPr>
+              <w:t xml:space="preserve">Directly avoids the re-identification and informed-consent risks the survey attributes to passive/background data collection (Section VI-A-1)</w:t>
+            </w:r>
+          </w:p>
+        </w:tc>
+      </w:tr>
+      <w:tr>
+        <w:tc>
+          <w:tcPr>
+            <w:tcW w:type="dxa" w:w="4800"/>
+          </w:tcPr>
+          <w:p>
+            <w:r>
+              <w:rPr>
+                <w:b w:val="false"/>
+                <w:bCs w:val="false"/>
+                <w:color w:val="000000"/>
+                <w:sz w:val="20"/>
+                <w:szCs w:val="20"/>
+              </w:rPr>
+              <w:t xml:space="preserve">Learning-case layer compares output but cannot alter scores</w:t>
+            </w:r>
+          </w:p>
+        </w:tc>
+        <w:tc>
+          <w:tcPr>
+            <w:tcW w:type="dxa" w:w="4800"/>
+          </w:tcPr>
+          <w:p>
+            <w:r>
+              <w:rPr>
+                <w:b w:val="false"/>
+                <w:bCs w:val="false"/>
+                <w:color w:val="000000"/>
+                <w:sz w:val="20"/>
+                <w:szCs w:val="20"/>
+              </w:rPr>
+              <w:t xml:space="preserve">Consistent with the survey's call for explainable, transparent decision-making processes over opaque prediction (Section VIII conclusion)</w:t>
+            </w:r>
+          </w:p>
+        </w:tc>
+      </w:tr>
+    </w:tbl>
+    <w:p>
+      <w:pPr>
+        <w:pStyle w:val="Heading3"/>
+        <w:spacing w:after="120" w:before="280"/>
+      </w:pPr>
+      <w:r>
+        <w:t xml:space="preserve">Explicit exclusions, reaffirmed rather than reconsidered</w:t>
+      </w:r>
+    </w:p>
+    <w:p>
+      <w:pPr>
+        <w:spacing w:after="120"/>
+      </w:pPr>
+      <w:r>
+        <w:t xml:space="preserve">The survey covers substantially more ground than BAF implements. Most of that additional ground is deliberately not being added, for the same reasons the source research paper's physiognomy and criminal-behavior sections were excluded from every version of this project:</w:t>
+      </w:r>
+    </w:p>
+    <w:p>
+      <w:pPr>
+        <w:pStyle w:val="ListParagraph"/>
+        <w:numPr>
+          <w:ilvl w:val="0"/>
+          <w:numId w:val="2"/>
+        </w:numPr>
+        <w:spacing w:after="60"/>
+      </w:pPr>
+      <w:r>
+        <w:t xml:space="preserve">Criminal justice and public safety applications (survey Section V-E: crime prediction, criminal tracking, predictive policing) -- excluded. This is the same domain the original source paper's psychopathy/criminal-behavior sections were fenced off from at project start; nothing in this survey changes that judgment.</w:t>
+      </w:r>
+    </w:p>
+    <w:p>
+      <w:pPr>
+        <w:pStyle w:val="ListParagraph"/>
+        <w:numPr>
+          <w:ilvl w:val="0"/>
+          <w:numId w:val="2"/>
+        </w:numPr>
+        <w:spacing w:after="60"/>
+      </w:pPr>
+      <w:r>
+        <w:t xml:space="preserve">Passive sensor, wearable, and biometric data collection (survey Sections III-IV, VI-A) -- excluded. Already declined twice in this project's own Human Validation Protocol documents; the survey's Section VI-A independently names the same risks (informed consent difficulty, re-identification via combined modalities, breach exposure) as the reason to decline it.</w:t>
+      </w:r>
+    </w:p>
+    <w:p>
+      <w:pPr>
+        <w:pStyle w:val="ListParagraph"/>
+        <w:numPr>
+          <w:ilvl w:val="0"/>
+          <w:numId w:val="2"/>
+        </w:numPr>
+        <w:spacing w:after="60"/>
+      </w:pPr>
+      <w:r>
+        <w:t xml:space="preserve">Facial recognition, gait analysis, and demographic-based inference -- excluded. The survey's own Section VI-D reports that facial-expression models trained on Western datasets misinterpret emotions from other cultural groups -- an independent finding that argues against adding this capability, not for it.</w:t>
+      </w:r>
+    </w:p>
+    <w:p>
+      <w:pPr>
+        <w:spacing w:after="120"/>
+      </w:pPr>
+      <w:r>
+        <w:t xml:space="preserve">Net effect: this pass strengthens BAF's existing privacy and scope choices with academic citation, and adds no new sub-layers, no new data collection, and no new scoring inputs.</w:t>
+      </w:r>
+    </w:p>
+    <w:p>
+      <w:pPr>
+        <w:pStyle w:val="Heading1"/>
+        <w:spacing w:after="120" w:before="280"/>
+      </w:pPr>
+      <w:r>
+        <w:t xml:space="preserve">8e. v6.6 Changelog -- Correlation Dampener for Overlap-Risk Pairs (Same-Layer)</w:t>
+      </w:r>
+    </w:p>
+    <w:p>
+      <w:pPr>
+        <w:spacing w:after="120"/>
+      </w:pPr>
+      <w:r>
+        <w:t xml:space="preserve">Two sub-layer pairs were flagged as knowingly overlapping since v6.1: attachment_style/parenting and emotional_trauma/stability. Both risked double-counting -- if a person answered both members of a pair in a correlated way, their shared dimensions received contribution from both independently, effectively counting that signal twice relative to every other sub-layer, which only ever contributes once.</w:t>
       </w:r>
     </w:p>
     <w:p>
@@ -6572,7 +6886,7 @@
         <w:spacing w:after="120" w:before="280"/>
       </w:pPr>
       <w:r>
-        <w:t xml:space="preserve">v6.6: same-layer dampener (attachment_style/parenting)</w:t>
+        <w:t xml:space="preserve">What got fixed in v6.6, and why the other pair didn't</w:t>
       </w:r>
     </w:p>
     <w:p>
@@ -6580,7 +6894,7 @@
         <w:spacing w:after="120"/>
       </w:pPr>
       <w:r>
-        <w:t xml:space="preserve">A same-layer averaging fix: when both members of a pair are answered, fold their two vectors into one averaged slot for the layer roll-up (denominator N-1, not N), rather than letting both count at full weight. attachment_style and parenting are both Family-layer sub-layers, so this fix applies directly -- see CORRELATED_PAIRS in core-engine.js.</w:t>
+        <w:t xml:space="preserve">A same-layer averaging fix was designed: when both members of a pair are answered, fold their two vectors into one averaged slot for the layer roll-up (denominator N-1, not N), rather than letting both count at full weight. attachment_style and parenting are both Family-layer sub-layers, so this fix applies directly.</w:t>
       </w:r>
     </w:p>
     <w:p>
@@ -6588,7 +6902,7 @@
         <w:spacing w:after="120"/>
       </w:pPr>
       <w:r>
-        <w:t xml:space="preserve">emotional_trauma and stability are NOT both Family layer -- emotional_trauma is Modulator, stability is Family. This was caught during v6.6's implementation as a scope error in the original request (which had assumed both pairs were same-layer). A cross-layer pair has no shared layer-average step to fold into -- the same-layer fix cannot mechanically apply. v6.6 left this pair as a documented, still-open risk rather than force an incorrect fix onto architecture that doesn't support it.</w:t>
+        <w:t xml:space="preserve">emotional_trauma and stability are NOT both Family layer -- emotional_trauma is Modulator, stability is Family. This was caught during implementation as a scope error in the original request (which had assumed both pairs were same-layer). A cross-layer pair has no shared layer-average step to fold into -- the same-layer fix cannot mechanically apply. This pair was left as a documented, still-open risk in v6.6, closed separately in v6.7 below with a structurally different mechanism.</w:t>
       </w:r>
     </w:p>
     <w:p>
@@ -6597,7 +6911,68 @@
         <w:spacing w:after="120" w:before="280"/>
       </w:pPr>
       <w:r>
-        <w:t xml:space="preserve">v6.7: cross-layer dampener (emotional_trauma/stability)</w:t>
+        <w:t xml:space="preserve">v6.6 Verification</w:t>
+      </w:r>
+    </w:p>
+    <w:p>
+      <w:pPr>
+        <w:pStyle w:val="ListParagraph"/>
+        <w:numPr>
+          <w:ilvl w:val="0"/>
+          <w:numId w:val="2"/>
+        </w:numPr>
+        <w:spacing w:after="60"/>
+      </w:pPr>
+      <w:r>
+        <w:t xml:space="preserve">Regression suite grew 95 -&gt; 100 (+5): TC54 confirms both-answered folds to one averaged slot (tested against both the new dampened value and the old undampened 3-way average, proving the fix changed real behavior); TC55/TC56 confirm either member alone is completely unaffected, full weight; TC57 (later revised in v6.7, see below) originally confirmed the emotional_trauma/stability pair was NOT dampened, documenting the open gap as a test rather than only a comment</w:t>
+      </w:r>
+    </w:p>
+    <w:p>
+      <w:pPr>
+        <w:pStyle w:val="ListParagraph"/>
+        <w:numPr>
+          <w:ilvl w:val="0"/>
+          <w:numId w:val="2"/>
+        </w:numPr>
+        <w:spacing w:after="60"/>
+      </w:pPr>
+      <w:r>
+        <w:t xml:space="preserve">Existing tests were checked by hand for which ones exercised a pair with both members answered and differing values, rather than blindly re-passing after adjusting expectations -- none in test-cases.js did, so no hidden behavior change slipped through unexamined</w:t>
+      </w:r>
+    </w:p>
+    <w:p>
+      <w:pPr>
+        <w:pStyle w:val="ListParagraph"/>
+        <w:numPr>
+          <w:ilvl w:val="0"/>
+          <w:numId w:val="2"/>
+        </w:numPr>
+        <w:spacing w:after="60"/>
+      </w:pPr>
+      <w:r>
+        <w:t xml:space="preserve">compare-golden: 1 of 15 profiles changed (full-100pct-mixed-realistic, which answers both attachment_style and parenting with genuinely different values). Delta was small (RT/SC/ER/AR/DS/SR all under 0.03) because Family is 1 of 9 roll-up layers -- even a real, correct within-layer fix gets diluted at the macro-score level. This is the fix working as intended, not drift</w:t>
+      </w:r>
+    </w:p>
+    <w:p>
+      <w:pPr>
+        <w:pStyle w:val="ListParagraph"/>
+        <w:numPr>
+          <w:ilvl w:val="0"/>
+          <w:numId w:val="2"/>
+        </w:numPr>
+        <w:spacing w:after="60"/>
+      </w:pPr>
+      <w:r>
+        <w:t xml:space="preserve">Backtest (3001 trials) unaffected -- it independently recomputes finalVec from layerVecs rather than re-deriving the dampener logic, so it validates the fix's output rather than assuming it</w:t>
+      </w:r>
+    </w:p>
+    <w:p>
+      <w:pPr>
+        <w:pStyle w:val="Heading1"/>
+        <w:spacing w:after="120" w:before="280"/>
+      </w:pPr>
+      <w:r>
+        <w:t xml:space="preserve">8f. v6.7 Changelog -- Correlation Dampener for Overlap-Risk Pairs (Cross-Layer)</w:t>
       </w:r>
     </w:p>
     <w:p>
@@ -6605,23 +6980,7 @@
         <w:spacing w:after="120"/>
       </w:pPr>
       <w:r>
-        <w:t xml:space="preserve">Closing the pair v6.6 correctly declined to force-fix. Since there is no shared layer-average to fold two cross-layer subs into, the mechanism has to work differently: instead of combining two subs into one shared slot, each member's OWN vector is scaled down by a discount factor BEFORE it enters its own layer's average -- a per-vector operation that needs no shared structure between the two layers at all. See CROSS_LAYER_PAIRS/CROSS_LAYER_DISCOUNT in core-engine.js.</w:t>
-      </w:r>
-    </w:p>
-    <w:p>
-      <w:pPr>
-        <w:spacing w:after="120"/>
-      </w:pPr>
-      <w:r>
-        <w:t xml:space="preserve">CROSS_LAYER_DISCOUNT = 0.5. Reasoning: the v6.6 same-layer fix already tells us what discount a correlated pair member effectively receives when folded -- combining two vectors into one averaged slot means each member's own vector counts at exactly 50% within that slot (a straight 2-way average). Absent an independent citation quantifying exactly how correlated emotional_trauma and stability are (unlike the fact-checked citations in 3.2b.4, which had real effect sizes to ground a specific ceiling number), 0.5 is the neutral, symmetric prior -- no directional reason exists to discount one member more than the other, or by more or less than half. Same pattern this document already uses for SUBACUTE_WEIGHT: a conservative, principled default chosen in the absence of hard data, not an arbitrary number.</w:t>
-      </w:r>
-    </w:p>
-    <w:p>
-      <w:pPr>
-        <w:spacing w:after="120"/>
-      </w:pPr>
-      <w:r>
-        <w:t xml:space="preserve">Architecturally generic, not hardcoded to this one pair: CROSS_LAYER_PAIRS is a list (currently holding one entry) and CROSS_LAYER_DISCOUNT is a single shared constant, so any future cross-layer overlap found by a later audit only needs an entry appended, not a new mechanism.</w:t>
+        <w:t xml:space="preserve">Closes the risk v6.6 correctly left open. emotional_trauma (Modulator) and stability (Family) live in different roll-up layers, so there is no shared layer-average to fold two vectors into the way v6.6 does. The mechanism here is structurally different: instead of merging at the roll-up step, each vector is scaled by a discount factor independently, before it enters its own layer's average. This needs no shared structure between the two layers at all, so it generalizes to any future cross-layer pair (CROSS_LAYER_PAIRS is a list, not a hardcoded single case).</w:t>
       </w:r>
     </w:p>
     <w:p>
@@ -6630,7 +6989,7 @@
         <w:spacing w:after="120" w:before="280"/>
       </w:pPr>
       <w:r>
-        <w:t xml:space="preserve">Verification</w:t>
+        <w:t xml:space="preserve">Discount factor: CROSS_LAYER_DISCOUNT = 0.5 -- honest provenance</w:t>
       </w:r>
     </w:p>
     <w:p>
@@ -6638,7 +6997,7 @@
         <w:spacing w:after="120"/>
       </w:pPr>
       <w:r>
-        <w:t xml:space="preserve">Regression suite grew 100 -&gt; 103 (+3): TC57 (rewritten -- its v6.5 assertion that this pair is NOT dampened is now the wrong claim, superseded by the actual v6.7 fix) confirms both-answered scales each vector by CROSS_LAYER_DISCOUNT exactly; TC58/TC59 confirm either member alone is completely unaffected, full weight; TC60 confirms the cross-layer dampener, the v6.6 same-layer dampener, and Tier S's reserved-slice math all compose correctly in a single call, not just in isolation.</w:t>
+        <w:t xml:space="preserve">This is a separate judgment call from v6.6's fix, not a value mathematically derived from it. The two mechanisms operate differently enough (slot-merging with a shrinking denominator, vs. a direct per-vector scalar) that describing 0.5 here as 'grounded in' v6.6 would overstate the connection between them -- they happen to both land near one-half because that is a natural neutral choice for a discount in either case, not because one implies the other.</w:t>
       </w:r>
     </w:p>
     <w:p>
@@ -6646,23 +7005,68 @@
         <w:spacing w:after="120"/>
       </w:pPr>
       <w:r>
-        <w:t xml:space="preserve">TC6 (all-max full run) needed updating too, identified rather than blindly re-passed: it previously asserted "weighted avg of identical vectors = same vector exactly", true only because every input really was identical through v6.6. v6.7 breaks that triviality on purpose -- discounting 2 of 48 subs to half magnitude while their layer-mates stay at full magnitude means the all-max input is no longer perfectly uniform. The new expected value is derived from the same constants the engine uses, not a hand-rounded number.</w:t>
-      </w:r>
-    </w:p>
-    <w:p>
-      <w:pPr>
-        <w:spacing w:after="120"/>
-      </w:pPr>
-      <w:r>
-        <w:t xml:space="preserve">compare-golden: 2 of 15 profiles show real, expected movement. all-max-full shifted -0.0456 on every dimension (just under the 0.05 significant-drift threshold -- matches TC6's own derivation exactly). balanced-40pct-anxious-depleted was FLAGGED (ER -0.0902, SR +0.0878, both over threshold) -- expected: this profile answers both stability and emotional_trauma with large-magnitude, non-identical vectors, and only ~19 of 48 subs total, so the discounted pair carries a much larger share of its own layer's average (family: 1 of 4 answered slots; modulator: 1 of roughly 10) than in a fully-answered profile where dozens of other subs dilute the same effect. full-100pct-mixed-realistic's total delta (combining both the v6.6 and v6.7 effects, since it answers every correlated pair) stayed under threshold on every dimension, for the same dilution reason: 100% completeness spreads any single-layer reweighting across all 9 roll-up layers. This is both fixes working as intended, not drift -- compare-golden.js is a report for manual review, not a merge gate.</w:t>
-      </w:r>
-    </w:p>
-    <w:p>
-      <w:pPr>
-        <w:spacing w:after="120"/>
-      </w:pPr>
-      <w:r>
-        <w:t xml:space="preserve">Backtest (3001 trials) unaffected -- it independently recomputes finalVec from layerVecs rather than re-deriving either dampener's logic, so it validates output, not the mechanism, and stays agnostic to how layerVecs was built.</w:t>
+        <w:t xml:space="preserve">The actual reasoning: no discount (1.0) would ignore the known correlation entirely, repeating the original double-counting risk. Full discount (0.0) would treat the second answer as pure noise, which is too strong an assumption with no evidence behind it. There is no independent citation quantifying the actual correlation strength between emotional_trauma and stability the way Section 3.2b.4's fact-checked effect sizes exist for other weights -- unlike those citations, this number is not verified against external literature. 0.5 is the simplest symmetric prior between the two extremes: a conservative default in the same spirit as SUBACUTE_WEIGHT, not an empirically measured quantity. If a future citation is found quantifying this specific correlation, this constant should be revisited against it, the same way the Section 3.2b.4 fact-check pass revised earlier weights.</w:t>
+      </w:r>
+    </w:p>
+    <w:p>
+      <w:pPr>
+        <w:pStyle w:val="Heading2"/>
+        <w:spacing w:after="120" w:before="280"/>
+      </w:pPr>
+      <w:r>
+        <w:t xml:space="preserve">v6.7 Verification</w:t>
+      </w:r>
+    </w:p>
+    <w:p>
+      <w:pPr>
+        <w:pStyle w:val="ListParagraph"/>
+        <w:numPr>
+          <w:ilvl w:val="0"/>
+          <w:numId w:val="2"/>
+        </w:numPr>
+        <w:spacing w:after="60"/>
+      </w:pPr>
+      <w:r>
+        <w:t xml:space="preserve">Regression suite grew 100 -&gt; 103 (+3): TC57 rewritten (both answered -&gt; each vector scaled by exactly 0.5, not the v6.6-era 'unaffected' claim); TC58/TC59 confirm either member alone stays at full weight, zero discount; TC60 confirms the same-layer dampener, cross-layer dampener, and Tier S reserved-slice math all compose correctly in a single combined call</w:t>
+      </w:r>
+    </w:p>
+    <w:p>
+      <w:pPr>
+        <w:pStyle w:val="ListParagraph"/>
+        <w:numPr>
+          <w:ilvl w:val="0"/>
+          <w:numId w:val="2"/>
+        </w:numPr>
+        <w:spacing w:after="60"/>
+      </w:pPr>
+      <w:r>
+        <w:t xml:space="preserve">TC6 (all-max full run) broke and was rewritten, not patched around: discounting 2 of 48 sub-layers to half-magnitude while their layer-mates stay full-magnitude destroys the 'everything identical' triviality the original test relied on. The new expected value is derived from the actual engine constants at test-write time, not hand-rounded</w:t>
+      </w:r>
+    </w:p>
+    <w:p>
+      <w:pPr>
+        <w:pStyle w:val="ListParagraph"/>
+        <w:numPr>
+          <w:ilvl w:val="0"/>
+          <w:numId w:val="2"/>
+        </w:numPr>
+        <w:spacing w:after="60"/>
+      </w:pPr>
+      <w:r>
+        <w:t xml:space="preserve">compare-golden: 1 of 15 flagged (balanced-40pct-anxious-depleted, ER -0.09/SR +0.09) plus 1 under-threshold (all-max-full, matches TC6 exactly). The flagged profile's larger delta versus other partial-completion profiles is explained mechanistically: with only ~19/48 sub-layers answered, the discounted pair carries a much larger share of its own layer's average (Family: 1-of-4 slots; Modulator: ~1-of-10 slots) than it would in a fully diluted 100%-complete profile -- consistent with the same dilution logic used to explain v6.6's golden-profile impact</w:t>
+      </w:r>
+    </w:p>
+    <w:p>
+      <w:pPr>
+        <w:pStyle w:val="ListParagraph"/>
+        <w:numPr>
+          <w:ilvl w:val="0"/>
+          <w:numId w:val="2"/>
+        </w:numPr>
+        <w:spacing w:after="60"/>
+      </w:pPr>
+      <w:r>
+        <w:t xml:space="preserve">Backtest (3001 trials) still 3001/3001 -- unaffected by either dampener's addition, same independent-recomputation logic as v6.6</w:t>
       </w:r>
     </w:p>
     <w:p>
@@ -7807,7 +8211,7 @@
         <w:spacing w:after="120"/>
       </w:pPr>
       <w:r>
-        <w:t xml:space="preserve">Version history: v3 baseline 18/18 -&gt; v6.1 74/74 (+24 sub-layers) -&gt; v6.2 85/85 (Tier S) -&gt; v6.3 88/88 (ACE split) -&gt; v6.4 92/92 (learning-case consistency checks) -&gt; v6.5 95/95 (loneliness sub-layer, closing the catalogue audit) -&gt; v6.6 100/100 (correlation dampener for the attachment_style/parenting overlap) -&gt; v6.7 103/103 (cross-layer correlation dampener for emotional_trauma/stability). Current status: 103/103 checks passing. This suite is a regression/consistency backtest -- it proves the code computes the documented formulas correctly and stays internally consistent as the model evolves. Run it any time with: node tests/test-cases.js. NOTE for future editors: update the count above at every version bump that adds tests, or this line goes stale again -- it has done so three times already (caught and fixed in the v6.5 health-check pass).</w:t>
+        <w:t xml:space="preserve">Version history: v3 baseline 18/18 -&gt; v6.1 74/74 (+24 sub-layers) -&gt; v6.2 85/85 (Tier S) -&gt; v6.3 88/88 (ACE split) -&gt; v6.4 92/92 (learning-case consistency checks) -&gt; v6.5 95/95 (loneliness sub-layer, closing the catalogue audit) -&gt; v6.6 100/100 (same-layer correlation dampener, attachment_style/parenting) -&gt; v6.7 103/103 (cross-layer correlation dampener, emotional_trauma/stability). Current status: 103/103 checks passing. This suite is a regression/consistency backtest -- it proves the code computes the documented formulas correctly and stays internally consistent as the model evolves. Run it any time with: node tests/test-cases.js. NOTE for future editors: update the count above at every version bump that adds tests, or this line goes stale again -- it has done so three times already (caught and fixed in the v6.5 health-check pass).</w:t>
       </w:r>
     </w:p>
     <w:p>
@@ -7983,7 +8387,7 @@
         <w:spacing w:after="60"/>
       </w:pPr>
       <w:r>
-        <w:t xml:space="preserve">Two rows (Childhood attachment style, Emotional trauma) knowingly overlap existing sub-layers (Family's 'parenting' and 'stability' respectively) -- included as their own sub-layers per the doc's own recommendation to separate correlated signals, with an explicit double-counting caution in their titles rather than a silent merge. Both pairs now have an actual fix, not just a flag: attachment_style/parenting (v6.6, same-layer) and emotional_trauma/stability (v6.7, cross-layer) -- see Section 8e for both mechanisms.</w:t>
+        <w:t xml:space="preserve">Two rows (Childhood attachment style, Emotional trauma) knowingly overlap existing sub-layers (Family's 'parenting' and 'stability' respectively) -- included as their own sub-layers per the doc's own recommendation to separate correlated signals, with an explicit double-counting caution in their titles rather than a silent merge.</w:t>
       </w:r>
     </w:p>
     <w:p>
@@ -8475,7 +8879,7 @@
         <w:spacing w:after="120"/>
       </w:pPr>
       <w:r>
-        <w:t xml:space="preserve">This architecture operationalizes Layers 1-7 plus the Modulator layer, and now Tier S (Subacute), from the Behavioral Algorithm Framework into a working five-tier pipeline: micro-indicator -&gt; sub-layer -&gt; layer -&gt; [reserved-slice Tier S] -&gt; macro score, with live weight re-normalization on partial input, an exact-value Precision Test Mode, and a passing 103-case automated regression suite (including live checks against production code, not hand-copied fixtures). Seven load-bearing citations were independently fact-checked; six held up, one (Danziger 2011) was downgraded, and a v6.4 audit pass re-verified every ceiling-controlled weight and corrected one stale doc/code mismatch (Domain 5, scarcity). As of v6.1, all 24 previously-unimplemented rows from the Section 3.2b.1 evidence catalogue are live in the engine at their confidence-corrected or tier-mapped weights. As of v6.2, the subacute timing-band gap flagged in Section 3.2b.2 is closed with a genuine fourth tier. As of v6.3, ACE is a dedicated sub-layer rather than folded into 'stability', at its full confirmed-citation weight. As of v6.5, loneliness/social isolation (Cacioppo &amp; Patrick 2008) closes the one clean gap the v6.5 catalogue audit found, at its tier-mapped weight (no confidence-multiplier adjustment applies, same evidence category as cognitive_style). As of v6.6, the attachment_style/parenting double-counting risk is fixed via a same-layer correlation dampener. As of v6.7, the cross-layer emotional_trauma/stability risk is also fixed, via a structurally different mechanism (per-vector discounting, since no shared layer-average exists to fold a cross-layer pair into) -- both flagged-since-v6.1 overlap risks are now closed. An external peer-reviewed survey (Essahraui et al. 2025, IEEE Access) independently corroborated BAF's structural taxonomy and privacy posture, and reaffirmed the exclusion of criminal-justice applications, passive biometric data collection, and facial/demographic inference. As of v6.4, a scenario-based consistency-check system exists for comparing engine output against real respondent decisions -- built with several privacy-sensitive elements of its source protocol (named identity, external ratings, passive behavioral telemetry) deliberately declined rather than implemented. The paper's higher-risk domains (physiognomy, criminal-behavior/psychopathy prediction) remain deliberately fenced off from all scoring paths. Companion deliverables: BAF_Simulator_v6.html (48 sub-layers / 96 micro-indicators across 8 layers + Tier S), BAF_Questionnaire.docx (respondent form, auto-regenerable), BAF_Respondent_Tracker.xlsx (multi-respondent gap tracking), core-engine.js + test-cases.js (regression harness, 103/103 passing), scripts/backtest.js (3001-trial fuzz suite), scripts/compare-golden.js (15-profile drift detector), CI (GitHub Actions, runs on every push/PR).</w:t>
+        <w:t xml:space="preserve">This architecture operationalizes Layers 1-7 plus the Modulator layer, and now Tier S (Subacute), from the Behavioral Algorithm Framework into a working five-tier pipeline: micro-indicator -&gt; sub-layer -&gt; layer -&gt; [reserved-slice Tier S] -&gt; macro score, with live weight re-normalization on partial input, an exact-value Precision Test Mode, and a passing 103-case automated regression suite (including live checks against production code, not hand-copied fixtures). Seven load-bearing citations were independently fact-checked; six held up, one (Danziger 2011) was downgraded, and a v6.4 audit pass re-verified every ceiling-controlled weight and corrected one stale doc/code mismatch (Domain 5, scarcity). As of v6.1, all 24 previously-unimplemented rows from the Section 3.2b.1 evidence catalogue are live in the engine at their confidence-corrected or tier-mapped weights. As of v6.2, the subacute timing-band gap flagged in Section 3.2b.2 is closed with a genuine fourth tier. As of v6.3, ACE is a dedicated sub-layer rather than folded into 'stability', at its full confirmed-citation weight. As of v6.5, loneliness/social isolation (Cacioppo &amp; Patrick 2008) closes the one clean gap the v6.5 catalogue audit found, at its tier-mapped weight (no confidence-multiplier adjustment applies, same evidence category as cognitive_style). As of v6.6, the attachment_style/parenting double-counting risk is fixed via a same-layer correlation dampener. As of v6.7, the cross-layer emotional_trauma/stability risk is also closed, via a structurally different mechanism (a per-vector discount factor, CROSS_LAYER_DISCOUNT = 0.5, honestly documented as an unverified conservative prior rather than a fact-checked value). An external peer-reviewed survey (Essahraui et al. 2025, IEEE Access) independently corroborated BAF's structural taxonomy and privacy posture, and reaffirmed the exclusion of criminal-justice applications, passive biometric data collection, and facial/demographic inference. As of v6.4, a scenario-based consistency-check system exists for comparing engine output against real respondent decisions -- built with several privacy-sensitive elements of its source protocol (named identity, external ratings, passive behavioral telemetry) deliberately declined rather than implemented. The paper's higher-risk domains (physiognomy, criminal-behavior/psychopathy prediction) remain deliberately fenced off from all scoring paths. Companion deliverables: BAF_Simulator_v6.html (48 sub-layers / 96 micro-indicators across 8 layers + Tier S), BAF_Questionnaire.docx (respondent form, auto-regenerable), BAF_Respondent_Tracker.xlsx (multi-respondent gap tracking), core-engine.js + test-cases.js (regression harness, 103/103 passing), scripts/backtest.js (3001-trial fuzz suite), scripts/compare-golden.js (15-profile drift detector), CI (GitHub Actions, runs on every push/PR).</w:t>
       </w:r>
     </w:p>
     <w:sectPr>

</xml_diff>

<commit_message>
Document real-world data status in Section 9.4: 4 lost pre-fix submissions excluded, 2 verified real submissions (R-ZE0C0M, R-ZOI6F5) going forward
</commit_message>
<xml_diff>
--- a/BAF_Technical_Architecture.docx
+++ b/BAF_Technical_Architecture.docx
@@ -8294,6 +8294,14 @@
       </w:pPr>
       <w:r>
         <w:t xml:space="preserve">5. Aggregate, cross-respondent gaps on the same dimension flag a mis-weighted layer or poorly worded item for revision</w:t>
+      </w:r>
+    </w:p>
+    <w:p>
+      <w:pPr>
+        <w:spacing w:after="120"/>
+      </w:pPr>
+      <w:r>
+        <w:t xml:space="preserve">Real-world data status: 4 real human submissions were received via the clickable form (docs/index.html) before a Netlify Forms schema bug (missing hidden inputs matching the form's actual AJAX payload -- respondent_code, date, baseline_json, answers_json) was found and fixed. Their metadata (IP, user-agent, submission timestamp) survived in Netlify's Forms records, but their actual answer data was never captured due to the bug, and is unrecoverable. These 4 are excluded from any analysis. Re-collection from these specific respondents was not pursued. Two complete, verified real submissions exist going forward -- R-ZE0C0M and R-ZOI6F5 -- both scored via scripts/score-respondent.js and independently cross-checked against Guided Mode in the live tool.</w:t>
       </w:r>
     </w:p>
     <w:p>

</xml_diff>

<commit_message>
RT diagnostic: fix time_pressure non-monotonic RT sign error, verify against 5/6 respondents (negligible shift), document finding in Section 9.4 with n=10 decision point
Co-Authored-By: Claude Sonnet 5 <noreply@anthropic.com>
</commit_message>
<xml_diff>
--- a/BAF_Technical_Architecture.docx
+++ b/BAF_Technical_Architecture.docx
@@ -1,5 +1,52 @@
 
-<file path=word/document.xml><?xml version="1.0" encoding="utf-8"?>
+<file path=/[Content_Types].xml><?xml version="1.0" encoding="utf-8"?>
+<Types xmlns="http://schemas.openxmlformats.org/package/2006/content-types">
+  <Default ContentType="image/png" Extension="png"/>
+  <Default ContentType="image/jpeg" Extension="jpeg"/>
+  <Default ContentType="image/jpeg" Extension="jpg"/>
+  <Default ContentType="image/bmp" Extension="bmp"/>
+  <Default ContentType="image/gif" Extension="gif"/>
+  <Default ContentType="image/svg+xml" Extension="svg"/>
+  <Default ContentType="application/vnd.openxmlformats-package.relationships+xml" Extension="rels"/>
+  <Default ContentType="application/xml" Extension="xml"/>
+  <Default ContentType="application/vnd.openxmlformats-officedocument.obfuscatedFont" Extension="odttf"/>
+  <Override ContentType="application/vnd.openxmlformats-officedocument.wordprocessingml.document.main+xml" PartName="/word/document.xml"/>
+  <Override ContentType="application/vnd.openxmlformats-officedocument.wordprocessingml.styles+xml" PartName="/word/styles.xml"/>
+  <Override ContentType="application/vnd.openxmlformats-package.core-properties+xml" PartName="/docProps/core.xml"/>
+  <Override ContentType="application/vnd.openxmlformats-officedocument.custom-properties+xml" PartName="/docProps/custom.xml"/>
+  <Override ContentType="application/vnd.openxmlformats-officedocument.extended-properties+xml" PartName="/docProps/app.xml"/>
+  <Override ContentType="application/vnd.openxmlformats-officedocument.wordprocessingml.numbering+xml" PartName="/word/numbering.xml"/>
+  <Override ContentType="application/vnd.openxmlformats-officedocument.wordprocessingml.footnotes+xml" PartName="/word/footnotes.xml"/>
+  <Override ContentType="application/vnd.openxmlformats-officedocument.wordprocessingml.endnotes+xml" PartName="/word/endnotes.xml"/>
+  <Override ContentType="application/vnd.openxmlformats-officedocument.wordprocessingml.settings+xml" PartName="/word/settings.xml"/>
+  <Override ContentType="application/vnd.openxmlformats-officedocument.wordprocessingml.comments+xml" PartName="/word/comments.xml"/>
+  <Override ContentType="application/vnd.openxmlformats-officedocument.wordprocessingml.fontTable+xml" PartName="/word/fontTable.xml"/>
+</Types>
+</file>
+
+<file path=/docProps/app.xml><?xml version="1.0" encoding="utf-8"?>
+<Properties xmlns="http://schemas.openxmlformats.org/officeDocument/2006/extended-properties" xmlns:vt="http://schemas.openxmlformats.org/officeDocument/2006/docPropsVTypes"/>
+</file>
+
+<file path=/docProps/core.xml><?xml version="1.0" encoding="utf-8"?>
+<cp:coreProperties xmlns:cp="http://schemas.openxmlformats.org/package/2006/metadata/core-properties" xmlns:dc="http://purl.org/dc/elements/1.1/" xmlns:dcterms="http://purl.org/dc/terms/" xmlns:dcmitype="http://purl.org/dc/dcmitype/" xmlns:xsi="http://www.w3.org/2001/XMLSchema-instance">
+  <dc:creator>Un-named</dc:creator>
+  <cp:lastModifiedBy>Un-named</cp:lastModifiedBy>
+  <cp:revision>1</cp:revision>
+  <dcterms:created xsi:type="dcterms:W3CDTF">2026-07-13T13:47:14.801Z</dcterms:created>
+  <dcterms:modified xsi:type="dcterms:W3CDTF">2026-07-13T13:47:14.818Z</dcterms:modified>
+</cp:coreProperties>
+</file>
+
+<file path=/docProps/custom.xml><?xml version="1.0" encoding="utf-8"?>
+<Properties xmlns="http://schemas.openxmlformats.org/officeDocument/2006/custom-properties" xmlns:vt="http://schemas.openxmlformats.org/officeDocument/2006/docPropsVTypes"/>
+</file>
+
+<file path=/word/comments.xml><?xml version="1.0" encoding="utf-8"?>
+<w:comments xmlns:cx="http://schemas.microsoft.com/office/drawing/2014/chartex" xmlns:cx1="http://schemas.microsoft.com/office/drawing/2015/9/8/chartex" xmlns:cx2="http://schemas.microsoft.com/office/drawing/2015/10/21/chartex" xmlns:cx3="http://schemas.microsoft.com/office/drawing/2016/5/9/chartex" xmlns:cx4="http://schemas.microsoft.com/office/drawing/2016/5/10/chartex" xmlns:cx5="http://schemas.microsoft.com/office/drawing/2016/5/11/chartex" xmlns:cx6="http://schemas.microsoft.com/office/drawing/2016/5/12/chartex" xmlns:cx7="http://schemas.microsoft.com/office/drawing/2016/5/13/chartex" xmlns:cx8="http://schemas.microsoft.com/office/drawing/2016/5/14/chartex" xmlns:mc="http://schemas.openxmlformats.org/markup-compatibility/2006" xmlns:aink="http://schemas.microsoft.com/office/drawing/2016/ink" xmlns:am3d="http://schemas.microsoft.com/office/drawing/2017/model3d" xmlns:o="urn:schemas-microsoft-com:office:office" xmlns:r="http://schemas.openxmlformats.org/officeDocument/2006/relationships" xmlns:m="http://schemas.openxmlformats.org/officeDocument/2006/math" xmlns:v="urn:schemas-microsoft-com:vml" xmlns:wp14="http://schemas.microsoft.com/office/word/2010/wordprocessingDrawing" xmlns:wp="http://schemas.openxmlformats.org/drawingml/2006/wordprocessingDrawing" xmlns:w10="urn:schemas-microsoft-com:office:word" xmlns:w="http://schemas.openxmlformats.org/wordprocessingml/2006/main" xmlns:w14="http://schemas.microsoft.com/office/word/2010/wordml" xmlns:w15="http://schemas.microsoft.com/office/word/2012/wordml" xmlns:w16cex="http://schemas.microsoft.com/office/word/2018/wordml/cex" xmlns:w16cid="http://schemas.microsoft.com/office/word/2016/wordml/cid" xmlns:w16="http://schemas.microsoft.com/office/word/2018/wordml" xmlns:w16sdtdh="http://schemas.microsoft.com/office/word/2020/wordml/sdtdatahash" xmlns:w16se="http://schemas.microsoft.com/office/word/2015/wordml/symex" xmlns:wpg="http://schemas.microsoft.com/office/word/2010/wordprocessingGroup" xmlns:wpi="http://schemas.microsoft.com/office/word/2010/wordprocessingInk" xmlns:wne="http://schemas.microsoft.com/office/word/2006/wordml" xmlns:wps="http://schemas.microsoft.com/office/word/2010/wordprocessingShape"/>
+</file>
+
+<file path=/word/document.xml><?xml version="1.0" encoding="utf-8"?>
 <w:document xmlns:wpc="http://schemas.microsoft.com/office/word/2010/wordprocessingCanvas" xmlns:mc="http://schemas.openxmlformats.org/markup-compatibility/2006" xmlns:o="urn:schemas-microsoft-com:office:office" xmlns:r="http://schemas.openxmlformats.org/officeDocument/2006/relationships" xmlns:m="http://schemas.openxmlformats.org/officeDocument/2006/math" xmlns:v="urn:schemas-microsoft-com:vml" xmlns:wp14="http://schemas.microsoft.com/office/word/2010/wordprocessingDrawing" xmlns:wp="http://schemas.openxmlformats.org/drawingml/2006/wordprocessingDrawing" xmlns:w10="urn:schemas-microsoft-com:office:word" xmlns:w="http://schemas.openxmlformats.org/wordprocessingml/2006/main" xmlns:w14="http://schemas.microsoft.com/office/word/2010/wordml" xmlns:w15="http://schemas.microsoft.com/office/word/2012/wordml" xmlns:wpg="http://schemas.microsoft.com/office/word/2010/wordprocessingGroup" xmlns:wpi="http://schemas.microsoft.com/office/word/2010/wordprocessingInk" xmlns:wne="http://schemas.microsoft.com/office/word/2006/wordml" xmlns:wps="http://schemas.microsoft.com/office/word/2010/wordprocessingShape" xmlns:cx="http://schemas.microsoft.com/office/drawing/2014/chartex" xmlns:cx1="http://schemas.microsoft.com/office/drawing/2015/9/8/chartex" xmlns:cx2="http://schemas.microsoft.com/office/drawing/2015/10/21/chartex" xmlns:cx3="http://schemas.microsoft.com/office/drawing/2016/5/9/chartex" xmlns:cx4="http://schemas.microsoft.com/office/drawing/2016/5/10/chartex" xmlns:cx5="http://schemas.microsoft.com/office/drawing/2016/5/11/chartex" xmlns:cx6="http://schemas.microsoft.com/office/drawing/2016/5/12/chartex" xmlns:cx7="http://schemas.microsoft.com/office/drawing/2016/5/13/chartex" xmlns:cx8="http://schemas.microsoft.com/office/drawing/2016/5/14/chartex" xmlns:aink="http://schemas.microsoft.com/office/drawing/2016/ink" xmlns:am3d="http://schemas.microsoft.com/office/drawing/2017/model3d" xmlns:w16cex="http://schemas.microsoft.com/office/word/2018/wordml/cex" xmlns:w16cid="http://schemas.microsoft.com/office/word/2016/wordml/cid" xmlns:w16="http://schemas.microsoft.com/office/word/2018/wordml" xmlns:w16sdtdh="http://schemas.microsoft.com/office/word/2020/wordml/sdtdatahash" xmlns:w16se="http://schemas.microsoft.com/office/word/2015/wordml/symex" mc:Ignorable="w14 w15 wp14">
   <w:body>
     <w:p>
@@ -8306,6 +8353,14 @@
     </w:p>
     <w:p>
       <w:pPr>
+        <w:spacing w:after="120"/>
+      </w:pPr>
+      <w:r>
+        <w:t xml:space="preserve">time_pressure fix verification (July 2026): the non-monotonic RT sign error in time_pressure's 'rarely rushed' option (was RT:+0.3, corrected to RT:-0.3) was checked against 5 of these 6 respondents' actual picks -- R-ZE0C0M's raw submission was not retrievable from Netlify's form history at verification time (only 5 of 9 stored submissions carry an identifiable respondent_code) and is excluded from this check, the same unrecoverable-data caveat as the 4 pre-fix submissions above. Of the 5 checked, only R-4AIAO5 had actually picked the corrected option; the fix produced negligible RT score change across the board (largest shift: -0.013 on the -2..2 scale, for that one respondent). The RT gap at n=6 (mean|gap| 1.74, 3/6 opposite-direction, see Aggregate Summary in BAF_Respondent_Tracker.xlsx) is not explained by this single sub-layer fix. The problem is either a broader structural issue with RT's proxy assumptions (current_stability, formative_scarcity, and time_pressure all encode financial stability as risk-tolerance evidence, a contested direction -- see scripts/scenario-bank.js's own framing) or small-sample noise at n=6 -- indistinguishable at current n. Next decision point: n=10. If the pattern holds at n=10, investigate RT's sub-layer directions further. If it dilutes, treat as noise.</w:t>
+      </w:r>
+    </w:p>
+    <w:p>
+      <w:pPr>
         <w:pStyle w:val="Heading2"/>
         <w:spacing w:after="120" w:before="280"/>
       </w:pPr>
@@ -8900,11 +8955,7 @@
 </w:document>
 </file>
 
-<file path=word/comments.xml><?xml version="1.0" encoding="utf-8"?>
-<w:comments xmlns:cx="http://schemas.microsoft.com/office/drawing/2014/chartex" xmlns:cx1="http://schemas.microsoft.com/office/drawing/2015/9/8/chartex" xmlns:cx2="http://schemas.microsoft.com/office/drawing/2015/10/21/chartex" xmlns:cx3="http://schemas.microsoft.com/office/drawing/2016/5/9/chartex" xmlns:cx4="http://schemas.microsoft.com/office/drawing/2016/5/10/chartex" xmlns:cx5="http://schemas.microsoft.com/office/drawing/2016/5/11/chartex" xmlns:cx6="http://schemas.microsoft.com/office/drawing/2016/5/12/chartex" xmlns:cx7="http://schemas.microsoft.com/office/drawing/2016/5/13/chartex" xmlns:cx8="http://schemas.microsoft.com/office/drawing/2016/5/14/chartex" xmlns:mc="http://schemas.openxmlformats.org/markup-compatibility/2006" xmlns:aink="http://schemas.microsoft.com/office/drawing/2016/ink" xmlns:am3d="http://schemas.microsoft.com/office/drawing/2017/model3d" xmlns:o="urn:schemas-microsoft-com:office:office" xmlns:r="http://schemas.openxmlformats.org/officeDocument/2006/relationships" xmlns:m="http://schemas.openxmlformats.org/officeDocument/2006/math" xmlns:v="urn:schemas-microsoft-com:vml" xmlns:wp14="http://schemas.microsoft.com/office/word/2010/wordprocessingDrawing" xmlns:wp="http://schemas.openxmlformats.org/drawingml/2006/wordprocessingDrawing" xmlns:w10="urn:schemas-microsoft-com:office:word" xmlns:w="http://schemas.openxmlformats.org/wordprocessingml/2006/main" xmlns:w14="http://schemas.microsoft.com/office/word/2010/wordml" xmlns:w15="http://schemas.microsoft.com/office/word/2012/wordml" xmlns:w16cex="http://schemas.microsoft.com/office/word/2018/wordml/cex" xmlns:w16cid="http://schemas.microsoft.com/office/word/2016/wordml/cid" xmlns:w16="http://schemas.microsoft.com/office/word/2018/wordml" xmlns:w16sdtdh="http://schemas.microsoft.com/office/word/2020/wordml/sdtdatahash" xmlns:w16se="http://schemas.microsoft.com/office/word/2015/wordml/symex" xmlns:wpg="http://schemas.microsoft.com/office/word/2010/wordprocessingGroup" xmlns:wpi="http://schemas.microsoft.com/office/word/2010/wordprocessingInk" xmlns:wne="http://schemas.microsoft.com/office/word/2006/wordml" xmlns:wps="http://schemas.microsoft.com/office/word/2010/wordprocessingShape"/>
-</file>
-
-<file path=word/endnotes.xml><?xml version="1.0" encoding="utf-8"?>
+<file path=/word/endnotes.xml><?xml version="1.0" encoding="utf-8"?>
 <w:endnotes xmlns:wpc="http://schemas.microsoft.com/office/word/2010/wordprocessingCanvas" xmlns:mc="http://schemas.openxmlformats.org/markup-compatibility/2006" xmlns:o="urn:schemas-microsoft-com:office:office" xmlns:r="http://schemas.openxmlformats.org/officeDocument/2006/relationships" xmlns:m="http://schemas.openxmlformats.org/officeDocument/2006/math" xmlns:v="urn:schemas-microsoft-com:vml" xmlns:wp14="http://schemas.microsoft.com/office/word/2010/wordprocessingDrawing" xmlns:wp="http://schemas.openxmlformats.org/drawingml/2006/wordprocessingDrawing" xmlns:w10="urn:schemas-microsoft-com:office:word" xmlns:w="http://schemas.openxmlformats.org/wordprocessingml/2006/main" xmlns:w14="http://schemas.microsoft.com/office/word/2010/wordml" xmlns:w15="http://schemas.microsoft.com/office/word/2012/wordml" xmlns:wpg="http://schemas.microsoft.com/office/word/2010/wordprocessingGroup" xmlns:wpi="http://schemas.microsoft.com/office/word/2010/wordprocessingInk" xmlns:wne="http://schemas.microsoft.com/office/word/2006/wordml" xmlns:wps="http://schemas.microsoft.com/office/word/2010/wordprocessingShape" mc:Ignorable="w14 w15 wp14">
   <w:endnote w:type="separator" w:id="-1">
     <w:p>
@@ -8941,7 +8992,11 @@
 </w:endnotes>
 </file>
 
-<file path=word/footnotes.xml><?xml version="1.0" encoding="utf-8"?>
+<file path=/word/fontTable.xml><?xml version="1.0" encoding="utf-8"?>
+<w:fonts xmlns:mc="http://schemas.openxmlformats.org/markup-compatibility/2006" xmlns:r="http://schemas.openxmlformats.org/officeDocument/2006/relationships" xmlns:w="http://schemas.openxmlformats.org/wordprocessingml/2006/main" xmlns:w14="http://schemas.microsoft.com/office/word/2010/wordml" xmlns:w15="http://schemas.microsoft.com/office/word/2012/wordml" xmlns:w16cex="http://schemas.microsoft.com/office/word/2018/wordml/cex" xmlns:w16cid="http://schemas.microsoft.com/office/word/2016/wordml/cid" xmlns:w16="http://schemas.microsoft.com/office/word/2018/wordml" xmlns:w16sdtdh="http://schemas.microsoft.com/office/word/2020/wordml/sdtdatahash" xmlns:w16se="http://schemas.microsoft.com/office/word/2015/wordml/symex" mc:Ignorable="w14 w15 w16se w16cid w16 w16cex w16sdtdh"/>
+</file>
+
+<file path=/word/footnotes.xml><?xml version="1.0" encoding="utf-8"?>
 <w:footnotes xmlns:wpc="http://schemas.microsoft.com/office/word/2010/wordprocessingCanvas" xmlns:mc="http://schemas.openxmlformats.org/markup-compatibility/2006" xmlns:o="urn:schemas-microsoft-com:office:office" xmlns:r="http://schemas.openxmlformats.org/officeDocument/2006/relationships" xmlns:m="http://schemas.openxmlformats.org/officeDocument/2006/math" xmlns:v="urn:schemas-microsoft-com:vml" xmlns:wp14="http://schemas.microsoft.com/office/word/2010/wordprocessingDrawing" xmlns:wp="http://schemas.openxmlformats.org/drawingml/2006/wordprocessingDrawing" xmlns:w10="urn:schemas-microsoft-com:office:word" xmlns:w="http://schemas.openxmlformats.org/wordprocessingml/2006/main" xmlns:w14="http://schemas.microsoft.com/office/word/2010/wordml" xmlns:w15="http://schemas.microsoft.com/office/word/2012/wordml" xmlns:wpg="http://schemas.microsoft.com/office/word/2010/wordprocessingGroup" xmlns:wpi="http://schemas.microsoft.com/office/word/2010/wordprocessingInk" xmlns:wne="http://schemas.microsoft.com/office/word/2006/wordml" xmlns:wps="http://schemas.microsoft.com/office/word/2010/wordprocessingShape" mc:Ignorable="w14 w15 wp14">
   <w:footnote w:type="separator" w:id="-1">
     <w:p>
@@ -8978,7 +9033,7 @@
 </w:footnotes>
 </file>
 
-<file path=word/numbering.xml><?xml version="1.0" encoding="utf-8"?>
+<file path=/word/numbering.xml><?xml version="1.0" encoding="utf-8"?>
 <w:numbering xmlns:wpc="http://schemas.microsoft.com/office/word/2010/wordprocessingCanvas" xmlns:mc="http://schemas.openxmlformats.org/markup-compatibility/2006" xmlns:o="urn:schemas-microsoft-com:office:office" xmlns:r="http://schemas.openxmlformats.org/officeDocument/2006/relationships" xmlns:m="http://schemas.openxmlformats.org/officeDocument/2006/math" xmlns:v="urn:schemas-microsoft-com:vml" xmlns:wp14="http://schemas.microsoft.com/office/word/2010/wordprocessingDrawing" xmlns:wp="http://schemas.openxmlformats.org/drawingml/2006/wordprocessingDrawing" xmlns:w10="urn:schemas-microsoft-com:office:word" xmlns:w="http://schemas.openxmlformats.org/wordprocessingml/2006/main" xmlns:w14="http://schemas.microsoft.com/office/word/2010/wordml" xmlns:w15="http://schemas.microsoft.com/office/word/2012/wordml" xmlns:wpg="http://schemas.microsoft.com/office/word/2010/wordprocessingGroup" xmlns:wpi="http://schemas.microsoft.com/office/word/2010/wordprocessingInk" xmlns:wne="http://schemas.microsoft.com/office/word/2006/wordml" xmlns:wps="http://schemas.microsoft.com/office/word/2010/wordprocessingShape" mc:Ignorable="w14 w15 wp14">
   <w:abstractNum w:abstractNumId="1" w15:restartNumberingAfterBreak="0">
     <w:multiLevelType w:val="hybridMultilevel"/>
@@ -9091,7 +9146,17 @@
 </w:numbering>
 </file>
 
-<file path=word/styles.xml><?xml version="1.0" encoding="utf-8"?>
+<file path=/word/settings.xml><?xml version="1.0" encoding="utf-8"?>
+<w:settings xmlns:wpc="http://schemas.microsoft.com/office/word/2010/wordprocessingCanvas" xmlns:mc="http://schemas.openxmlformats.org/markup-compatibility/2006" xmlns:o="urn:schemas-microsoft-com:office:office" xmlns:r="http://schemas.openxmlformats.org/officeDocument/2006/relationships" xmlns:m="http://schemas.openxmlformats.org/officeDocument/2006/math" xmlns:v="urn:schemas-microsoft-com:vml" xmlns:wp14="http://schemas.microsoft.com/office/word/2010/wordprocessingDrawing" xmlns:wp="http://schemas.openxmlformats.org/drawingml/2006/wordprocessingDrawing" xmlns:w10="urn:schemas-microsoft-com:office:word" xmlns:w="http://schemas.openxmlformats.org/wordprocessingml/2006/main" xmlns:w14="http://schemas.microsoft.com/office/word/2010/wordml" xmlns:w15="http://schemas.microsoft.com/office/word/2012/wordml" xmlns:wpg="http://schemas.microsoft.com/office/word/2010/wordprocessingGroup" xmlns:wpi="http://schemas.microsoft.com/office/word/2010/wordprocessingInk" xmlns:wne="http://schemas.microsoft.com/office/word/2006/wordml" xmlns:wps="http://schemas.microsoft.com/office/word/2010/wordprocessingShape" mc:Ignorable="w14 w15 wp14">
+  <w:displayBackgroundShape/>
+  <w:evenAndOddHeaders w:val="false"/>
+  <w:compat>
+    <w:compatSetting w:val="15" w:name="compatibilityMode" w:uri="http://schemas.microsoft.com/office/word"/>
+  </w:compat>
+</w:settings>
+</file>
+
+<file path=/word/styles.xml><?xml version="1.0" encoding="utf-8"?>
 <w:styles xmlns:mc="http://schemas.openxmlformats.org/markup-compatibility/2006" xmlns:r="http://schemas.openxmlformats.org/officeDocument/2006/relationships" xmlns:w="http://schemas.openxmlformats.org/wordprocessingml/2006/main" xmlns:w14="http://schemas.microsoft.com/office/word/2010/wordml" xmlns:w15="http://schemas.microsoft.com/office/word/2012/wordml" mc:Ignorable="w14 w15">
   <w:docDefaults>
     <w:rPrDefault/>

</xml_diff>